<commit_message>
paper revision and explainable predictor script commit (for kaggle use)
</commit_message>
<xml_diff>
--- a/paper_submission/manuscript_revised.docx
+++ b/paper_submission/manuscript_revised.docx
@@ -233,6 +233,1750 @@
     </w:p>
     <w:p>
       <w:pPr>
+        <w:pStyle w:val="a4"/>
+        <w:numPr>
+          <w:ilvl w:val="0"/>
+          <w:numId w:val="2"/>
+        </w:numPr>
+        <w:spacing w:line="360" w:lineRule="auto"/>
+        <w:ind w:leftChars="0"/>
+        <w:rPr>
+          <w:rFonts w:ascii="Times New Roman" w:hAnsi="Times New Roman" w:cs="Times New Roman" w:hint="eastAsia"/>
+          <w:sz w:val="22"/>
+        </w:rPr>
+      </w:pPr>
+      <w:r>
+        <w:rPr>
+          <w:rFonts w:ascii="Times New Roman" w:hAnsi="Times New Roman" w:cs="Times New Roman" w:hint="eastAsia"/>
+          <w:sz w:val="22"/>
+        </w:rPr>
+        <w:t>연구배경</w:t>
+      </w:r>
+    </w:p>
+    <w:p>
+      <w:pPr>
+        <w:spacing w:line="360" w:lineRule="auto"/>
+        <w:rPr>
+          <w:rFonts w:ascii="Times New Roman" w:hAnsi="Times New Roman" w:cs="Times New Roman"/>
+          <w:sz w:val="22"/>
+        </w:rPr>
+      </w:pPr>
+      <w:r>
+        <w:rPr>
+          <w:rFonts w:ascii="Times New Roman" w:hAnsi="Times New Roman" w:cs="Times New Roman"/>
+          <w:sz w:val="22"/>
+        </w:rPr>
+        <w:t xml:space="preserve">B-mode </w:t>
+      </w:r>
+      <w:r>
+        <w:rPr>
+          <w:rFonts w:ascii="Times New Roman" w:hAnsi="Times New Roman" w:cs="Times New Roman"/>
+          <w:sz w:val="22"/>
+        </w:rPr>
+        <w:t>초음파는</w:t>
+      </w:r>
+      <w:r>
+        <w:rPr>
+          <w:rFonts w:ascii="Times New Roman" w:hAnsi="Times New Roman" w:cs="Times New Roman"/>
+          <w:sz w:val="22"/>
+        </w:rPr>
+        <w:t xml:space="preserve"> </w:t>
+      </w:r>
+      <w:r>
+        <w:rPr>
+          <w:rFonts w:ascii="Times New Roman" w:hAnsi="Times New Roman" w:cs="Times New Roman"/>
+          <w:sz w:val="22"/>
+        </w:rPr>
+        <w:t>간세포암</w:t>
+      </w:r>
+      <w:r>
+        <w:rPr>
+          <w:rFonts w:ascii="Times New Roman" w:hAnsi="Times New Roman" w:cs="Times New Roman"/>
+          <w:sz w:val="22"/>
+        </w:rPr>
+        <w:t xml:space="preserve">(HCC) </w:t>
+      </w:r>
+      <w:r>
+        <w:rPr>
+          <w:rFonts w:ascii="Times New Roman" w:hAnsi="Times New Roman" w:cs="Times New Roman"/>
+          <w:sz w:val="22"/>
+        </w:rPr>
+        <w:t>감시의</w:t>
+      </w:r>
+      <w:r>
+        <w:rPr>
+          <w:rFonts w:ascii="Times New Roman" w:hAnsi="Times New Roman" w:cs="Times New Roman"/>
+          <w:sz w:val="22"/>
+        </w:rPr>
+        <w:t xml:space="preserve"> </w:t>
+      </w:r>
+      <w:r>
+        <w:rPr>
+          <w:rFonts w:ascii="Times New Roman" w:hAnsi="Times New Roman" w:cs="Times New Roman"/>
+          <w:sz w:val="22"/>
+        </w:rPr>
+        <w:t>핵심</w:t>
+      </w:r>
+      <w:r>
+        <w:rPr>
+          <w:rFonts w:ascii="Times New Roman" w:hAnsi="Times New Roman" w:cs="Times New Roman"/>
+          <w:sz w:val="22"/>
+        </w:rPr>
+        <w:t xml:space="preserve"> </w:t>
+      </w:r>
+      <w:r>
+        <w:rPr>
+          <w:rFonts w:ascii="Times New Roman" w:hAnsi="Times New Roman" w:cs="Times New Roman"/>
+          <w:sz w:val="22"/>
+        </w:rPr>
+        <w:t>도구이나</w:t>
+      </w:r>
+      <w:r>
+        <w:rPr>
+          <w:rFonts w:ascii="Times New Roman" w:hAnsi="Times New Roman" w:cs="Times New Roman"/>
+          <w:sz w:val="22"/>
+        </w:rPr>
+        <w:t xml:space="preserve"> </w:t>
+      </w:r>
+      <w:r>
+        <w:rPr>
+          <w:rFonts w:ascii="Times New Roman" w:hAnsi="Times New Roman" w:cs="Times New Roman"/>
+          <w:sz w:val="22"/>
+        </w:rPr>
+        <w:t>민감도가</w:t>
+      </w:r>
+      <w:r>
+        <w:rPr>
+          <w:rFonts w:ascii="Times New Roman" w:hAnsi="Times New Roman" w:cs="Times New Roman"/>
+          <w:sz w:val="22"/>
+        </w:rPr>
+        <w:t xml:space="preserve"> </w:t>
+      </w:r>
+      <w:r>
+        <w:rPr>
+          <w:rFonts w:ascii="Times New Roman" w:hAnsi="Times New Roman" w:cs="Times New Roman"/>
+          <w:sz w:val="22"/>
+        </w:rPr>
+        <w:t>제한적이며</w:t>
+      </w:r>
+      <w:r>
+        <w:rPr>
+          <w:rFonts w:ascii="Times New Roman" w:hAnsi="Times New Roman" w:cs="Times New Roman"/>
+          <w:sz w:val="22"/>
+        </w:rPr>
+        <w:t xml:space="preserve">, </w:t>
+      </w:r>
+      <w:r>
+        <w:rPr>
+          <w:rFonts w:ascii="Times New Roman" w:hAnsi="Times New Roman" w:cs="Times New Roman"/>
+          <w:sz w:val="22"/>
+        </w:rPr>
+        <w:t>기존</w:t>
+      </w:r>
+      <w:r>
+        <w:rPr>
+          <w:rFonts w:ascii="Times New Roman" w:hAnsi="Times New Roman" w:cs="Times New Roman"/>
+          <w:sz w:val="22"/>
+        </w:rPr>
+        <w:t xml:space="preserve"> </w:t>
+      </w:r>
+      <w:r>
+        <w:rPr>
+          <w:rFonts w:ascii="Times New Roman" w:hAnsi="Times New Roman" w:cs="Times New Roman"/>
+          <w:sz w:val="22"/>
+        </w:rPr>
+        <w:t>딥러닝</w:t>
+      </w:r>
+      <w:r>
+        <w:rPr>
+          <w:rFonts w:ascii="Times New Roman" w:hAnsi="Times New Roman" w:cs="Times New Roman"/>
+          <w:sz w:val="22"/>
+        </w:rPr>
+        <w:t xml:space="preserve"> </w:t>
+      </w:r>
+      <w:r>
+        <w:rPr>
+          <w:rFonts w:ascii="Times New Roman" w:hAnsi="Times New Roman" w:cs="Times New Roman"/>
+          <w:sz w:val="22"/>
+        </w:rPr>
+        <w:t>모델은</w:t>
+      </w:r>
+      <w:r>
+        <w:rPr>
+          <w:rFonts w:ascii="Times New Roman" w:hAnsi="Times New Roman" w:cs="Times New Roman"/>
+          <w:sz w:val="22"/>
+        </w:rPr>
+        <w:t xml:space="preserve"> </w:t>
+      </w:r>
+      <w:r>
+        <w:rPr>
+          <w:rFonts w:ascii="Times New Roman" w:hAnsi="Times New Roman" w:cs="Times New Roman"/>
+          <w:sz w:val="22"/>
+        </w:rPr>
+        <w:t>단일</w:t>
+      </w:r>
+      <w:r>
+        <w:rPr>
+          <w:rFonts w:ascii="Times New Roman" w:hAnsi="Times New Roman" w:cs="Times New Roman"/>
+          <w:sz w:val="22"/>
+        </w:rPr>
+        <w:t xml:space="preserve"> softmax </w:t>
+      </w:r>
+      <w:r>
+        <w:rPr>
+          <w:rFonts w:ascii="Times New Roman" w:hAnsi="Times New Roman" w:cs="Times New Roman"/>
+          <w:sz w:val="22"/>
+        </w:rPr>
+        <w:t>출력만을</w:t>
+      </w:r>
+      <w:r>
+        <w:rPr>
+          <w:rFonts w:ascii="Times New Roman" w:hAnsi="Times New Roman" w:cs="Times New Roman"/>
+          <w:sz w:val="22"/>
+        </w:rPr>
+        <w:t xml:space="preserve"> </w:t>
+      </w:r>
+      <w:r>
+        <w:rPr>
+          <w:rFonts w:ascii="Times New Roman" w:hAnsi="Times New Roman" w:cs="Times New Roman"/>
+          <w:sz w:val="22"/>
+        </w:rPr>
+        <w:t>제공하여</w:t>
+      </w:r>
+      <w:r>
+        <w:rPr>
+          <w:rFonts w:ascii="Times New Roman" w:hAnsi="Times New Roman" w:cs="Times New Roman"/>
+          <w:sz w:val="22"/>
+        </w:rPr>
+        <w:t xml:space="preserve"> </w:t>
+      </w:r>
+      <w:r>
+        <w:rPr>
+          <w:rFonts w:ascii="Times New Roman" w:hAnsi="Times New Roman" w:cs="Times New Roman"/>
+          <w:sz w:val="22"/>
+        </w:rPr>
+        <w:t>임상의의</w:t>
+      </w:r>
+      <w:r>
+        <w:rPr>
+          <w:rFonts w:ascii="Times New Roman" w:hAnsi="Times New Roman" w:cs="Times New Roman"/>
+          <w:sz w:val="22"/>
+        </w:rPr>
+        <w:t xml:space="preserve"> </w:t>
+      </w:r>
+      <w:r>
+        <w:rPr>
+          <w:rFonts w:ascii="Times New Roman" w:hAnsi="Times New Roman" w:cs="Times New Roman"/>
+          <w:sz w:val="22"/>
+        </w:rPr>
+        <w:t>유사성</w:t>
+      </w:r>
+      <w:r>
+        <w:rPr>
+          <w:rFonts w:ascii="Times New Roman" w:hAnsi="Times New Roman" w:cs="Times New Roman"/>
+          <w:sz w:val="22"/>
+        </w:rPr>
+        <w:t xml:space="preserve"> </w:t>
+      </w:r>
+      <w:r>
+        <w:rPr>
+          <w:rFonts w:ascii="Times New Roman" w:hAnsi="Times New Roman" w:cs="Times New Roman"/>
+          <w:sz w:val="22"/>
+        </w:rPr>
+        <w:t>기반</w:t>
+      </w:r>
+      <w:r>
+        <w:rPr>
+          <w:rFonts w:ascii="Times New Roman" w:hAnsi="Times New Roman" w:cs="Times New Roman"/>
+          <w:sz w:val="22"/>
+        </w:rPr>
+        <w:t xml:space="preserve"> </w:t>
+      </w:r>
+      <w:r>
+        <w:rPr>
+          <w:rFonts w:ascii="Times New Roman" w:hAnsi="Times New Roman" w:cs="Times New Roman"/>
+          <w:sz w:val="22"/>
+        </w:rPr>
+        <w:t>추론에</w:t>
+      </w:r>
+      <w:r>
+        <w:rPr>
+          <w:rFonts w:ascii="Times New Roman" w:hAnsi="Times New Roman" w:cs="Times New Roman"/>
+          <w:sz w:val="22"/>
+        </w:rPr>
+        <w:t xml:space="preserve"> </w:t>
+      </w:r>
+      <w:r>
+        <w:rPr>
+          <w:rFonts w:ascii="Times New Roman" w:hAnsi="Times New Roman" w:cs="Times New Roman"/>
+          <w:sz w:val="22"/>
+        </w:rPr>
+        <w:t>대응하지</w:t>
+      </w:r>
+      <w:r>
+        <w:rPr>
+          <w:rFonts w:ascii="Times New Roman" w:hAnsi="Times New Roman" w:cs="Times New Roman"/>
+          <w:sz w:val="22"/>
+        </w:rPr>
+        <w:t xml:space="preserve"> </w:t>
+      </w:r>
+      <w:r>
+        <w:rPr>
+          <w:rFonts w:ascii="Times New Roman" w:hAnsi="Times New Roman" w:cs="Times New Roman"/>
+          <w:sz w:val="22"/>
+        </w:rPr>
+        <w:t>못한다</w:t>
+      </w:r>
+      <w:r>
+        <w:rPr>
+          <w:rFonts w:ascii="Times New Roman" w:hAnsi="Times New Roman" w:cs="Times New Roman"/>
+          <w:sz w:val="22"/>
+        </w:rPr>
+        <w:t>.</w:t>
+      </w:r>
+    </w:p>
+    <w:p>
+      <w:pPr>
+        <w:pStyle w:val="a4"/>
+        <w:numPr>
+          <w:ilvl w:val="0"/>
+          <w:numId w:val="2"/>
+        </w:numPr>
+        <w:spacing w:line="360" w:lineRule="auto"/>
+        <w:ind w:leftChars="0"/>
+        <w:rPr>
+          <w:rFonts w:ascii="Times New Roman" w:hAnsi="Times New Roman" w:cs="Times New Roman" w:hint="eastAsia"/>
+          <w:sz w:val="22"/>
+        </w:rPr>
+      </w:pPr>
+      <w:r>
+        <w:rPr>
+          <w:rFonts w:ascii="Times New Roman" w:hAnsi="Times New Roman" w:cs="Times New Roman" w:hint="eastAsia"/>
+          <w:sz w:val="22"/>
+        </w:rPr>
+        <w:t>방법</w:t>
+      </w:r>
+    </w:p>
+    <w:p>
+      <w:pPr>
+        <w:spacing w:line="360" w:lineRule="auto"/>
+        <w:rPr>
+          <w:rFonts w:ascii="Times New Roman" w:hAnsi="Times New Roman" w:cs="Times New Roman"/>
+          <w:sz w:val="22"/>
+        </w:rPr>
+      </w:pPr>
+      <w:r>
+        <w:rPr>
+          <w:rFonts w:ascii="Times New Roman" w:hAnsi="Times New Roman" w:cs="Times New Roman" w:hint="eastAsia"/>
+          <w:sz w:val="22"/>
+        </w:rPr>
+        <w:t>본</w:t>
+      </w:r>
+      <w:r>
+        <w:rPr>
+          <w:rFonts w:ascii="Times New Roman" w:hAnsi="Times New Roman" w:cs="Times New Roman" w:hint="eastAsia"/>
+          <w:sz w:val="22"/>
+        </w:rPr>
+        <w:t xml:space="preserve"> </w:t>
+      </w:r>
+      <w:r>
+        <w:rPr>
+          <w:rFonts w:ascii="Times New Roman" w:hAnsi="Times New Roman" w:cs="Times New Roman" w:hint="eastAsia"/>
+          <w:sz w:val="22"/>
+        </w:rPr>
+        <w:t>연구는</w:t>
+      </w:r>
+      <w:r>
+        <w:rPr>
+          <w:rFonts w:ascii="Times New Roman" w:hAnsi="Times New Roman" w:cs="Times New Roman" w:hint="eastAsia"/>
+          <w:sz w:val="22"/>
+        </w:rPr>
+        <w:t xml:space="preserve"> </w:t>
+      </w:r>
+      <w:r>
+        <w:rPr>
+          <w:rFonts w:ascii="Times New Roman" w:hAnsi="Times New Roman" w:cs="Times New Roman"/>
+          <w:sz w:val="22"/>
+        </w:rPr>
+        <w:t>공개</w:t>
+      </w:r>
+      <w:r>
+        <w:rPr>
+          <w:rFonts w:ascii="Times New Roman" w:hAnsi="Times New Roman" w:cs="Times New Roman"/>
+          <w:sz w:val="22"/>
+        </w:rPr>
+        <w:t xml:space="preserve"> </w:t>
+      </w:r>
+      <w:r>
+        <w:rPr>
+          <w:rFonts w:ascii="Times New Roman" w:hAnsi="Times New Roman" w:cs="Times New Roman"/>
+          <w:sz w:val="22"/>
+        </w:rPr>
+        <w:t>데이터셋</w:t>
+      </w:r>
+      <w:r>
+        <w:rPr>
+          <w:rFonts w:ascii="Times New Roman" w:hAnsi="Times New Roman" w:cs="Times New Roman"/>
+          <w:sz w:val="22"/>
+        </w:rPr>
+        <w:t xml:space="preserve"> SMC-LUD</w:t>
+      </w:r>
+      <w:r>
+        <w:rPr>
+          <w:rFonts w:ascii="Times New Roman" w:hAnsi="Times New Roman" w:cs="Times New Roman"/>
+          <w:sz w:val="22"/>
+        </w:rPr>
+        <w:t>의</w:t>
+      </w:r>
+      <w:r>
+        <w:rPr>
+          <w:rFonts w:ascii="Times New Roman" w:hAnsi="Times New Roman" w:cs="Times New Roman"/>
+          <w:sz w:val="22"/>
+        </w:rPr>
+        <w:t xml:space="preserve"> Clean subset(744</w:t>
+      </w:r>
+      <w:r>
+        <w:rPr>
+          <w:rFonts w:ascii="Times New Roman" w:hAnsi="Times New Roman" w:cs="Times New Roman"/>
+          <w:sz w:val="22"/>
+        </w:rPr>
+        <w:t>명</w:t>
+      </w:r>
+      <w:r>
+        <w:rPr>
+          <w:rFonts w:ascii="Times New Roman" w:hAnsi="Times New Roman" w:cs="Times New Roman"/>
+          <w:sz w:val="22"/>
+        </w:rPr>
+        <w:t>, 2,656</w:t>
+      </w:r>
+      <w:r>
+        <w:rPr>
+          <w:rFonts w:ascii="Times New Roman" w:hAnsi="Times New Roman" w:cs="Times New Roman"/>
+          <w:sz w:val="22"/>
+        </w:rPr>
+        <w:t>장</w:t>
+      </w:r>
+      <w:r>
+        <w:rPr>
+          <w:rFonts w:ascii="Times New Roman" w:hAnsi="Times New Roman" w:cs="Times New Roman"/>
+          <w:sz w:val="22"/>
+        </w:rPr>
+        <w:t>)</w:t>
+      </w:r>
+      <w:r>
+        <w:rPr>
+          <w:rFonts w:ascii="Times New Roman" w:hAnsi="Times New Roman" w:cs="Times New Roman"/>
+          <w:sz w:val="22"/>
+        </w:rPr>
+        <w:t>을</w:t>
+      </w:r>
+      <w:r>
+        <w:rPr>
+          <w:rFonts w:ascii="Times New Roman" w:hAnsi="Times New Roman" w:cs="Times New Roman"/>
+          <w:sz w:val="22"/>
+        </w:rPr>
+        <w:t xml:space="preserve"> </w:t>
+      </w:r>
+      <w:r>
+        <w:rPr>
+          <w:rFonts w:ascii="Times New Roman" w:hAnsi="Times New Roman" w:cs="Times New Roman"/>
+          <w:sz w:val="22"/>
+        </w:rPr>
+        <w:t>이용한</w:t>
+      </w:r>
+      <w:r>
+        <w:rPr>
+          <w:rFonts w:ascii="Times New Roman" w:hAnsi="Times New Roman" w:cs="Times New Roman"/>
+          <w:sz w:val="22"/>
+        </w:rPr>
+        <w:t xml:space="preserve"> </w:t>
+      </w:r>
+      <w:r>
+        <w:rPr>
+          <w:rFonts w:ascii="Times New Roman" w:hAnsi="Times New Roman" w:cs="Times New Roman"/>
+          <w:sz w:val="22"/>
+        </w:rPr>
+        <w:t>후향적</w:t>
+      </w:r>
+      <w:r>
+        <w:rPr>
+          <w:rFonts w:ascii="Times New Roman" w:hAnsi="Times New Roman" w:cs="Times New Roman"/>
+          <w:sz w:val="22"/>
+        </w:rPr>
+        <w:t xml:space="preserve"> </w:t>
+      </w:r>
+      <w:r>
+        <w:rPr>
+          <w:rFonts w:ascii="Times New Roman" w:hAnsi="Times New Roman" w:cs="Times New Roman"/>
+          <w:sz w:val="22"/>
+        </w:rPr>
+        <w:t>연구다</w:t>
+      </w:r>
+      <w:r>
+        <w:rPr>
+          <w:rFonts w:ascii="Times New Roman" w:hAnsi="Times New Roman" w:cs="Times New Roman"/>
+          <w:sz w:val="22"/>
+        </w:rPr>
+        <w:t xml:space="preserve">. EfficientNetV2B0 </w:t>
+      </w:r>
+      <w:r>
+        <w:rPr>
+          <w:rFonts w:ascii="Times New Roman" w:hAnsi="Times New Roman" w:cs="Times New Roman"/>
+          <w:sz w:val="22"/>
+        </w:rPr>
+        <w:t>기반</w:t>
+      </w:r>
+      <w:r>
+        <w:rPr>
+          <w:rFonts w:ascii="Times New Roman" w:hAnsi="Times New Roman" w:cs="Times New Roman"/>
+          <w:sz w:val="22"/>
+        </w:rPr>
+        <w:t xml:space="preserve"> hybrid vision transformer</w:t>
+      </w:r>
+      <w:r>
+        <w:rPr>
+          <w:rFonts w:ascii="Times New Roman" w:hAnsi="Times New Roman" w:cs="Times New Roman"/>
+          <w:sz w:val="22"/>
+        </w:rPr>
+        <w:t>를</w:t>
+      </w:r>
+      <w:r>
+        <w:rPr>
+          <w:rFonts w:ascii="Times New Roman" w:hAnsi="Times New Roman" w:cs="Times New Roman"/>
+          <w:sz w:val="22"/>
+        </w:rPr>
+        <w:t xml:space="preserve"> </w:t>
+      </w:r>
+      <w:r>
+        <w:rPr>
+          <w:rFonts w:ascii="Times New Roman" w:hAnsi="Times New Roman" w:cs="Times New Roman"/>
+          <w:sz w:val="22"/>
+        </w:rPr>
+        <w:t>교차</w:t>
+      </w:r>
+      <w:r>
+        <w:rPr>
+          <w:rFonts w:ascii="Times New Roman" w:hAnsi="Times New Roman" w:cs="Times New Roman"/>
+          <w:sz w:val="22"/>
+        </w:rPr>
+        <w:t xml:space="preserve"> </w:t>
+      </w:r>
+      <w:r>
+        <w:rPr>
+          <w:rFonts w:ascii="Times New Roman" w:hAnsi="Times New Roman" w:cs="Times New Roman"/>
+          <w:sz w:val="22"/>
+        </w:rPr>
+        <w:t>엔트로피와</w:t>
+      </w:r>
+      <w:r>
+        <w:rPr>
+          <w:rFonts w:ascii="Times New Roman" w:hAnsi="Times New Roman" w:cs="Times New Roman"/>
+          <w:sz w:val="22"/>
+        </w:rPr>
+        <w:t xml:space="preserve"> supervised contrastive learning(SupCon) </w:t>
+      </w:r>
+      <w:r>
+        <w:rPr>
+          <w:rFonts w:ascii="Times New Roman" w:hAnsi="Times New Roman" w:cs="Times New Roman"/>
+          <w:sz w:val="22"/>
+        </w:rPr>
+        <w:t>결합</w:t>
+      </w:r>
+      <w:r>
+        <w:rPr>
+          <w:rFonts w:ascii="Times New Roman" w:hAnsi="Times New Roman" w:cs="Times New Roman"/>
+          <w:sz w:val="22"/>
+        </w:rPr>
+        <w:t xml:space="preserve"> </w:t>
+      </w:r>
+      <w:r>
+        <w:rPr>
+          <w:rFonts w:ascii="Times New Roman" w:hAnsi="Times New Roman" w:cs="Times New Roman"/>
+          <w:sz w:val="22"/>
+        </w:rPr>
+        <w:t>학습하였다</w:t>
+      </w:r>
+      <w:r>
+        <w:rPr>
+          <w:rFonts w:ascii="Times New Roman" w:hAnsi="Times New Roman" w:cs="Times New Roman"/>
+          <w:sz w:val="22"/>
+        </w:rPr>
+        <w:t>. Softmax</w:t>
+      </w:r>
+      <w:r>
+        <w:rPr>
+          <w:rFonts w:ascii="Times New Roman" w:hAnsi="Times New Roman" w:cs="Times New Roman"/>
+          <w:sz w:val="22"/>
+        </w:rPr>
+        <w:t>를</w:t>
+      </w:r>
+      <w:r>
+        <w:rPr>
+          <w:rFonts w:ascii="Times New Roman" w:hAnsi="Times New Roman" w:cs="Times New Roman"/>
+          <w:sz w:val="22"/>
+        </w:rPr>
+        <w:t xml:space="preserve"> confidence score</w:t>
+      </w:r>
+      <w:r>
+        <w:rPr>
+          <w:rFonts w:ascii="Times New Roman" w:hAnsi="Times New Roman" w:cs="Times New Roman"/>
+          <w:sz w:val="22"/>
+        </w:rPr>
+        <w:t>로</w:t>
+      </w:r>
+      <w:r>
+        <w:rPr>
+          <w:rFonts w:ascii="Times New Roman" w:hAnsi="Times New Roman" w:cs="Times New Roman"/>
+          <w:sz w:val="22"/>
+        </w:rPr>
+        <w:t xml:space="preserve">, </w:t>
+      </w:r>
+      <w:r>
+        <w:rPr>
+          <w:rFonts w:ascii="Times New Roman" w:hAnsi="Times New Roman" w:cs="Times New Roman"/>
+          <w:sz w:val="22"/>
+        </w:rPr>
+        <w:t>임베딩과</w:t>
+      </w:r>
+      <w:r>
+        <w:rPr>
+          <w:rFonts w:ascii="Times New Roman" w:hAnsi="Times New Roman" w:cs="Times New Roman"/>
+          <w:sz w:val="22"/>
+        </w:rPr>
+        <w:t xml:space="preserve"> HCC prototype </w:t>
+      </w:r>
+      <w:r>
+        <w:rPr>
+          <w:rFonts w:ascii="Times New Roman" w:hAnsi="Times New Roman" w:cs="Times New Roman"/>
+          <w:sz w:val="22"/>
+        </w:rPr>
+        <w:t>간</w:t>
+      </w:r>
+      <w:r>
+        <w:rPr>
+          <w:rFonts w:ascii="Times New Roman" w:hAnsi="Times New Roman" w:cs="Times New Roman"/>
+          <w:sz w:val="22"/>
+        </w:rPr>
+        <w:t xml:space="preserve"> cosine similarity</w:t>
+      </w:r>
+      <w:r>
+        <w:rPr>
+          <w:rFonts w:ascii="Times New Roman" w:hAnsi="Times New Roman" w:cs="Times New Roman"/>
+          <w:sz w:val="22"/>
+        </w:rPr>
+        <w:t>를</w:t>
+      </w:r>
+      <w:r>
+        <w:rPr>
+          <w:rFonts w:ascii="Times New Roman" w:hAnsi="Times New Roman" w:cs="Times New Roman"/>
+          <w:sz w:val="22"/>
+        </w:rPr>
+        <w:t xml:space="preserve"> HCC cosine score, </w:t>
+      </w:r>
+      <w:r>
+        <w:rPr>
+          <w:rFonts w:ascii="Times New Roman" w:hAnsi="Times New Roman" w:cs="Times New Roman"/>
+          <w:sz w:val="22"/>
+        </w:rPr>
+        <w:t>두</w:t>
+      </w:r>
+      <w:r>
+        <w:rPr>
+          <w:rFonts w:ascii="Times New Roman" w:hAnsi="Times New Roman" w:cs="Times New Roman"/>
+          <w:sz w:val="22"/>
+        </w:rPr>
+        <w:t xml:space="preserve"> </w:t>
+      </w:r>
+      <w:r>
+        <w:rPr>
+          <w:rFonts w:ascii="Times New Roman" w:hAnsi="Times New Roman" w:cs="Times New Roman"/>
+          <w:sz w:val="22"/>
+        </w:rPr>
+        <w:t>클래스</w:t>
+      </w:r>
+      <w:r>
+        <w:rPr>
+          <w:rFonts w:ascii="Times New Roman" w:hAnsi="Times New Roman" w:cs="Times New Roman"/>
+          <w:sz w:val="22"/>
+        </w:rPr>
+        <w:t xml:space="preserve"> </w:t>
+      </w:r>
+      <w:r>
+        <w:rPr>
+          <w:rFonts w:ascii="Times New Roman" w:hAnsi="Times New Roman" w:cs="Times New Roman"/>
+          <w:sz w:val="22"/>
+        </w:rPr>
+        <w:t>간</w:t>
+      </w:r>
+      <w:r>
+        <w:rPr>
+          <w:rFonts w:ascii="Times New Roman" w:hAnsi="Times New Roman" w:cs="Times New Roman"/>
+          <w:sz w:val="22"/>
+        </w:rPr>
+        <w:t xml:space="preserve"> </w:t>
+      </w:r>
+      <w:r>
+        <w:rPr>
+          <w:rFonts w:ascii="Times New Roman" w:hAnsi="Times New Roman" w:cs="Times New Roman"/>
+          <w:sz w:val="22"/>
+        </w:rPr>
+        <w:t>마진을</w:t>
+      </w:r>
+      <w:r>
+        <w:rPr>
+          <w:rFonts w:ascii="Times New Roman" w:hAnsi="Times New Roman" w:cs="Times New Roman"/>
+          <w:sz w:val="22"/>
+        </w:rPr>
+        <w:t xml:space="preserve"> Δscore</w:t>
+      </w:r>
+      <w:r>
+        <w:rPr>
+          <w:rFonts w:ascii="Times New Roman" w:hAnsi="Times New Roman" w:cs="Times New Roman"/>
+          <w:sz w:val="22"/>
+        </w:rPr>
+        <w:t>로</w:t>
+      </w:r>
+      <w:r>
+        <w:rPr>
+          <w:rFonts w:ascii="Times New Roman" w:hAnsi="Times New Roman" w:cs="Times New Roman"/>
+          <w:sz w:val="22"/>
+        </w:rPr>
+        <w:t xml:space="preserve"> </w:t>
+      </w:r>
+      <w:r>
+        <w:rPr>
+          <w:rFonts w:ascii="Times New Roman" w:hAnsi="Times New Roman" w:cs="Times New Roman"/>
+          <w:sz w:val="22"/>
+        </w:rPr>
+        <w:t>정의하는</w:t>
+      </w:r>
+      <w:r>
+        <w:rPr>
+          <w:rFonts w:ascii="Times New Roman" w:hAnsi="Times New Roman" w:cs="Times New Roman"/>
+          <w:sz w:val="22"/>
+        </w:rPr>
+        <w:t xml:space="preserve"> </w:t>
+      </w:r>
+      <w:r>
+        <w:rPr>
+          <w:rFonts w:ascii="Times New Roman" w:hAnsi="Times New Roman" w:cs="Times New Roman"/>
+          <w:sz w:val="22"/>
+        </w:rPr>
+        <w:t>이중</w:t>
+      </w:r>
+      <w:r>
+        <w:rPr>
+          <w:rFonts w:ascii="Times New Roman" w:hAnsi="Times New Roman" w:cs="Times New Roman"/>
+          <w:sz w:val="22"/>
+        </w:rPr>
+        <w:t xml:space="preserve"> </w:t>
+      </w:r>
+      <w:r>
+        <w:rPr>
+          <w:rFonts w:ascii="Times New Roman" w:hAnsi="Times New Roman" w:cs="Times New Roman"/>
+          <w:sz w:val="22"/>
+        </w:rPr>
+        <w:t>출력</w:t>
+      </w:r>
+      <w:r>
+        <w:rPr>
+          <w:rFonts w:ascii="Times New Roman" w:hAnsi="Times New Roman" w:cs="Times New Roman"/>
+          <w:sz w:val="22"/>
+        </w:rPr>
+        <w:t xml:space="preserve"> </w:t>
+      </w:r>
+      <w:r>
+        <w:rPr>
+          <w:rFonts w:ascii="Times New Roman" w:hAnsi="Times New Roman" w:cs="Times New Roman"/>
+          <w:sz w:val="22"/>
+        </w:rPr>
+        <w:t>체계를</w:t>
+      </w:r>
+      <w:r>
+        <w:rPr>
+          <w:rFonts w:ascii="Times New Roman" w:hAnsi="Times New Roman" w:cs="Times New Roman"/>
+          <w:sz w:val="22"/>
+        </w:rPr>
+        <w:t xml:space="preserve"> </w:t>
+      </w:r>
+      <w:r>
+        <w:rPr>
+          <w:rFonts w:ascii="Times New Roman" w:hAnsi="Times New Roman" w:cs="Times New Roman"/>
+          <w:sz w:val="22"/>
+        </w:rPr>
+        <w:t>구성하였다</w:t>
+      </w:r>
+      <w:r>
+        <w:rPr>
+          <w:rFonts w:ascii="Times New Roman" w:hAnsi="Times New Roman" w:cs="Times New Roman"/>
+          <w:sz w:val="22"/>
+        </w:rPr>
+        <w:t>(IRB No. PMC 2026-07-001).</w:t>
+      </w:r>
+    </w:p>
+    <w:p>
+      <w:pPr>
+        <w:pStyle w:val="a4"/>
+        <w:numPr>
+          <w:ilvl w:val="0"/>
+          <w:numId w:val="2"/>
+        </w:numPr>
+        <w:spacing w:line="360" w:lineRule="auto"/>
+        <w:ind w:leftChars="0"/>
+        <w:rPr>
+          <w:rFonts w:ascii="Times New Roman" w:hAnsi="Times New Roman" w:cs="Times New Roman" w:hint="eastAsia"/>
+          <w:sz w:val="22"/>
+        </w:rPr>
+      </w:pPr>
+      <w:r>
+        <w:rPr>
+          <w:rFonts w:ascii="Times New Roman" w:hAnsi="Times New Roman" w:cs="Times New Roman" w:hint="eastAsia"/>
+          <w:sz w:val="22"/>
+        </w:rPr>
+        <w:t>결과</w:t>
+      </w:r>
+    </w:p>
+    <w:p>
+      <w:pPr>
+        <w:spacing w:line="360" w:lineRule="auto"/>
+        <w:rPr>
+          <w:rFonts w:ascii="Times New Roman" w:hAnsi="Times New Roman" w:cs="Times New Roman"/>
+          <w:sz w:val="22"/>
+        </w:rPr>
+      </w:pPr>
+      <w:r>
+        <w:rPr>
+          <w:rFonts w:ascii="Times New Roman" w:hAnsi="Times New Roman" w:cs="Times New Roman"/>
+          <w:sz w:val="22"/>
+        </w:rPr>
+        <w:t>주력</w:t>
+      </w:r>
+      <w:r>
+        <w:rPr>
+          <w:rFonts w:ascii="Times New Roman" w:hAnsi="Times New Roman" w:cs="Times New Roman"/>
+          <w:sz w:val="22"/>
+        </w:rPr>
+        <w:t xml:space="preserve"> </w:t>
+      </w:r>
+      <w:r>
+        <w:rPr>
+          <w:rFonts w:ascii="Times New Roman" w:hAnsi="Times New Roman" w:cs="Times New Roman"/>
+          <w:sz w:val="22"/>
+        </w:rPr>
+        <w:t>모델의</w:t>
+      </w:r>
+      <w:r>
+        <w:rPr>
+          <w:rFonts w:ascii="Times New Roman" w:hAnsi="Times New Roman" w:cs="Times New Roman"/>
+          <w:sz w:val="22"/>
+        </w:rPr>
+        <w:t xml:space="preserve"> confidence score AUROC</w:t>
+      </w:r>
+      <w:r>
+        <w:rPr>
+          <w:rFonts w:ascii="Times New Roman" w:hAnsi="Times New Roman" w:cs="Times New Roman"/>
+          <w:sz w:val="22"/>
+        </w:rPr>
+        <w:t>는</w:t>
+      </w:r>
+      <w:r>
+        <w:rPr>
+          <w:rFonts w:ascii="Times New Roman" w:hAnsi="Times New Roman" w:cs="Times New Roman"/>
+          <w:sz w:val="22"/>
+        </w:rPr>
+        <w:t xml:space="preserve"> </w:t>
+      </w:r>
+      <w:r>
+        <w:rPr>
+          <w:rFonts w:ascii="Times New Roman" w:hAnsi="Times New Roman" w:cs="Times New Roman"/>
+          <w:sz w:val="22"/>
+        </w:rPr>
+        <w:t>검증</w:t>
+      </w:r>
+      <w:r>
+        <w:rPr>
+          <w:rFonts w:ascii="Times New Roman" w:hAnsi="Times New Roman" w:cs="Times New Roman"/>
+          <w:sz w:val="22"/>
+        </w:rPr>
+        <w:t xml:space="preserve"> </w:t>
+      </w:r>
+      <w:r>
+        <w:rPr>
+          <w:rFonts w:ascii="Times New Roman" w:hAnsi="Times New Roman" w:cs="Times New Roman"/>
+          <w:sz w:val="22"/>
+        </w:rPr>
+        <w:t>및</w:t>
+      </w:r>
+      <w:r>
+        <w:rPr>
+          <w:rFonts w:ascii="Times New Roman" w:hAnsi="Times New Roman" w:cs="Times New Roman"/>
+          <w:sz w:val="22"/>
+        </w:rPr>
+        <w:t xml:space="preserve"> </w:t>
+      </w:r>
+      <w:r>
+        <w:rPr>
+          <w:rFonts w:ascii="Times New Roman" w:hAnsi="Times New Roman" w:cs="Times New Roman"/>
+          <w:sz w:val="22"/>
+        </w:rPr>
+        <w:t>테스트</w:t>
+      </w:r>
+      <w:r>
+        <w:rPr>
+          <w:rFonts w:ascii="Times New Roman" w:hAnsi="Times New Roman" w:cs="Times New Roman"/>
+          <w:sz w:val="22"/>
+        </w:rPr>
+        <w:t xml:space="preserve"> </w:t>
+      </w:r>
+      <w:r>
+        <w:rPr>
+          <w:rFonts w:ascii="Times New Roman" w:hAnsi="Times New Roman" w:cs="Times New Roman"/>
+          <w:sz w:val="22"/>
+        </w:rPr>
+        <w:t>세트</w:t>
+      </w:r>
+      <w:r>
+        <w:rPr>
+          <w:rFonts w:ascii="Times New Roman" w:hAnsi="Times New Roman" w:cs="Times New Roman"/>
+          <w:sz w:val="22"/>
+        </w:rPr>
+        <w:t xml:space="preserve"> </w:t>
+      </w:r>
+      <w:r>
+        <w:rPr>
+          <w:rFonts w:ascii="Times New Roman" w:hAnsi="Times New Roman" w:cs="Times New Roman"/>
+          <w:sz w:val="22"/>
+        </w:rPr>
+        <w:t>모두</w:t>
+      </w:r>
+      <w:r>
+        <w:rPr>
+          <w:rFonts w:ascii="Times New Roman" w:hAnsi="Times New Roman" w:cs="Times New Roman"/>
+          <w:sz w:val="22"/>
+        </w:rPr>
+        <w:t xml:space="preserve"> 1.000</w:t>
+      </w:r>
+      <w:r>
+        <w:rPr>
+          <w:rFonts w:ascii="Times New Roman" w:hAnsi="Times New Roman" w:cs="Times New Roman"/>
+          <w:sz w:val="22"/>
+        </w:rPr>
+        <w:t>이었으며</w:t>
+      </w:r>
+      <w:r>
+        <w:rPr>
+          <w:rFonts w:ascii="Times New Roman" w:hAnsi="Times New Roman" w:cs="Times New Roman"/>
+          <w:sz w:val="22"/>
+        </w:rPr>
+        <w:t xml:space="preserve">, </w:t>
+      </w:r>
+      <w:r>
+        <w:rPr>
+          <w:rFonts w:ascii="Times New Roman" w:hAnsi="Times New Roman" w:cs="Times New Roman"/>
+          <w:sz w:val="22"/>
+        </w:rPr>
+        <w:t>테스트</w:t>
+      </w:r>
+      <w:r>
+        <w:rPr>
+          <w:rFonts w:ascii="Times New Roman" w:hAnsi="Times New Roman" w:cs="Times New Roman"/>
+          <w:sz w:val="22"/>
+        </w:rPr>
+        <w:t xml:space="preserve"> </w:t>
+      </w:r>
+      <w:r>
+        <w:rPr>
+          <w:rFonts w:ascii="Times New Roman" w:hAnsi="Times New Roman" w:cs="Times New Roman"/>
+          <w:sz w:val="22"/>
+        </w:rPr>
+        <w:t>세트에서</w:t>
+      </w:r>
+      <w:r>
+        <w:rPr>
+          <w:rFonts w:ascii="Times New Roman" w:hAnsi="Times New Roman" w:cs="Times New Roman"/>
+          <w:sz w:val="22"/>
+        </w:rPr>
+        <w:t xml:space="preserve"> </w:t>
+      </w:r>
+      <w:r>
+        <w:rPr>
+          <w:rFonts w:ascii="Times New Roman" w:hAnsi="Times New Roman" w:cs="Times New Roman"/>
+          <w:sz w:val="22"/>
+        </w:rPr>
+        <w:t>민감도</w:t>
+      </w:r>
+      <w:r>
+        <w:rPr>
+          <w:rFonts w:ascii="Times New Roman" w:hAnsi="Times New Roman" w:cs="Times New Roman"/>
+          <w:sz w:val="22"/>
+        </w:rPr>
+        <w:t xml:space="preserve"> 100.0%, </w:t>
+      </w:r>
+      <w:r>
+        <w:rPr>
+          <w:rFonts w:ascii="Times New Roman" w:hAnsi="Times New Roman" w:cs="Times New Roman"/>
+          <w:sz w:val="22"/>
+        </w:rPr>
+        <w:t>특이도</w:t>
+      </w:r>
+      <w:r>
+        <w:rPr>
+          <w:rFonts w:ascii="Times New Roman" w:hAnsi="Times New Roman" w:cs="Times New Roman"/>
+          <w:sz w:val="22"/>
+        </w:rPr>
+        <w:t xml:space="preserve"> 99.2%</w:t>
+      </w:r>
+      <w:r>
+        <w:rPr>
+          <w:rFonts w:ascii="Times New Roman" w:hAnsi="Times New Roman" w:cs="Times New Roman"/>
+          <w:sz w:val="22"/>
+        </w:rPr>
+        <w:t>를</w:t>
+      </w:r>
+      <w:r>
+        <w:rPr>
+          <w:rFonts w:ascii="Times New Roman" w:hAnsi="Times New Roman" w:cs="Times New Roman"/>
+          <w:sz w:val="22"/>
+        </w:rPr>
+        <w:t xml:space="preserve"> </w:t>
+      </w:r>
+      <w:r>
+        <w:rPr>
+          <w:rFonts w:ascii="Times New Roman" w:hAnsi="Times New Roman" w:cs="Times New Roman"/>
+          <w:sz w:val="22"/>
+        </w:rPr>
+        <w:t>달성하였다</w:t>
+      </w:r>
+      <w:r>
+        <w:rPr>
+          <w:rFonts w:ascii="Times New Roman" w:hAnsi="Times New Roman" w:cs="Times New Roman"/>
+          <w:sz w:val="22"/>
+        </w:rPr>
+        <w:t>. HCC cosine score</w:t>
+      </w:r>
+      <w:r>
+        <w:rPr>
+          <w:rFonts w:ascii="Times New Roman" w:hAnsi="Times New Roman" w:cs="Times New Roman"/>
+          <w:sz w:val="22"/>
+        </w:rPr>
+        <w:t>와</w:t>
+      </w:r>
+      <w:r>
+        <w:rPr>
+          <w:rFonts w:ascii="Times New Roman" w:hAnsi="Times New Roman" w:cs="Times New Roman"/>
+          <w:sz w:val="22"/>
+        </w:rPr>
+        <w:t xml:space="preserve"> Δscore AUROC 1.000</w:t>
+      </w:r>
+      <w:r>
+        <w:rPr>
+          <w:rFonts w:ascii="Times New Roman" w:hAnsi="Times New Roman" w:cs="Times New Roman"/>
+          <w:sz w:val="22"/>
+        </w:rPr>
+        <w:t>으로</w:t>
+      </w:r>
+      <w:r>
+        <w:rPr>
+          <w:rFonts w:ascii="Times New Roman" w:hAnsi="Times New Roman" w:cs="Times New Roman"/>
+          <w:sz w:val="22"/>
+        </w:rPr>
+        <w:t xml:space="preserve"> confidence score</w:t>
+      </w:r>
+      <w:r>
+        <w:rPr>
+          <w:rFonts w:ascii="Times New Roman" w:hAnsi="Times New Roman" w:cs="Times New Roman"/>
+          <w:sz w:val="22"/>
+        </w:rPr>
+        <w:t>와</w:t>
+      </w:r>
+      <w:r>
+        <w:rPr>
+          <w:rFonts w:ascii="Times New Roman" w:hAnsi="Times New Roman" w:cs="Times New Roman"/>
+          <w:sz w:val="22"/>
+        </w:rPr>
+        <w:t xml:space="preserve"> </w:t>
+      </w:r>
+      <w:r>
+        <w:rPr>
+          <w:rFonts w:ascii="Times New Roman" w:hAnsi="Times New Roman" w:cs="Times New Roman"/>
+          <w:sz w:val="22"/>
+        </w:rPr>
+        <w:t>동등하였다</w:t>
+      </w:r>
+      <w:r>
+        <w:rPr>
+          <w:rFonts w:ascii="Times New Roman" w:hAnsi="Times New Roman" w:cs="Times New Roman"/>
+          <w:sz w:val="22"/>
+        </w:rPr>
+        <w:t xml:space="preserve">(DeLong p=1.000). SupCon </w:t>
+      </w:r>
+      <w:r>
+        <w:rPr>
+          <w:rFonts w:ascii="Times New Roman" w:hAnsi="Times New Roman" w:cs="Times New Roman"/>
+          <w:sz w:val="22"/>
+        </w:rPr>
+        <w:t>적용</w:t>
+      </w:r>
+      <w:r>
+        <w:rPr>
+          <w:rFonts w:ascii="Times New Roman" w:hAnsi="Times New Roman" w:cs="Times New Roman"/>
+          <w:sz w:val="22"/>
+        </w:rPr>
+        <w:t xml:space="preserve"> </w:t>
+      </w:r>
+      <w:r>
+        <w:rPr>
+          <w:rFonts w:ascii="Times New Roman" w:hAnsi="Times New Roman" w:cs="Times New Roman"/>
+          <w:sz w:val="22"/>
+        </w:rPr>
+        <w:t>시</w:t>
+      </w:r>
+      <w:r>
+        <w:rPr>
+          <w:rFonts w:ascii="Times New Roman" w:hAnsi="Times New Roman" w:cs="Times New Roman"/>
+          <w:sz w:val="22"/>
+        </w:rPr>
+        <w:t xml:space="preserve"> true HCC cases</w:t>
+      </w:r>
+      <w:r>
+        <w:rPr>
+          <w:rFonts w:ascii="Times New Roman" w:hAnsi="Times New Roman" w:cs="Times New Roman"/>
+          <w:sz w:val="22"/>
+        </w:rPr>
+        <w:t>에서</w:t>
+      </w:r>
+      <w:r>
+        <w:rPr>
+          <w:rFonts w:ascii="Times New Roman" w:hAnsi="Times New Roman" w:cs="Times New Roman"/>
+          <w:sz w:val="22"/>
+        </w:rPr>
+        <w:t xml:space="preserve"> HCC cosine score</w:t>
+      </w:r>
+      <w:r>
+        <w:rPr>
+          <w:rFonts w:ascii="Times New Roman" w:hAnsi="Times New Roman" w:cs="Times New Roman"/>
+          <w:sz w:val="22"/>
+        </w:rPr>
+        <w:t>가</w:t>
+      </w:r>
+      <w:r>
+        <w:rPr>
+          <w:rFonts w:ascii="Times New Roman" w:hAnsi="Times New Roman" w:cs="Times New Roman"/>
+          <w:sz w:val="22"/>
+        </w:rPr>
+        <w:t xml:space="preserve"> </w:t>
+      </w:r>
+      <w:r>
+        <w:rPr>
+          <w:rFonts w:ascii="Times New Roman" w:hAnsi="Times New Roman" w:cs="Times New Roman"/>
+          <w:sz w:val="22"/>
+        </w:rPr>
+        <w:t>유의하게</w:t>
+      </w:r>
+      <w:r>
+        <w:rPr>
+          <w:rFonts w:ascii="Times New Roman" w:hAnsi="Times New Roman" w:cs="Times New Roman"/>
+          <w:sz w:val="22"/>
+        </w:rPr>
+        <w:t xml:space="preserve"> </w:t>
+      </w:r>
+      <w:r>
+        <w:rPr>
+          <w:rFonts w:ascii="Times New Roman" w:hAnsi="Times New Roman" w:cs="Times New Roman"/>
+          <w:sz w:val="22"/>
+        </w:rPr>
+        <w:t>상승하였다</w:t>
+      </w:r>
+      <w:r>
+        <w:rPr>
+          <w:rFonts w:ascii="Times New Roman" w:hAnsi="Times New Roman" w:cs="Times New Roman"/>
+          <w:sz w:val="22"/>
+        </w:rPr>
+        <w:t xml:space="preserve">(p&lt;0.001). NNCLR </w:t>
+      </w:r>
+      <w:r>
+        <w:rPr>
+          <w:rFonts w:ascii="Times New Roman" w:hAnsi="Times New Roman" w:cs="Times New Roman"/>
+          <w:sz w:val="22"/>
+        </w:rPr>
+        <w:t>사전학습</w:t>
+      </w:r>
+      <w:r>
+        <w:rPr>
+          <w:rFonts w:ascii="Times New Roman" w:hAnsi="Times New Roman" w:cs="Times New Roman"/>
+          <w:sz w:val="22"/>
+        </w:rPr>
+        <w:t xml:space="preserve"> </w:t>
+      </w:r>
+      <w:r>
+        <w:rPr>
+          <w:rFonts w:ascii="Times New Roman" w:hAnsi="Times New Roman" w:cs="Times New Roman"/>
+          <w:sz w:val="22"/>
+        </w:rPr>
+        <w:t>후</w:t>
+      </w:r>
+      <w:r>
+        <w:rPr>
+          <w:rFonts w:ascii="Times New Roman" w:hAnsi="Times New Roman" w:cs="Times New Roman"/>
+          <w:sz w:val="22"/>
+        </w:rPr>
+        <w:t xml:space="preserve"> </w:t>
+      </w:r>
+      <w:r>
+        <w:rPr>
+          <w:rFonts w:ascii="Times New Roman" w:hAnsi="Times New Roman" w:cs="Times New Roman"/>
+          <w:sz w:val="22"/>
+        </w:rPr>
+        <w:t>미세조정한</w:t>
+      </w:r>
+      <w:r>
+        <w:rPr>
+          <w:rFonts w:ascii="Times New Roman" w:hAnsi="Times New Roman" w:cs="Times New Roman"/>
+          <w:sz w:val="22"/>
+        </w:rPr>
+        <w:t xml:space="preserve"> 2</w:t>
+      </w:r>
+      <w:r>
+        <w:rPr>
+          <w:rFonts w:ascii="Times New Roman" w:hAnsi="Times New Roman" w:cs="Times New Roman"/>
+          <w:sz w:val="22"/>
+        </w:rPr>
+        <w:t>단계</w:t>
+      </w:r>
+      <w:r>
+        <w:rPr>
+          <w:rFonts w:ascii="Times New Roman" w:hAnsi="Times New Roman" w:cs="Times New Roman"/>
+          <w:sz w:val="22"/>
+        </w:rPr>
+        <w:t xml:space="preserve"> </w:t>
+      </w:r>
+      <w:r>
+        <w:rPr>
+          <w:rFonts w:ascii="Times New Roman" w:hAnsi="Times New Roman" w:cs="Times New Roman"/>
+          <w:sz w:val="22"/>
+        </w:rPr>
+        <w:t>학습은</w:t>
+      </w:r>
+      <w:r>
+        <w:rPr>
+          <w:rFonts w:ascii="Times New Roman" w:hAnsi="Times New Roman" w:cs="Times New Roman"/>
+          <w:sz w:val="22"/>
+        </w:rPr>
+        <w:t xml:space="preserve"> CE+SupCon </w:t>
+      </w:r>
+      <w:r>
+        <w:rPr>
+          <w:rFonts w:ascii="Times New Roman" w:hAnsi="Times New Roman" w:cs="Times New Roman"/>
+          <w:sz w:val="22"/>
+        </w:rPr>
+        <w:t>대비</w:t>
+      </w:r>
+      <w:r>
+        <w:rPr>
+          <w:rFonts w:ascii="Times New Roman" w:hAnsi="Times New Roman" w:cs="Times New Roman"/>
+          <w:sz w:val="22"/>
+        </w:rPr>
+        <w:t xml:space="preserve"> </w:t>
+      </w:r>
+      <w:r>
+        <w:rPr>
+          <w:rFonts w:ascii="Times New Roman" w:hAnsi="Times New Roman" w:cs="Times New Roman"/>
+          <w:sz w:val="22"/>
+        </w:rPr>
+        <w:t>분류</w:t>
+      </w:r>
+      <w:r>
+        <w:rPr>
+          <w:rFonts w:ascii="Times New Roman" w:hAnsi="Times New Roman" w:cs="Times New Roman"/>
+          <w:sz w:val="22"/>
+        </w:rPr>
+        <w:t xml:space="preserve"> </w:t>
+      </w:r>
+      <w:r>
+        <w:rPr>
+          <w:rFonts w:ascii="Times New Roman" w:hAnsi="Times New Roman" w:cs="Times New Roman"/>
+          <w:sz w:val="22"/>
+        </w:rPr>
+        <w:t>성능이</w:t>
+      </w:r>
+      <w:r>
+        <w:rPr>
+          <w:rFonts w:ascii="Times New Roman" w:hAnsi="Times New Roman" w:cs="Times New Roman"/>
+          <w:sz w:val="22"/>
+        </w:rPr>
+        <w:t xml:space="preserve"> </w:t>
+      </w:r>
+      <w:r>
+        <w:rPr>
+          <w:rFonts w:ascii="Times New Roman" w:hAnsi="Times New Roman" w:cs="Times New Roman"/>
+          <w:sz w:val="22"/>
+        </w:rPr>
+        <w:t>열등하였다</w:t>
+      </w:r>
+      <w:r>
+        <w:rPr>
+          <w:rFonts w:ascii="Times New Roman" w:hAnsi="Times New Roman" w:cs="Times New Roman"/>
+          <w:sz w:val="22"/>
+        </w:rPr>
+        <w:t>.</w:t>
+      </w:r>
+    </w:p>
+    <w:p>
+      <w:pPr>
+        <w:pStyle w:val="a4"/>
+        <w:numPr>
+          <w:ilvl w:val="0"/>
+          <w:numId w:val="2"/>
+        </w:numPr>
+        <w:spacing w:line="360" w:lineRule="auto"/>
+        <w:ind w:leftChars="0"/>
+        <w:rPr>
+          <w:rFonts w:ascii="Times New Roman" w:hAnsi="Times New Roman" w:cs="Times New Roman" w:hint="eastAsia"/>
+          <w:sz w:val="22"/>
+        </w:rPr>
+      </w:pPr>
+      <w:r>
+        <w:rPr>
+          <w:rFonts w:ascii="Times New Roman" w:hAnsi="Times New Roman" w:cs="Times New Roman" w:hint="eastAsia"/>
+          <w:sz w:val="22"/>
+        </w:rPr>
+        <w:t>결론</w:t>
+      </w:r>
+    </w:p>
+    <w:p>
+      <w:pPr>
+        <w:spacing w:line="360" w:lineRule="auto"/>
+        <w:rPr>
+          <w:rFonts w:ascii="Times New Roman" w:hAnsi="Times New Roman" w:cs="Times New Roman"/>
+          <w:sz w:val="22"/>
+        </w:rPr>
+      </w:pPr>
+      <w:r>
+        <w:rPr>
+          <w:rFonts w:ascii="Times New Roman" w:hAnsi="Times New Roman" w:cs="Times New Roman"/>
+          <w:sz w:val="22"/>
+        </w:rPr>
+        <w:lastRenderedPageBreak/>
+        <w:t>본</w:t>
+      </w:r>
+      <w:r>
+        <w:rPr>
+          <w:rFonts w:ascii="Times New Roman" w:hAnsi="Times New Roman" w:cs="Times New Roman"/>
+          <w:sz w:val="22"/>
+        </w:rPr>
+        <w:t xml:space="preserve"> </w:t>
+      </w:r>
+      <w:r>
+        <w:rPr>
+          <w:rFonts w:ascii="Times New Roman" w:hAnsi="Times New Roman" w:cs="Times New Roman"/>
+          <w:sz w:val="22"/>
+        </w:rPr>
+        <w:t>연구는</w:t>
+      </w:r>
+      <w:r>
+        <w:rPr>
+          <w:rFonts w:ascii="Times New Roman" w:hAnsi="Times New Roman" w:cs="Times New Roman"/>
+          <w:sz w:val="22"/>
+        </w:rPr>
+        <w:t xml:space="preserve"> B-mode </w:t>
+      </w:r>
+      <w:r>
+        <w:rPr>
+          <w:rFonts w:ascii="Times New Roman" w:hAnsi="Times New Roman" w:cs="Times New Roman"/>
+          <w:sz w:val="22"/>
+        </w:rPr>
+        <w:t>초음파에서</w:t>
+      </w:r>
+      <w:r>
+        <w:rPr>
+          <w:rFonts w:ascii="Times New Roman" w:hAnsi="Times New Roman" w:cs="Times New Roman"/>
+          <w:sz w:val="22"/>
+        </w:rPr>
+        <w:t xml:space="preserve"> </w:t>
+      </w:r>
+      <w:r>
+        <w:rPr>
+          <w:rFonts w:ascii="Times New Roman" w:hAnsi="Times New Roman" w:cs="Times New Roman"/>
+          <w:sz w:val="22"/>
+        </w:rPr>
+        <w:t>임상의의</w:t>
+      </w:r>
+      <w:r>
+        <w:rPr>
+          <w:rFonts w:ascii="Times New Roman" w:hAnsi="Times New Roman" w:cs="Times New Roman"/>
+          <w:sz w:val="22"/>
+        </w:rPr>
+        <w:t xml:space="preserve"> </w:t>
+      </w:r>
+      <w:r>
+        <w:rPr>
+          <w:rFonts w:ascii="Times New Roman" w:hAnsi="Times New Roman" w:cs="Times New Roman"/>
+          <w:sz w:val="22"/>
+        </w:rPr>
+        <w:t>유사성</w:t>
+      </w:r>
+      <w:r>
+        <w:rPr>
+          <w:rFonts w:ascii="Times New Roman" w:hAnsi="Times New Roman" w:cs="Times New Roman"/>
+          <w:sz w:val="22"/>
+        </w:rPr>
+        <w:t xml:space="preserve"> </w:t>
+      </w:r>
+      <w:r>
+        <w:rPr>
+          <w:rFonts w:ascii="Times New Roman" w:hAnsi="Times New Roman" w:cs="Times New Roman"/>
+          <w:sz w:val="22"/>
+        </w:rPr>
+        <w:t>기반</w:t>
+      </w:r>
+      <w:r>
+        <w:rPr>
+          <w:rFonts w:ascii="Times New Roman" w:hAnsi="Times New Roman" w:cs="Times New Roman"/>
+          <w:sz w:val="22"/>
+        </w:rPr>
+        <w:t xml:space="preserve"> </w:t>
+      </w:r>
+      <w:r>
+        <w:rPr>
+          <w:rFonts w:ascii="Times New Roman" w:hAnsi="Times New Roman" w:cs="Times New Roman"/>
+          <w:sz w:val="22"/>
+        </w:rPr>
+        <w:t>추론에</w:t>
+      </w:r>
+      <w:r>
+        <w:rPr>
+          <w:rFonts w:ascii="Times New Roman" w:hAnsi="Times New Roman" w:cs="Times New Roman"/>
+          <w:sz w:val="22"/>
+        </w:rPr>
+        <w:t xml:space="preserve"> </w:t>
+      </w:r>
+      <w:r>
+        <w:rPr>
+          <w:rFonts w:ascii="Times New Roman" w:hAnsi="Times New Roman" w:cs="Times New Roman"/>
+          <w:sz w:val="22"/>
+        </w:rPr>
+        <w:t>대응하는</w:t>
+      </w:r>
+      <w:r>
+        <w:rPr>
+          <w:rFonts w:ascii="Times New Roman" w:hAnsi="Times New Roman" w:cs="Times New Roman"/>
+          <w:sz w:val="22"/>
+        </w:rPr>
+        <w:t xml:space="preserve"> </w:t>
+      </w:r>
+      <w:r>
+        <w:rPr>
+          <w:rFonts w:ascii="Times New Roman" w:hAnsi="Times New Roman" w:cs="Times New Roman"/>
+          <w:sz w:val="22"/>
+        </w:rPr>
+        <w:t>연속형</w:t>
+      </w:r>
+      <w:r>
+        <w:rPr>
+          <w:rFonts w:ascii="Times New Roman" w:hAnsi="Times New Roman" w:cs="Times New Roman"/>
+          <w:sz w:val="22"/>
+        </w:rPr>
+        <w:t xml:space="preserve"> </w:t>
+      </w:r>
+      <w:r>
+        <w:rPr>
+          <w:rFonts w:ascii="Times New Roman" w:hAnsi="Times New Roman" w:cs="Times New Roman"/>
+          <w:sz w:val="22"/>
+        </w:rPr>
+        <w:t>영상표지자</w:t>
+      </w:r>
+      <w:r>
+        <w:rPr>
+          <w:rFonts w:ascii="Times New Roman" w:hAnsi="Times New Roman" w:cs="Times New Roman"/>
+          <w:sz w:val="22"/>
+        </w:rPr>
+        <w:t xml:space="preserve"> </w:t>
+      </w:r>
+      <w:r>
+        <w:rPr>
+          <w:rFonts w:ascii="Times New Roman" w:hAnsi="Times New Roman" w:cs="Times New Roman"/>
+          <w:sz w:val="22"/>
+        </w:rPr>
+        <w:t>후보</w:t>
+      </w:r>
+      <w:r>
+        <w:rPr>
+          <w:rFonts w:ascii="Times New Roman" w:hAnsi="Times New Roman" w:cs="Times New Roman"/>
+          <w:sz w:val="22"/>
+        </w:rPr>
+        <w:t>(HCC cosine score, Δscore)</w:t>
+      </w:r>
+      <w:r>
+        <w:rPr>
+          <w:rFonts w:ascii="Times New Roman" w:hAnsi="Times New Roman" w:cs="Times New Roman"/>
+          <w:sz w:val="22"/>
+        </w:rPr>
+        <w:t>를</w:t>
+      </w:r>
+      <w:r>
+        <w:rPr>
+          <w:rFonts w:ascii="Times New Roman" w:hAnsi="Times New Roman" w:cs="Times New Roman"/>
+          <w:sz w:val="22"/>
+        </w:rPr>
+        <w:t xml:space="preserve"> </w:t>
+      </w:r>
+      <w:r>
+        <w:rPr>
+          <w:rFonts w:ascii="Times New Roman" w:hAnsi="Times New Roman" w:cs="Times New Roman"/>
+          <w:sz w:val="22"/>
+        </w:rPr>
+        <w:t>제안하였으며</w:t>
+      </w:r>
+      <w:r>
+        <w:rPr>
+          <w:rFonts w:ascii="Times New Roman" w:hAnsi="Times New Roman" w:cs="Times New Roman"/>
+          <w:sz w:val="22"/>
+        </w:rPr>
+        <w:t xml:space="preserve">, SupCon </w:t>
+      </w:r>
+      <w:r>
+        <w:rPr>
+          <w:rFonts w:ascii="Times New Roman" w:hAnsi="Times New Roman" w:cs="Times New Roman"/>
+          <w:sz w:val="22"/>
+        </w:rPr>
+        <w:t>학습이</w:t>
+      </w:r>
+      <w:r>
+        <w:rPr>
+          <w:rFonts w:ascii="Times New Roman" w:hAnsi="Times New Roman" w:cs="Times New Roman"/>
+          <w:sz w:val="22"/>
+        </w:rPr>
+        <w:t xml:space="preserve"> cosine </w:t>
+      </w:r>
+      <w:r>
+        <w:rPr>
+          <w:rFonts w:ascii="Times New Roman" w:hAnsi="Times New Roman" w:cs="Times New Roman"/>
+          <w:sz w:val="22"/>
+        </w:rPr>
+        <w:t>기반</w:t>
+      </w:r>
+      <w:r>
+        <w:rPr>
+          <w:rFonts w:ascii="Times New Roman" w:hAnsi="Times New Roman" w:cs="Times New Roman"/>
+          <w:sz w:val="22"/>
+        </w:rPr>
+        <w:t xml:space="preserve"> </w:t>
+      </w:r>
+      <w:r>
+        <w:rPr>
+          <w:rFonts w:ascii="Times New Roman" w:hAnsi="Times New Roman" w:cs="Times New Roman"/>
+          <w:sz w:val="22"/>
+        </w:rPr>
+        <w:t>표지자의</w:t>
+      </w:r>
+      <w:r>
+        <w:rPr>
+          <w:rFonts w:ascii="Times New Roman" w:hAnsi="Times New Roman" w:cs="Times New Roman"/>
+          <w:sz w:val="22"/>
+        </w:rPr>
+        <w:t xml:space="preserve"> </w:t>
+      </w:r>
+      <w:r>
+        <w:rPr>
+          <w:rFonts w:ascii="Times New Roman" w:hAnsi="Times New Roman" w:cs="Times New Roman"/>
+          <w:sz w:val="22"/>
+        </w:rPr>
+        <w:t>임상적</w:t>
+      </w:r>
+      <w:r>
+        <w:rPr>
+          <w:rFonts w:ascii="Times New Roman" w:hAnsi="Times New Roman" w:cs="Times New Roman"/>
+          <w:sz w:val="22"/>
+        </w:rPr>
+        <w:t xml:space="preserve"> </w:t>
+      </w:r>
+      <w:r>
+        <w:rPr>
+          <w:rFonts w:ascii="Times New Roman" w:hAnsi="Times New Roman" w:cs="Times New Roman"/>
+          <w:sz w:val="22"/>
+        </w:rPr>
+        <w:t>타당성</w:t>
+      </w:r>
+      <w:r>
+        <w:rPr>
+          <w:rFonts w:ascii="Times New Roman" w:hAnsi="Times New Roman" w:cs="Times New Roman"/>
+          <w:sz w:val="22"/>
+        </w:rPr>
+        <w:t xml:space="preserve"> </w:t>
+      </w:r>
+      <w:r>
+        <w:rPr>
+          <w:rFonts w:ascii="Times New Roman" w:hAnsi="Times New Roman" w:cs="Times New Roman"/>
+          <w:sz w:val="22"/>
+        </w:rPr>
+        <w:t>확보에</w:t>
+      </w:r>
+      <w:r>
+        <w:rPr>
+          <w:rFonts w:ascii="Times New Roman" w:hAnsi="Times New Roman" w:cs="Times New Roman"/>
+          <w:sz w:val="22"/>
+        </w:rPr>
+        <w:t xml:space="preserve"> </w:t>
+      </w:r>
+      <w:r>
+        <w:rPr>
+          <w:rFonts w:ascii="Times New Roman" w:hAnsi="Times New Roman" w:cs="Times New Roman"/>
+          <w:sz w:val="22"/>
+        </w:rPr>
+        <w:t>필수적임을</w:t>
+      </w:r>
+      <w:r>
+        <w:rPr>
+          <w:rFonts w:ascii="Times New Roman" w:hAnsi="Times New Roman" w:cs="Times New Roman"/>
+          <w:sz w:val="22"/>
+        </w:rPr>
+        <w:t xml:space="preserve"> </w:t>
+      </w:r>
+      <w:r>
+        <w:rPr>
+          <w:rFonts w:ascii="Times New Roman" w:hAnsi="Times New Roman" w:cs="Times New Roman"/>
+          <w:sz w:val="22"/>
+        </w:rPr>
+        <w:t>확인하였다</w:t>
+      </w:r>
+      <w:r>
+        <w:rPr>
+          <w:rFonts w:ascii="Times New Roman" w:hAnsi="Times New Roman" w:cs="Times New Roman"/>
+          <w:sz w:val="22"/>
+        </w:rPr>
+        <w:t>.</w:t>
+      </w:r>
+    </w:p>
+    <w:p>
+      <w:pPr>
+        <w:spacing w:line="360" w:lineRule="auto"/>
+        <w:rPr>
+          <w:rFonts w:ascii="Times New Roman" w:hAnsi="Times New Roman" w:cs="Times New Roman"/>
+          <w:sz w:val="22"/>
+        </w:rPr>
+      </w:pPr>
+      <w:r>
+        <w:rPr>
+          <w:rFonts w:ascii="Times New Roman" w:hAnsi="Times New Roman" w:cs="Times New Roman"/>
+          <w:sz w:val="22"/>
+        </w:rPr>
+        <w:t>핵심어</w:t>
+      </w:r>
+      <w:r>
+        <w:rPr>
+          <w:rFonts w:ascii="Times New Roman" w:hAnsi="Times New Roman" w:cs="Times New Roman"/>
+          <w:sz w:val="22"/>
+        </w:rPr>
+        <w:t xml:space="preserve">: </w:t>
+      </w:r>
+      <w:r>
+        <w:rPr>
+          <w:rFonts w:ascii="Times New Roman" w:hAnsi="Times New Roman" w:cs="Times New Roman"/>
+          <w:sz w:val="22"/>
+        </w:rPr>
+        <w:t>간세포암</w:t>
+      </w:r>
+      <w:r>
+        <w:rPr>
+          <w:rFonts w:ascii="Times New Roman" w:hAnsi="Times New Roman" w:cs="Times New Roman"/>
+          <w:sz w:val="22"/>
+        </w:rPr>
+        <w:t xml:space="preserve">; </w:t>
+      </w:r>
+      <w:r>
+        <w:rPr>
+          <w:rFonts w:ascii="Times New Roman" w:hAnsi="Times New Roman" w:cs="Times New Roman"/>
+          <w:sz w:val="22"/>
+        </w:rPr>
+        <w:t>초음파</w:t>
+      </w:r>
+      <w:r>
+        <w:rPr>
+          <w:rFonts w:ascii="Times New Roman" w:hAnsi="Times New Roman" w:cs="Times New Roman"/>
+          <w:sz w:val="22"/>
+        </w:rPr>
+        <w:t xml:space="preserve">; </w:t>
+      </w:r>
+      <w:r>
+        <w:rPr>
+          <w:rFonts w:ascii="Times New Roman" w:hAnsi="Times New Roman" w:cs="Times New Roman"/>
+          <w:sz w:val="22"/>
+        </w:rPr>
+        <w:t>영상표지자</w:t>
+      </w:r>
+      <w:r>
+        <w:rPr>
+          <w:rFonts w:ascii="Times New Roman" w:hAnsi="Times New Roman" w:cs="Times New Roman"/>
+          <w:sz w:val="22"/>
+        </w:rPr>
+        <w:t xml:space="preserve">; cosine similarity; supervised contrastive learning; </w:t>
+      </w:r>
+      <w:r>
+        <w:rPr>
+          <w:rFonts w:ascii="Times New Roman" w:hAnsi="Times New Roman" w:cs="Times New Roman"/>
+          <w:sz w:val="22"/>
+        </w:rPr>
+        <w:t>이중</w:t>
+      </w:r>
+      <w:r>
+        <w:rPr>
+          <w:rFonts w:ascii="Times New Roman" w:hAnsi="Times New Roman" w:cs="Times New Roman"/>
+          <w:sz w:val="22"/>
+        </w:rPr>
+        <w:t xml:space="preserve"> </w:t>
+      </w:r>
+      <w:r>
+        <w:rPr>
+          <w:rFonts w:ascii="Times New Roman" w:hAnsi="Times New Roman" w:cs="Times New Roman"/>
+          <w:sz w:val="22"/>
+        </w:rPr>
+        <w:t>출력</w:t>
+      </w:r>
+      <w:r>
+        <w:rPr>
+          <w:rFonts w:ascii="Times New Roman" w:hAnsi="Times New Roman" w:cs="Times New Roman"/>
+          <w:sz w:val="22"/>
+        </w:rPr>
+        <w:t xml:space="preserve">; </w:t>
+      </w:r>
+      <w:r>
+        <w:rPr>
+          <w:rFonts w:ascii="Times New Roman" w:hAnsi="Times New Roman" w:cs="Times New Roman"/>
+          <w:sz w:val="22"/>
+        </w:rPr>
+        <w:t>임상</w:t>
+      </w:r>
+      <w:r>
+        <w:rPr>
+          <w:rFonts w:ascii="Times New Roman" w:hAnsi="Times New Roman" w:cs="Times New Roman"/>
+          <w:sz w:val="22"/>
+        </w:rPr>
+        <w:t xml:space="preserve"> </w:t>
+      </w:r>
+      <w:r>
+        <w:rPr>
+          <w:rFonts w:ascii="Times New Roman" w:hAnsi="Times New Roman" w:cs="Times New Roman"/>
+          <w:sz w:val="22"/>
+        </w:rPr>
+        <w:t>의사결정</w:t>
+      </w:r>
+      <w:r>
+        <w:rPr>
+          <w:rFonts w:ascii="Times New Roman" w:hAnsi="Times New Roman" w:cs="Times New Roman"/>
+          <w:sz w:val="22"/>
+        </w:rPr>
+        <w:t xml:space="preserve"> </w:t>
+      </w:r>
+      <w:r>
+        <w:rPr>
+          <w:rFonts w:ascii="Times New Roman" w:hAnsi="Times New Roman" w:cs="Times New Roman"/>
+          <w:sz w:val="22"/>
+        </w:rPr>
+        <w:t>지원</w:t>
+      </w:r>
+    </w:p>
+    <w:p>
+      <w:pPr>
         <w:spacing w:line="360" w:lineRule="auto"/>
         <w:rPr>
           <w:rFonts w:ascii="Times New Roman" w:hAnsi="Times New Roman" w:cs="Times New Roman"/>
@@ -245,281 +1989,39 @@
         <w:spacing w:line="360" w:lineRule="auto"/>
         <w:rPr>
           <w:rFonts w:ascii="Times New Roman" w:hAnsi="Times New Roman" w:cs="Times New Roman"/>
+          <w:b/>
           <w:sz w:val="22"/>
         </w:rPr>
       </w:pPr>
       <w:r>
         <w:rPr>
           <w:rFonts w:ascii="Times New Roman" w:hAnsi="Times New Roman" w:cs="Times New Roman"/>
-          <w:sz w:val="22"/>
-        </w:rPr>
-        <w:t xml:space="preserve">B-mode </w:t>
-      </w:r>
-      <w:r>
-        <w:rPr>
-          <w:rFonts w:ascii="Times New Roman" w:hAnsi="Times New Roman" w:cs="Times New Roman"/>
-          <w:sz w:val="22"/>
-        </w:rPr>
-        <w:t>초음파는</w:t>
-      </w:r>
-      <w:r>
-        <w:rPr>
-          <w:rFonts w:ascii="Times New Roman" w:hAnsi="Times New Roman" w:cs="Times New Roman"/>
-          <w:sz w:val="22"/>
-        </w:rPr>
-        <w:t xml:space="preserve"> </w:t>
-      </w:r>
-      <w:r>
-        <w:rPr>
-          <w:rFonts w:ascii="Times New Roman" w:hAnsi="Times New Roman" w:cs="Times New Roman"/>
-          <w:sz w:val="22"/>
-        </w:rPr>
-        <w:t>간세포암</w:t>
-      </w:r>
-      <w:r>
-        <w:rPr>
-          <w:rFonts w:ascii="Times New Roman" w:hAnsi="Times New Roman" w:cs="Times New Roman"/>
-          <w:sz w:val="22"/>
-        </w:rPr>
-        <w:t xml:space="preserve">(HCC) </w:t>
-      </w:r>
-      <w:r>
-        <w:rPr>
-          <w:rFonts w:ascii="Times New Roman" w:hAnsi="Times New Roman" w:cs="Times New Roman"/>
-          <w:sz w:val="22"/>
-        </w:rPr>
-        <w:t>감시의</w:t>
-      </w:r>
-      <w:r>
-        <w:rPr>
-          <w:rFonts w:ascii="Times New Roman" w:hAnsi="Times New Roman" w:cs="Times New Roman"/>
-          <w:sz w:val="22"/>
-        </w:rPr>
-        <w:t xml:space="preserve"> </w:t>
-      </w:r>
-      <w:r>
-        <w:rPr>
-          <w:rFonts w:ascii="Times New Roman" w:hAnsi="Times New Roman" w:cs="Times New Roman"/>
-          <w:sz w:val="22"/>
-        </w:rPr>
-        <w:t>핵심</w:t>
-      </w:r>
-      <w:r>
-        <w:rPr>
-          <w:rFonts w:ascii="Times New Roman" w:hAnsi="Times New Roman" w:cs="Times New Roman"/>
-          <w:sz w:val="22"/>
-        </w:rPr>
-        <w:t xml:space="preserve"> </w:t>
-      </w:r>
-      <w:r>
-        <w:rPr>
-          <w:rFonts w:ascii="Times New Roman" w:hAnsi="Times New Roman" w:cs="Times New Roman"/>
-          <w:sz w:val="22"/>
-        </w:rPr>
-        <w:t>도구이나</w:t>
-      </w:r>
-      <w:r>
-        <w:rPr>
-          <w:rFonts w:ascii="Times New Roman" w:hAnsi="Times New Roman" w:cs="Times New Roman"/>
-          <w:sz w:val="22"/>
-        </w:rPr>
-        <w:t xml:space="preserve"> </w:t>
-      </w:r>
-      <w:r>
-        <w:rPr>
-          <w:rFonts w:ascii="Times New Roman" w:hAnsi="Times New Roman" w:cs="Times New Roman"/>
-          <w:sz w:val="22"/>
-        </w:rPr>
-        <w:t>민감도가</w:t>
-      </w:r>
-      <w:r>
-        <w:rPr>
-          <w:rFonts w:ascii="Times New Roman" w:hAnsi="Times New Roman" w:cs="Times New Roman"/>
-          <w:sz w:val="22"/>
-        </w:rPr>
-        <w:t xml:space="preserve"> </w:t>
-      </w:r>
-      <w:r>
-        <w:rPr>
-          <w:rFonts w:ascii="Times New Roman" w:hAnsi="Times New Roman" w:cs="Times New Roman"/>
-          <w:sz w:val="22"/>
-        </w:rPr>
-        <w:t>제한적이며</w:t>
-      </w:r>
-      <w:r>
-        <w:rPr>
-          <w:rFonts w:ascii="Times New Roman" w:hAnsi="Times New Roman" w:cs="Times New Roman"/>
-          <w:sz w:val="22"/>
-        </w:rPr>
-        <w:t xml:space="preserve">, </w:t>
-      </w:r>
-      <w:r>
-        <w:rPr>
-          <w:rFonts w:ascii="Times New Roman" w:hAnsi="Times New Roman" w:cs="Times New Roman"/>
-          <w:sz w:val="22"/>
-        </w:rPr>
-        <w:t>기존</w:t>
-      </w:r>
-      <w:r>
-        <w:rPr>
-          <w:rFonts w:ascii="Times New Roman" w:hAnsi="Times New Roman" w:cs="Times New Roman"/>
-          <w:sz w:val="22"/>
-        </w:rPr>
-        <w:t xml:space="preserve"> </w:t>
-      </w:r>
-      <w:r>
-        <w:rPr>
-          <w:rFonts w:ascii="Times New Roman" w:hAnsi="Times New Roman" w:cs="Times New Roman"/>
-          <w:sz w:val="22"/>
-        </w:rPr>
-        <w:t>딥러닝</w:t>
-      </w:r>
-      <w:r>
-        <w:rPr>
-          <w:rFonts w:ascii="Times New Roman" w:hAnsi="Times New Roman" w:cs="Times New Roman"/>
-          <w:sz w:val="22"/>
-        </w:rPr>
-        <w:t xml:space="preserve"> </w:t>
-      </w:r>
-      <w:r>
-        <w:rPr>
-          <w:rFonts w:ascii="Times New Roman" w:hAnsi="Times New Roman" w:cs="Times New Roman"/>
-          <w:sz w:val="22"/>
-        </w:rPr>
-        <w:t>모델은</w:t>
-      </w:r>
-      <w:r>
-        <w:rPr>
-          <w:rFonts w:ascii="Times New Roman" w:hAnsi="Times New Roman" w:cs="Times New Roman"/>
-          <w:sz w:val="22"/>
-        </w:rPr>
-        <w:t xml:space="preserve"> </w:t>
-      </w:r>
-      <w:r>
-        <w:rPr>
-          <w:rFonts w:ascii="Times New Roman" w:hAnsi="Times New Roman" w:cs="Times New Roman"/>
-          <w:sz w:val="22"/>
-        </w:rPr>
-        <w:t>단일</w:t>
-      </w:r>
-      <w:r>
-        <w:rPr>
-          <w:rFonts w:ascii="Times New Roman" w:hAnsi="Times New Roman" w:cs="Times New Roman"/>
-          <w:sz w:val="22"/>
-        </w:rPr>
-        <w:t xml:space="preserve"> softmax </w:t>
-      </w:r>
-      <w:r>
-        <w:rPr>
-          <w:rFonts w:ascii="Times New Roman" w:hAnsi="Times New Roman" w:cs="Times New Roman"/>
-          <w:sz w:val="22"/>
-        </w:rPr>
-        <w:t>출력만을</w:t>
-      </w:r>
-      <w:r>
-        <w:rPr>
-          <w:rFonts w:ascii="Times New Roman" w:hAnsi="Times New Roman" w:cs="Times New Roman"/>
-          <w:sz w:val="22"/>
-        </w:rPr>
-        <w:t xml:space="preserve"> </w:t>
-      </w:r>
-      <w:r>
-        <w:rPr>
-          <w:rFonts w:ascii="Times New Roman" w:hAnsi="Times New Roman" w:cs="Times New Roman"/>
-          <w:sz w:val="22"/>
-        </w:rPr>
-        <w:t>제공하여</w:t>
-      </w:r>
-      <w:r>
-        <w:rPr>
-          <w:rFonts w:ascii="Times New Roman" w:hAnsi="Times New Roman" w:cs="Times New Roman"/>
-          <w:sz w:val="22"/>
-        </w:rPr>
-        <w:t xml:space="preserve"> </w:t>
-      </w:r>
-      <w:r>
-        <w:rPr>
-          <w:rFonts w:ascii="Times New Roman" w:hAnsi="Times New Roman" w:cs="Times New Roman"/>
-          <w:sz w:val="22"/>
-        </w:rPr>
-        <w:t>임상의의</w:t>
-      </w:r>
-      <w:r>
-        <w:rPr>
-          <w:rFonts w:ascii="Times New Roman" w:hAnsi="Times New Roman" w:cs="Times New Roman"/>
-          <w:sz w:val="22"/>
-        </w:rPr>
-        <w:t xml:space="preserve"> </w:t>
-      </w:r>
-      <w:r>
-        <w:rPr>
-          <w:rFonts w:ascii="Times New Roman" w:hAnsi="Times New Roman" w:cs="Times New Roman"/>
-          <w:sz w:val="22"/>
-        </w:rPr>
-        <w:t>유사성</w:t>
-      </w:r>
-      <w:r>
-        <w:rPr>
-          <w:rFonts w:ascii="Times New Roman" w:hAnsi="Times New Roman" w:cs="Times New Roman"/>
-          <w:sz w:val="22"/>
-        </w:rPr>
-        <w:t xml:space="preserve"> </w:t>
-      </w:r>
-      <w:r>
-        <w:rPr>
-          <w:rFonts w:ascii="Times New Roman" w:hAnsi="Times New Roman" w:cs="Times New Roman"/>
-          <w:sz w:val="22"/>
-        </w:rPr>
-        <w:t>기반</w:t>
-      </w:r>
-      <w:r>
-        <w:rPr>
-          <w:rFonts w:ascii="Times New Roman" w:hAnsi="Times New Roman" w:cs="Times New Roman"/>
-          <w:sz w:val="22"/>
-        </w:rPr>
-        <w:t xml:space="preserve"> </w:t>
-      </w:r>
-      <w:r>
-        <w:rPr>
-          <w:rFonts w:ascii="Times New Roman" w:hAnsi="Times New Roman" w:cs="Times New Roman"/>
-          <w:sz w:val="22"/>
-        </w:rPr>
-        <w:t>추론에</w:t>
-      </w:r>
-      <w:r>
-        <w:rPr>
-          <w:rFonts w:ascii="Times New Roman" w:hAnsi="Times New Roman" w:cs="Times New Roman"/>
-          <w:sz w:val="22"/>
-        </w:rPr>
-        <w:t xml:space="preserve"> </w:t>
-      </w:r>
-      <w:r>
-        <w:rPr>
-          <w:rFonts w:ascii="Times New Roman" w:hAnsi="Times New Roman" w:cs="Times New Roman"/>
-          <w:sz w:val="22"/>
-        </w:rPr>
-        <w:t>대응하지</w:t>
-      </w:r>
-      <w:r>
-        <w:rPr>
-          <w:rFonts w:ascii="Times New Roman" w:hAnsi="Times New Roman" w:cs="Times New Roman"/>
-          <w:sz w:val="22"/>
-        </w:rPr>
-        <w:t xml:space="preserve"> </w:t>
-      </w:r>
-      <w:r>
-        <w:rPr>
-          <w:rFonts w:ascii="Times New Roman" w:hAnsi="Times New Roman" w:cs="Times New Roman"/>
-          <w:sz w:val="22"/>
-        </w:rPr>
-        <w:t>못한다</w:t>
-      </w:r>
-      <w:r>
-        <w:rPr>
-          <w:rFonts w:ascii="Times New Roman" w:hAnsi="Times New Roman" w:cs="Times New Roman"/>
-          <w:sz w:val="22"/>
-        </w:rPr>
-        <w:t>.</w:t>
+          <w:b/>
+          <w:sz w:val="22"/>
+        </w:rPr>
+        <w:t>English Abstract</w:t>
+      </w:r>
+    </w:p>
+    <w:p>
+      <w:pPr>
+        <w:pStyle w:val="a4"/>
+        <w:numPr>
+          <w:ilvl w:val="0"/>
+          <w:numId w:val="2"/>
+        </w:numPr>
+        <w:spacing w:line="360" w:lineRule="auto"/>
+        <w:ind w:leftChars="0"/>
+        <w:rPr>
+          <w:rFonts w:ascii="Times New Roman" w:hAnsi="Times New Roman" w:cs="Times New Roman" w:hint="eastAsia"/>
+          <w:sz w:val="22"/>
+        </w:rPr>
+      </w:pPr>
+      <w:r>
+        <w:rPr>
+          <w:rFonts w:ascii="Times New Roman" w:hAnsi="Times New Roman" w:cs="Times New Roman" w:hint="eastAsia"/>
+          <w:sz w:val="22"/>
+        </w:rPr>
+        <w:t>Background</w:t>
       </w:r>
     </w:p>
     <w:p>
@@ -532,451 +2034,32 @@
       </w:pPr>
       <w:r>
         <w:rPr>
+          <w:rFonts w:ascii="Times New Roman" w:hAnsi="Times New Roman" w:cs="Times New Roman"/>
+          <w:sz w:val="22"/>
+        </w:rPr>
+        <w:t>B-mode ultrasonography is a core tool for hepatocellular carcinoma (HCC) surveillance; however, its sensitivity remains limited. Existing deep learning models provide only a single softmax output, which does not correspond to the similarity-based reasoning performed by clinicians.</w:t>
+      </w:r>
+    </w:p>
+    <w:p>
+      <w:pPr>
+        <w:pStyle w:val="a4"/>
+        <w:numPr>
+          <w:ilvl w:val="0"/>
+          <w:numId w:val="2"/>
+        </w:numPr>
+        <w:spacing w:line="360" w:lineRule="auto"/>
+        <w:ind w:leftChars="0"/>
+        <w:rPr>
           <w:rFonts w:ascii="Times New Roman" w:hAnsi="Times New Roman" w:cs="Times New Roman" w:hint="eastAsia"/>
           <w:sz w:val="22"/>
         </w:rPr>
-        <w:t>본</w:t>
-      </w:r>
+      </w:pPr>
       <w:r>
         <w:rPr>
           <w:rFonts w:ascii="Times New Roman" w:hAnsi="Times New Roman" w:cs="Times New Roman" w:hint="eastAsia"/>
           <w:sz w:val="22"/>
         </w:rPr>
-        <w:t xml:space="preserve"> </w:t>
-      </w:r>
-      <w:r>
-        <w:rPr>
-          <w:rFonts w:ascii="Times New Roman" w:hAnsi="Times New Roman" w:cs="Times New Roman" w:hint="eastAsia"/>
-          <w:sz w:val="22"/>
-        </w:rPr>
-        <w:t>연구는</w:t>
-      </w:r>
-      <w:r>
-        <w:rPr>
-          <w:rFonts w:ascii="Times New Roman" w:hAnsi="Times New Roman" w:cs="Times New Roman" w:hint="eastAsia"/>
-          <w:sz w:val="22"/>
-        </w:rPr>
-        <w:t xml:space="preserve"> </w:t>
-      </w:r>
-      <w:r>
-        <w:rPr>
-          <w:rFonts w:ascii="Times New Roman" w:hAnsi="Times New Roman" w:cs="Times New Roman"/>
-          <w:sz w:val="22"/>
-        </w:rPr>
-        <w:t>공개</w:t>
-      </w:r>
-      <w:r>
-        <w:rPr>
-          <w:rFonts w:ascii="Times New Roman" w:hAnsi="Times New Roman" w:cs="Times New Roman"/>
-          <w:sz w:val="22"/>
-        </w:rPr>
-        <w:t xml:space="preserve"> </w:t>
-      </w:r>
-      <w:r>
-        <w:rPr>
-          <w:rFonts w:ascii="Times New Roman" w:hAnsi="Times New Roman" w:cs="Times New Roman"/>
-          <w:sz w:val="22"/>
-        </w:rPr>
-        <w:t>데이터셋</w:t>
-      </w:r>
-      <w:r>
-        <w:rPr>
-          <w:rFonts w:ascii="Times New Roman" w:hAnsi="Times New Roman" w:cs="Times New Roman"/>
-          <w:sz w:val="22"/>
-        </w:rPr>
-        <w:t xml:space="preserve"> SMC-LUD</w:t>
-      </w:r>
-      <w:r>
-        <w:rPr>
-          <w:rFonts w:ascii="Times New Roman" w:hAnsi="Times New Roman" w:cs="Times New Roman"/>
-          <w:sz w:val="22"/>
-        </w:rPr>
-        <w:t>의</w:t>
-      </w:r>
-      <w:r>
-        <w:rPr>
-          <w:rFonts w:ascii="Times New Roman" w:hAnsi="Times New Roman" w:cs="Times New Roman"/>
-          <w:sz w:val="22"/>
-        </w:rPr>
-        <w:t xml:space="preserve"> Clean subset(744</w:t>
-      </w:r>
-      <w:r>
-        <w:rPr>
-          <w:rFonts w:ascii="Times New Roman" w:hAnsi="Times New Roman" w:cs="Times New Roman"/>
-          <w:sz w:val="22"/>
-        </w:rPr>
-        <w:t>명</w:t>
-      </w:r>
-      <w:r>
-        <w:rPr>
-          <w:rFonts w:ascii="Times New Roman" w:hAnsi="Times New Roman" w:cs="Times New Roman"/>
-          <w:sz w:val="22"/>
-        </w:rPr>
-        <w:t>, 2,656</w:t>
-      </w:r>
-      <w:r>
-        <w:rPr>
-          <w:rFonts w:ascii="Times New Roman" w:hAnsi="Times New Roman" w:cs="Times New Roman"/>
-          <w:sz w:val="22"/>
-        </w:rPr>
-        <w:t>장</w:t>
-      </w:r>
-      <w:r>
-        <w:rPr>
-          <w:rFonts w:ascii="Times New Roman" w:hAnsi="Times New Roman" w:cs="Times New Roman"/>
-          <w:sz w:val="22"/>
-        </w:rPr>
-        <w:t>)</w:t>
-      </w:r>
-      <w:r>
-        <w:rPr>
-          <w:rFonts w:ascii="Times New Roman" w:hAnsi="Times New Roman" w:cs="Times New Roman"/>
-          <w:sz w:val="22"/>
-        </w:rPr>
-        <w:t>을</w:t>
-      </w:r>
-      <w:r>
-        <w:rPr>
-          <w:rFonts w:ascii="Times New Roman" w:hAnsi="Times New Roman" w:cs="Times New Roman"/>
-          <w:sz w:val="22"/>
-        </w:rPr>
-        <w:t xml:space="preserve"> </w:t>
-      </w:r>
-      <w:r>
-        <w:rPr>
-          <w:rFonts w:ascii="Times New Roman" w:hAnsi="Times New Roman" w:cs="Times New Roman"/>
-          <w:sz w:val="22"/>
-        </w:rPr>
-        <w:t>이용한</w:t>
-      </w:r>
-      <w:r>
-        <w:rPr>
-          <w:rFonts w:ascii="Times New Roman" w:hAnsi="Times New Roman" w:cs="Times New Roman"/>
-          <w:sz w:val="22"/>
-        </w:rPr>
-        <w:t xml:space="preserve"> </w:t>
-      </w:r>
-      <w:r>
-        <w:rPr>
-          <w:rFonts w:ascii="Times New Roman" w:hAnsi="Times New Roman" w:cs="Times New Roman"/>
-          <w:sz w:val="22"/>
-        </w:rPr>
-        <w:t>후향적</w:t>
-      </w:r>
-      <w:r>
-        <w:rPr>
-          <w:rFonts w:ascii="Times New Roman" w:hAnsi="Times New Roman" w:cs="Times New Roman"/>
-          <w:sz w:val="22"/>
-        </w:rPr>
-        <w:t xml:space="preserve"> </w:t>
-      </w:r>
-      <w:r>
-        <w:rPr>
-          <w:rFonts w:ascii="Times New Roman" w:hAnsi="Times New Roman" w:cs="Times New Roman"/>
-          <w:sz w:val="22"/>
-        </w:rPr>
-        <w:t>연구다</w:t>
-      </w:r>
-      <w:r>
-        <w:rPr>
-          <w:rFonts w:ascii="Times New Roman" w:hAnsi="Times New Roman" w:cs="Times New Roman"/>
-          <w:sz w:val="22"/>
-        </w:rPr>
-        <w:t xml:space="preserve">. EfficientNetV2B0 </w:t>
-      </w:r>
-      <w:r>
-        <w:rPr>
-          <w:rFonts w:ascii="Times New Roman" w:hAnsi="Times New Roman" w:cs="Times New Roman"/>
-          <w:sz w:val="22"/>
-        </w:rPr>
-        <w:t>기반</w:t>
-      </w:r>
-      <w:r>
-        <w:rPr>
-          <w:rFonts w:ascii="Times New Roman" w:hAnsi="Times New Roman" w:cs="Times New Roman"/>
-          <w:sz w:val="22"/>
-        </w:rPr>
-        <w:t xml:space="preserve"> hybrid vision transformer</w:t>
-      </w:r>
-      <w:r>
-        <w:rPr>
-          <w:rFonts w:ascii="Times New Roman" w:hAnsi="Times New Roman" w:cs="Times New Roman"/>
-          <w:sz w:val="22"/>
-        </w:rPr>
-        <w:t>를</w:t>
-      </w:r>
-      <w:r>
-        <w:rPr>
-          <w:rFonts w:ascii="Times New Roman" w:hAnsi="Times New Roman" w:cs="Times New Roman"/>
-          <w:sz w:val="22"/>
-        </w:rPr>
-        <w:t xml:space="preserve"> </w:t>
-      </w:r>
-      <w:r>
-        <w:rPr>
-          <w:rFonts w:ascii="Times New Roman" w:hAnsi="Times New Roman" w:cs="Times New Roman"/>
-          <w:sz w:val="22"/>
-        </w:rPr>
-        <w:t>교차</w:t>
-      </w:r>
-      <w:r>
-        <w:rPr>
-          <w:rFonts w:ascii="Times New Roman" w:hAnsi="Times New Roman" w:cs="Times New Roman"/>
-          <w:sz w:val="22"/>
-        </w:rPr>
-        <w:t xml:space="preserve"> </w:t>
-      </w:r>
-      <w:r>
-        <w:rPr>
-          <w:rFonts w:ascii="Times New Roman" w:hAnsi="Times New Roman" w:cs="Times New Roman"/>
-          <w:sz w:val="22"/>
-        </w:rPr>
-        <w:t>엔트로피와</w:t>
-      </w:r>
-      <w:r>
-        <w:rPr>
-          <w:rFonts w:ascii="Times New Roman" w:hAnsi="Times New Roman" w:cs="Times New Roman"/>
-          <w:sz w:val="22"/>
-        </w:rPr>
-        <w:t xml:space="preserve"> supervised contrastive learning(SupCon) </w:t>
-      </w:r>
-      <w:r>
-        <w:rPr>
-          <w:rFonts w:ascii="Times New Roman" w:hAnsi="Times New Roman" w:cs="Times New Roman"/>
-          <w:sz w:val="22"/>
-        </w:rPr>
-        <w:t>결합</w:t>
-      </w:r>
-      <w:r>
-        <w:rPr>
-          <w:rFonts w:ascii="Times New Roman" w:hAnsi="Times New Roman" w:cs="Times New Roman"/>
-          <w:sz w:val="22"/>
-        </w:rPr>
-        <w:t xml:space="preserve"> </w:t>
-      </w:r>
-      <w:r>
-        <w:rPr>
-          <w:rFonts w:ascii="Times New Roman" w:hAnsi="Times New Roman" w:cs="Times New Roman"/>
-          <w:sz w:val="22"/>
-        </w:rPr>
-        <w:t>학습하였다</w:t>
-      </w:r>
-      <w:r>
-        <w:rPr>
-          <w:rFonts w:ascii="Times New Roman" w:hAnsi="Times New Roman" w:cs="Times New Roman"/>
-          <w:sz w:val="22"/>
-        </w:rPr>
-        <w:t>. Softmax</w:t>
-      </w:r>
-      <w:r>
-        <w:rPr>
-          <w:rFonts w:ascii="Times New Roman" w:hAnsi="Times New Roman" w:cs="Times New Roman"/>
-          <w:sz w:val="22"/>
-        </w:rPr>
-        <w:t>를</w:t>
-      </w:r>
-      <w:r>
-        <w:rPr>
-          <w:rFonts w:ascii="Times New Roman" w:hAnsi="Times New Roman" w:cs="Times New Roman"/>
-          <w:sz w:val="22"/>
-        </w:rPr>
-        <w:t xml:space="preserve"> confidence score</w:t>
-      </w:r>
-      <w:r>
-        <w:rPr>
-          <w:rFonts w:ascii="Times New Roman" w:hAnsi="Times New Roman" w:cs="Times New Roman"/>
-          <w:sz w:val="22"/>
-        </w:rPr>
-        <w:t>로</w:t>
-      </w:r>
-      <w:r>
-        <w:rPr>
-          <w:rFonts w:ascii="Times New Roman" w:hAnsi="Times New Roman" w:cs="Times New Roman"/>
-          <w:sz w:val="22"/>
-        </w:rPr>
-        <w:t xml:space="preserve">, </w:t>
-      </w:r>
-      <w:r>
-        <w:rPr>
-          <w:rFonts w:ascii="Times New Roman" w:hAnsi="Times New Roman" w:cs="Times New Roman"/>
-          <w:sz w:val="22"/>
-        </w:rPr>
-        <w:t>임베딩과</w:t>
-      </w:r>
-      <w:r>
-        <w:rPr>
-          <w:rFonts w:ascii="Times New Roman" w:hAnsi="Times New Roman" w:cs="Times New Roman"/>
-          <w:sz w:val="22"/>
-        </w:rPr>
-        <w:t xml:space="preserve"> HCC prototype </w:t>
-      </w:r>
-      <w:r>
-        <w:rPr>
-          <w:rFonts w:ascii="Times New Roman" w:hAnsi="Times New Roman" w:cs="Times New Roman"/>
-          <w:sz w:val="22"/>
-        </w:rPr>
-        <w:t>간</w:t>
-      </w:r>
-      <w:r>
-        <w:rPr>
-          <w:rFonts w:ascii="Times New Roman" w:hAnsi="Times New Roman" w:cs="Times New Roman"/>
-          <w:sz w:val="22"/>
-        </w:rPr>
-        <w:t xml:space="preserve"> cosine similarity</w:t>
-      </w:r>
-      <w:r>
-        <w:rPr>
-          <w:rFonts w:ascii="Times New Roman" w:hAnsi="Times New Roman" w:cs="Times New Roman"/>
-          <w:sz w:val="22"/>
-        </w:rPr>
-        <w:t>를</w:t>
-      </w:r>
-      <w:r>
-        <w:rPr>
-          <w:rFonts w:ascii="Times New Roman" w:hAnsi="Times New Roman" w:cs="Times New Roman"/>
-          <w:sz w:val="22"/>
-        </w:rPr>
-        <w:t xml:space="preserve"> HCC cosine score, </w:t>
-      </w:r>
-      <w:r>
-        <w:rPr>
-          <w:rFonts w:ascii="Times New Roman" w:hAnsi="Times New Roman" w:cs="Times New Roman"/>
-          <w:sz w:val="22"/>
-        </w:rPr>
-        <w:t>두</w:t>
-      </w:r>
-      <w:r>
-        <w:rPr>
-          <w:rFonts w:ascii="Times New Roman" w:hAnsi="Times New Roman" w:cs="Times New Roman"/>
-          <w:sz w:val="22"/>
-        </w:rPr>
-        <w:t xml:space="preserve"> </w:t>
-      </w:r>
-      <w:r>
-        <w:rPr>
-          <w:rFonts w:ascii="Times New Roman" w:hAnsi="Times New Roman" w:cs="Times New Roman"/>
-          <w:sz w:val="22"/>
-        </w:rPr>
-        <w:t>클래스</w:t>
-      </w:r>
-      <w:r>
-        <w:rPr>
-          <w:rFonts w:ascii="Times New Roman" w:hAnsi="Times New Roman" w:cs="Times New Roman"/>
-          <w:sz w:val="22"/>
-        </w:rPr>
-        <w:t xml:space="preserve"> </w:t>
-      </w:r>
-      <w:r>
-        <w:rPr>
-          <w:rFonts w:ascii="Times New Roman" w:hAnsi="Times New Roman" w:cs="Times New Roman"/>
-          <w:sz w:val="22"/>
-        </w:rPr>
-        <w:t>간</w:t>
-      </w:r>
-      <w:r>
-        <w:rPr>
-          <w:rFonts w:ascii="Times New Roman" w:hAnsi="Times New Roman" w:cs="Times New Roman"/>
-          <w:sz w:val="22"/>
-        </w:rPr>
-        <w:t xml:space="preserve"> </w:t>
-      </w:r>
-      <w:r>
-        <w:rPr>
-          <w:rFonts w:ascii="Times New Roman" w:hAnsi="Times New Roman" w:cs="Times New Roman"/>
-          <w:sz w:val="22"/>
-        </w:rPr>
-        <w:t>마진을</w:t>
-      </w:r>
-      <w:r>
-        <w:rPr>
-          <w:rFonts w:ascii="Times New Roman" w:hAnsi="Times New Roman" w:cs="Times New Roman"/>
-          <w:sz w:val="22"/>
-        </w:rPr>
-        <w:t xml:space="preserve"> Δscore</w:t>
-      </w:r>
-      <w:r>
-        <w:rPr>
-          <w:rFonts w:ascii="Times New Roman" w:hAnsi="Times New Roman" w:cs="Times New Roman"/>
-          <w:sz w:val="22"/>
-        </w:rPr>
-        <w:t>로</w:t>
-      </w:r>
-      <w:r>
-        <w:rPr>
-          <w:rFonts w:ascii="Times New Roman" w:hAnsi="Times New Roman" w:cs="Times New Roman"/>
-          <w:sz w:val="22"/>
-        </w:rPr>
-        <w:t xml:space="preserve"> </w:t>
-      </w:r>
-      <w:r>
-        <w:rPr>
-          <w:rFonts w:ascii="Times New Roman" w:hAnsi="Times New Roman" w:cs="Times New Roman"/>
-          <w:sz w:val="22"/>
-        </w:rPr>
-        <w:t>정의하는</w:t>
-      </w:r>
-      <w:r>
-        <w:rPr>
-          <w:rFonts w:ascii="Times New Roman" w:hAnsi="Times New Roman" w:cs="Times New Roman"/>
-          <w:sz w:val="22"/>
-        </w:rPr>
-        <w:t xml:space="preserve"> </w:t>
-      </w:r>
-      <w:r>
-        <w:rPr>
-          <w:rFonts w:ascii="Times New Roman" w:hAnsi="Times New Roman" w:cs="Times New Roman"/>
-          <w:sz w:val="22"/>
-        </w:rPr>
-        <w:t>이중</w:t>
-      </w:r>
-      <w:r>
-        <w:rPr>
-          <w:rFonts w:ascii="Times New Roman" w:hAnsi="Times New Roman" w:cs="Times New Roman"/>
-          <w:sz w:val="22"/>
-        </w:rPr>
-        <w:t xml:space="preserve"> </w:t>
-      </w:r>
-      <w:r>
-        <w:rPr>
-          <w:rFonts w:ascii="Times New Roman" w:hAnsi="Times New Roman" w:cs="Times New Roman"/>
-          <w:sz w:val="22"/>
-        </w:rPr>
-        <w:t>출력</w:t>
-      </w:r>
-      <w:r>
-        <w:rPr>
-          <w:rFonts w:ascii="Times New Roman" w:hAnsi="Times New Roman" w:cs="Times New Roman"/>
-          <w:sz w:val="22"/>
-        </w:rPr>
-        <w:t xml:space="preserve"> </w:t>
-      </w:r>
-      <w:r>
-        <w:rPr>
-          <w:rFonts w:ascii="Times New Roman" w:hAnsi="Times New Roman" w:cs="Times New Roman"/>
-          <w:sz w:val="22"/>
-        </w:rPr>
-        <w:t>체계를</w:t>
-      </w:r>
-      <w:r>
-        <w:rPr>
-          <w:rFonts w:ascii="Times New Roman" w:hAnsi="Times New Roman" w:cs="Times New Roman"/>
-          <w:sz w:val="22"/>
-        </w:rPr>
-        <w:t xml:space="preserve"> </w:t>
-      </w:r>
-      <w:r>
-        <w:rPr>
-          <w:rFonts w:ascii="Times New Roman" w:hAnsi="Times New Roman" w:cs="Times New Roman"/>
-          <w:sz w:val="22"/>
-        </w:rPr>
-        <w:t>구성하였다</w:t>
-      </w:r>
-      <w:r>
-        <w:rPr>
-          <w:rFonts w:ascii="Times New Roman" w:hAnsi="Times New Roman" w:cs="Times New Roman"/>
-          <w:sz w:val="22"/>
-        </w:rPr>
-        <w:t>(IRB No. PMC 2026-07-001).</w:t>
+        <w:t>Methods</w:t>
       </w:r>
     </w:p>
     <w:p>
@@ -992,476 +2075,45 @@
           <w:rFonts w:ascii="Times New Roman" w:hAnsi="Times New Roman" w:cs="Times New Roman"/>
           <w:sz w:val="22"/>
         </w:rPr>
-        <w:t>주력</w:t>
-      </w:r>
-      <w:r>
-        <w:rPr>
-          <w:rFonts w:ascii="Times New Roman" w:hAnsi="Times New Roman" w:cs="Times New Roman"/>
-          <w:sz w:val="22"/>
-        </w:rPr>
-        <w:t xml:space="preserve"> </w:t>
-      </w:r>
-      <w:r>
-        <w:rPr>
-          <w:rFonts w:ascii="Times New Roman" w:hAnsi="Times New Roman" w:cs="Times New Roman"/>
-          <w:sz w:val="22"/>
-        </w:rPr>
-        <w:t>모델의</w:t>
-      </w:r>
-      <w:r>
-        <w:rPr>
-          <w:rFonts w:ascii="Times New Roman" w:hAnsi="Times New Roman" w:cs="Times New Roman"/>
-          <w:sz w:val="22"/>
-        </w:rPr>
-        <w:t xml:space="preserve"> confidence score AUROC</w:t>
-      </w:r>
-      <w:r>
-        <w:rPr>
-          <w:rFonts w:ascii="Times New Roman" w:hAnsi="Times New Roman" w:cs="Times New Roman"/>
-          <w:sz w:val="22"/>
-        </w:rPr>
-        <w:t>는</w:t>
-      </w:r>
-      <w:r>
-        <w:rPr>
-          <w:rFonts w:ascii="Times New Roman" w:hAnsi="Times New Roman" w:cs="Times New Roman"/>
-          <w:sz w:val="22"/>
-        </w:rPr>
-        <w:t xml:space="preserve"> </w:t>
-      </w:r>
-      <w:r>
-        <w:rPr>
-          <w:rFonts w:ascii="Times New Roman" w:hAnsi="Times New Roman" w:cs="Times New Roman"/>
-          <w:sz w:val="22"/>
-        </w:rPr>
-        <w:t>검증</w:t>
-      </w:r>
-      <w:r>
-        <w:rPr>
-          <w:rFonts w:ascii="Times New Roman" w:hAnsi="Times New Roman" w:cs="Times New Roman"/>
-          <w:sz w:val="22"/>
-        </w:rPr>
-        <w:t xml:space="preserve"> </w:t>
-      </w:r>
-      <w:r>
-        <w:rPr>
-          <w:rFonts w:ascii="Times New Roman" w:hAnsi="Times New Roman" w:cs="Times New Roman"/>
-          <w:sz w:val="22"/>
-        </w:rPr>
-        <w:t>및</w:t>
-      </w:r>
-      <w:r>
-        <w:rPr>
-          <w:rFonts w:ascii="Times New Roman" w:hAnsi="Times New Roman" w:cs="Times New Roman"/>
-          <w:sz w:val="22"/>
-        </w:rPr>
-        <w:t xml:space="preserve"> </w:t>
-      </w:r>
-      <w:r>
-        <w:rPr>
-          <w:rFonts w:ascii="Times New Roman" w:hAnsi="Times New Roman" w:cs="Times New Roman"/>
-          <w:sz w:val="22"/>
-        </w:rPr>
-        <w:t>테스트</w:t>
-      </w:r>
-      <w:r>
-        <w:rPr>
-          <w:rFonts w:ascii="Times New Roman" w:hAnsi="Times New Roman" w:cs="Times New Roman"/>
-          <w:sz w:val="22"/>
-        </w:rPr>
-        <w:t xml:space="preserve"> </w:t>
-      </w:r>
-      <w:r>
-        <w:rPr>
-          <w:rFonts w:ascii="Times New Roman" w:hAnsi="Times New Roman" w:cs="Times New Roman"/>
-          <w:sz w:val="22"/>
-        </w:rPr>
-        <w:t>세트</w:t>
-      </w:r>
-      <w:r>
-        <w:rPr>
-          <w:rFonts w:ascii="Times New Roman" w:hAnsi="Times New Roman" w:cs="Times New Roman"/>
-          <w:sz w:val="22"/>
-        </w:rPr>
-        <w:t xml:space="preserve"> </w:t>
-      </w:r>
-      <w:r>
-        <w:rPr>
-          <w:rFonts w:ascii="Times New Roman" w:hAnsi="Times New Roman" w:cs="Times New Roman"/>
-          <w:sz w:val="22"/>
-        </w:rPr>
-        <w:t>모두</w:t>
-      </w:r>
-      <w:r>
-        <w:rPr>
-          <w:rFonts w:ascii="Times New Roman" w:hAnsi="Times New Roman" w:cs="Times New Roman"/>
-          <w:sz w:val="22"/>
-        </w:rPr>
-        <w:t xml:space="preserve"> 1.000</w:t>
-      </w:r>
-      <w:r>
-        <w:rPr>
-          <w:rFonts w:ascii="Times New Roman" w:hAnsi="Times New Roman" w:cs="Times New Roman"/>
-          <w:sz w:val="22"/>
-        </w:rPr>
-        <w:t>이었으며</w:t>
-      </w:r>
-      <w:r>
-        <w:rPr>
-          <w:rFonts w:ascii="Times New Roman" w:hAnsi="Times New Roman" w:cs="Times New Roman"/>
-          <w:sz w:val="22"/>
-        </w:rPr>
-        <w:t xml:space="preserve">, </w:t>
-      </w:r>
-      <w:r>
-        <w:rPr>
-          <w:rFonts w:ascii="Times New Roman" w:hAnsi="Times New Roman" w:cs="Times New Roman"/>
-          <w:sz w:val="22"/>
-        </w:rPr>
-        <w:t>테스트</w:t>
-      </w:r>
-      <w:r>
-        <w:rPr>
-          <w:rFonts w:ascii="Times New Roman" w:hAnsi="Times New Roman" w:cs="Times New Roman"/>
-          <w:sz w:val="22"/>
-        </w:rPr>
-        <w:t xml:space="preserve"> </w:t>
-      </w:r>
-      <w:r>
-        <w:rPr>
-          <w:rFonts w:ascii="Times New Roman" w:hAnsi="Times New Roman" w:cs="Times New Roman"/>
-          <w:sz w:val="22"/>
-        </w:rPr>
-        <w:t>세트에서</w:t>
-      </w:r>
-      <w:r>
-        <w:rPr>
-          <w:rFonts w:ascii="Times New Roman" w:hAnsi="Times New Roman" w:cs="Times New Roman"/>
-          <w:sz w:val="22"/>
-        </w:rPr>
-        <w:t xml:space="preserve"> </w:t>
-      </w:r>
-      <w:r>
-        <w:rPr>
-          <w:rFonts w:ascii="Times New Roman" w:hAnsi="Times New Roman" w:cs="Times New Roman"/>
-          <w:sz w:val="22"/>
-        </w:rPr>
-        <w:t>민감도</w:t>
-      </w:r>
-      <w:r>
-        <w:rPr>
-          <w:rFonts w:ascii="Times New Roman" w:hAnsi="Times New Roman" w:cs="Times New Roman"/>
-          <w:sz w:val="22"/>
-        </w:rPr>
-        <w:t xml:space="preserve"> 100.0%, </w:t>
-      </w:r>
-      <w:r>
-        <w:rPr>
-          <w:rFonts w:ascii="Times New Roman" w:hAnsi="Times New Roman" w:cs="Times New Roman"/>
-          <w:sz w:val="22"/>
-        </w:rPr>
-        <w:t>특이도</w:t>
-      </w:r>
-      <w:r>
-        <w:rPr>
-          <w:rFonts w:ascii="Times New Roman" w:hAnsi="Times New Roman" w:cs="Times New Roman"/>
-          <w:sz w:val="22"/>
-        </w:rPr>
-        <w:t xml:space="preserve"> 99.2%</w:t>
-      </w:r>
-      <w:r>
-        <w:rPr>
-          <w:rFonts w:ascii="Times New Roman" w:hAnsi="Times New Roman" w:cs="Times New Roman"/>
-          <w:sz w:val="22"/>
-        </w:rPr>
-        <w:t>를</w:t>
-      </w:r>
-      <w:r>
-        <w:rPr>
-          <w:rFonts w:ascii="Times New Roman" w:hAnsi="Times New Roman" w:cs="Times New Roman"/>
-          <w:sz w:val="22"/>
-        </w:rPr>
-        <w:t xml:space="preserve"> </w:t>
-      </w:r>
-      <w:r>
-        <w:rPr>
-          <w:rFonts w:ascii="Times New Roman" w:hAnsi="Times New Roman" w:cs="Times New Roman"/>
-          <w:sz w:val="22"/>
-        </w:rPr>
-        <w:t>달성하였다</w:t>
-      </w:r>
-      <w:r>
-        <w:rPr>
-          <w:rFonts w:ascii="Times New Roman" w:hAnsi="Times New Roman" w:cs="Times New Roman"/>
-          <w:sz w:val="22"/>
-        </w:rPr>
-        <w:t>. HCC cosine score</w:t>
-      </w:r>
-      <w:r>
-        <w:rPr>
-          <w:rFonts w:ascii="Times New Roman" w:hAnsi="Times New Roman" w:cs="Times New Roman"/>
-          <w:sz w:val="22"/>
-        </w:rPr>
-        <w:t>와</w:t>
-      </w:r>
-      <w:r>
-        <w:rPr>
-          <w:rFonts w:ascii="Times New Roman" w:hAnsi="Times New Roman" w:cs="Times New Roman"/>
-          <w:sz w:val="22"/>
-        </w:rPr>
-        <w:t xml:space="preserve"> Δscore AUROC 1.000</w:t>
-      </w:r>
-      <w:r>
-        <w:rPr>
-          <w:rFonts w:ascii="Times New Roman" w:hAnsi="Times New Roman" w:cs="Times New Roman"/>
-          <w:sz w:val="22"/>
-        </w:rPr>
-        <w:t>으로</w:t>
-      </w:r>
-      <w:r>
-        <w:rPr>
-          <w:rFonts w:ascii="Times New Roman" w:hAnsi="Times New Roman" w:cs="Times New Roman"/>
-          <w:sz w:val="22"/>
-        </w:rPr>
-        <w:t xml:space="preserve"> confidence score</w:t>
-      </w:r>
-      <w:r>
-        <w:rPr>
-          <w:rFonts w:ascii="Times New Roman" w:hAnsi="Times New Roman" w:cs="Times New Roman"/>
-          <w:sz w:val="22"/>
-        </w:rPr>
-        <w:t>와</w:t>
-      </w:r>
-      <w:r>
-        <w:rPr>
-          <w:rFonts w:ascii="Times New Roman" w:hAnsi="Times New Roman" w:cs="Times New Roman"/>
-          <w:sz w:val="22"/>
-        </w:rPr>
-        <w:t xml:space="preserve"> </w:t>
-      </w:r>
-      <w:r>
-        <w:rPr>
-          <w:rFonts w:ascii="Times New Roman" w:hAnsi="Times New Roman" w:cs="Times New Roman"/>
-          <w:sz w:val="22"/>
-        </w:rPr>
-        <w:t>동등하였다</w:t>
-      </w:r>
-      <w:r>
-        <w:rPr>
-          <w:rFonts w:ascii="Times New Roman" w:hAnsi="Times New Roman" w:cs="Times New Roman"/>
-          <w:sz w:val="22"/>
-        </w:rPr>
-        <w:t xml:space="preserve">(DeLong p=1.000). SupCon </w:t>
-      </w:r>
-      <w:r>
-        <w:rPr>
-          <w:rFonts w:ascii="Times New Roman" w:hAnsi="Times New Roman" w:cs="Times New Roman"/>
-          <w:sz w:val="22"/>
-        </w:rPr>
-        <w:t>적용</w:t>
-      </w:r>
-      <w:r>
-        <w:rPr>
-          <w:rFonts w:ascii="Times New Roman" w:hAnsi="Times New Roman" w:cs="Times New Roman"/>
-          <w:sz w:val="22"/>
-        </w:rPr>
-        <w:t xml:space="preserve"> </w:t>
-      </w:r>
-      <w:r>
-        <w:rPr>
-          <w:rFonts w:ascii="Times New Roman" w:hAnsi="Times New Roman" w:cs="Times New Roman"/>
-          <w:sz w:val="22"/>
-        </w:rPr>
-        <w:t>시</w:t>
-      </w:r>
-      <w:r>
-        <w:rPr>
-          <w:rFonts w:ascii="Times New Roman" w:hAnsi="Times New Roman" w:cs="Times New Roman"/>
-          <w:sz w:val="22"/>
-        </w:rPr>
-        <w:t xml:space="preserve"> true HCC cases</w:t>
-      </w:r>
-      <w:r>
-        <w:rPr>
-          <w:rFonts w:ascii="Times New Roman" w:hAnsi="Times New Roman" w:cs="Times New Roman"/>
-          <w:sz w:val="22"/>
-        </w:rPr>
-        <w:t>에서</w:t>
-      </w:r>
-      <w:r>
-        <w:rPr>
-          <w:rFonts w:ascii="Times New Roman" w:hAnsi="Times New Roman" w:cs="Times New Roman"/>
-          <w:sz w:val="22"/>
-        </w:rPr>
-        <w:t xml:space="preserve"> HCC cosine score</w:t>
-      </w:r>
-      <w:r>
-        <w:rPr>
-          <w:rFonts w:ascii="Times New Roman" w:hAnsi="Times New Roman" w:cs="Times New Roman"/>
-          <w:sz w:val="22"/>
-        </w:rPr>
-        <w:t>가</w:t>
-      </w:r>
-      <w:r>
-        <w:rPr>
-          <w:rFonts w:ascii="Times New Roman" w:hAnsi="Times New Roman" w:cs="Times New Roman"/>
-          <w:sz w:val="22"/>
-        </w:rPr>
-        <w:t xml:space="preserve"> </w:t>
-      </w:r>
-      <w:r>
-        <w:rPr>
-          <w:rFonts w:ascii="Times New Roman" w:hAnsi="Times New Roman" w:cs="Times New Roman"/>
-          <w:sz w:val="22"/>
-        </w:rPr>
-        <w:t>유의하게</w:t>
-      </w:r>
-      <w:r>
-        <w:rPr>
-          <w:rFonts w:ascii="Times New Roman" w:hAnsi="Times New Roman" w:cs="Times New Roman"/>
-          <w:sz w:val="22"/>
-        </w:rPr>
-        <w:t xml:space="preserve"> </w:t>
-      </w:r>
-      <w:r>
-        <w:rPr>
-          <w:rFonts w:ascii="Times New Roman" w:hAnsi="Times New Roman" w:cs="Times New Roman"/>
-          <w:sz w:val="22"/>
-        </w:rPr>
-        <w:t>상승하였다</w:t>
-      </w:r>
-      <w:r>
-        <w:rPr>
-          <w:rFonts w:ascii="Times New Roman" w:hAnsi="Times New Roman" w:cs="Times New Roman"/>
-          <w:sz w:val="22"/>
-        </w:rPr>
-        <w:t xml:space="preserve">(p&lt;0.001). NNCLR </w:t>
-      </w:r>
-      <w:r>
-        <w:rPr>
-          <w:rFonts w:ascii="Times New Roman" w:hAnsi="Times New Roman" w:cs="Times New Roman"/>
-          <w:sz w:val="22"/>
-        </w:rPr>
-        <w:t>사전학습</w:t>
-      </w:r>
-      <w:r>
-        <w:rPr>
-          <w:rFonts w:ascii="Times New Roman" w:hAnsi="Times New Roman" w:cs="Times New Roman"/>
-          <w:sz w:val="22"/>
-        </w:rPr>
-        <w:t xml:space="preserve"> </w:t>
-      </w:r>
-      <w:r>
-        <w:rPr>
-          <w:rFonts w:ascii="Times New Roman" w:hAnsi="Times New Roman" w:cs="Times New Roman"/>
-          <w:sz w:val="22"/>
-        </w:rPr>
-        <w:t>후</w:t>
-      </w:r>
-      <w:r>
-        <w:rPr>
-          <w:rFonts w:ascii="Times New Roman" w:hAnsi="Times New Roman" w:cs="Times New Roman"/>
-          <w:sz w:val="22"/>
-        </w:rPr>
-        <w:t xml:space="preserve"> </w:t>
-      </w:r>
-      <w:r>
-        <w:rPr>
-          <w:rFonts w:ascii="Times New Roman" w:hAnsi="Times New Roman" w:cs="Times New Roman"/>
-          <w:sz w:val="22"/>
-        </w:rPr>
-        <w:t>미세조정한</w:t>
-      </w:r>
-      <w:r>
-        <w:rPr>
-          <w:rFonts w:ascii="Times New Roman" w:hAnsi="Times New Roman" w:cs="Times New Roman"/>
-          <w:sz w:val="22"/>
-        </w:rPr>
-        <w:t xml:space="preserve"> 2</w:t>
-      </w:r>
-      <w:r>
-        <w:rPr>
-          <w:rFonts w:ascii="Times New Roman" w:hAnsi="Times New Roman" w:cs="Times New Roman"/>
-          <w:sz w:val="22"/>
-        </w:rPr>
-        <w:t>단계</w:t>
-      </w:r>
-      <w:r>
-        <w:rPr>
-          <w:rFonts w:ascii="Times New Roman" w:hAnsi="Times New Roman" w:cs="Times New Roman"/>
-          <w:sz w:val="22"/>
-        </w:rPr>
-        <w:t xml:space="preserve"> </w:t>
-      </w:r>
-      <w:r>
-        <w:rPr>
-          <w:rFonts w:ascii="Times New Roman" w:hAnsi="Times New Roman" w:cs="Times New Roman"/>
-          <w:sz w:val="22"/>
-        </w:rPr>
-        <w:t>학습은</w:t>
-      </w:r>
-      <w:r>
-        <w:rPr>
-          <w:rFonts w:ascii="Times New Roman" w:hAnsi="Times New Roman" w:cs="Times New Roman"/>
-          <w:sz w:val="22"/>
-        </w:rPr>
-        <w:t xml:space="preserve"> CE+SupCon </w:t>
-      </w:r>
-      <w:r>
-        <w:rPr>
-          <w:rFonts w:ascii="Times New Roman" w:hAnsi="Times New Roman" w:cs="Times New Roman"/>
-          <w:sz w:val="22"/>
-        </w:rPr>
-        <w:t>대비</w:t>
-      </w:r>
-      <w:r>
-        <w:rPr>
-          <w:rFonts w:ascii="Times New Roman" w:hAnsi="Times New Roman" w:cs="Times New Roman"/>
-          <w:sz w:val="22"/>
-        </w:rPr>
-        <w:t xml:space="preserve"> </w:t>
-      </w:r>
-      <w:r>
-        <w:rPr>
-          <w:rFonts w:ascii="Times New Roman" w:hAnsi="Times New Roman" w:cs="Times New Roman"/>
-          <w:sz w:val="22"/>
-        </w:rPr>
-        <w:t>분류</w:t>
-      </w:r>
-      <w:r>
-        <w:rPr>
-          <w:rFonts w:ascii="Times New Roman" w:hAnsi="Times New Roman" w:cs="Times New Roman"/>
-          <w:sz w:val="22"/>
-        </w:rPr>
-        <w:t xml:space="preserve"> </w:t>
-      </w:r>
-      <w:r>
-        <w:rPr>
-          <w:rFonts w:ascii="Times New Roman" w:hAnsi="Times New Roman" w:cs="Times New Roman"/>
-          <w:sz w:val="22"/>
-        </w:rPr>
-        <w:t>성능이</w:t>
-      </w:r>
-      <w:r>
-        <w:rPr>
-          <w:rFonts w:ascii="Times New Roman" w:hAnsi="Times New Roman" w:cs="Times New Roman"/>
-          <w:sz w:val="22"/>
-        </w:rPr>
-        <w:t xml:space="preserve"> </w:t>
-      </w:r>
-      <w:r>
-        <w:rPr>
-          <w:rFonts w:ascii="Times New Roman" w:hAnsi="Times New Roman" w:cs="Times New Roman"/>
-          <w:sz w:val="22"/>
-        </w:rPr>
-        <w:t>열등하였다</w:t>
-      </w:r>
-      <w:r>
-        <w:rPr>
-          <w:rFonts w:ascii="Times New Roman" w:hAnsi="Times New Roman" w:cs="Times New Roman"/>
-          <w:sz w:val="22"/>
-        </w:rPr>
-        <w:t>.</w:t>
+        <w:t xml:space="preserve">This was a retrospective study using the </w:t>
+      </w:r>
+      <w:proofErr w:type="gramStart"/>
+      <w:r>
+        <w:rPr>
+          <w:rFonts w:ascii="Times New Roman" w:hAnsi="Times New Roman" w:cs="Times New Roman"/>
+          <w:sz w:val="22"/>
+        </w:rPr>
+        <w:t>Clean</w:t>
+      </w:r>
+      <w:proofErr w:type="gramEnd"/>
+      <w:r>
+        <w:rPr>
+          <w:rFonts w:ascii="Times New Roman" w:hAnsi="Times New Roman" w:cs="Times New Roman"/>
+          <w:sz w:val="22"/>
+        </w:rPr>
+        <w:t xml:space="preserve"> subset (744 patients, 2,656 images) from the publicly available Samsung Medical Center–Liver Ultrasound Dataset (SMC-LUD). A hybrid vision transformer based on EfficientNetV2B0 was trained with a combination of cross-entropy and supervised contrastive learning (SupCon). A dual-output system was constructed in which the softmax output was defined as the confidence score, the cosine similarity between the embedding and the HCC prototype as the HCC cosine score, and the margin between the two class prototypes as the Δscore (IRB No. PMC 2026-07-001).</w:t>
+      </w:r>
+    </w:p>
+    <w:p>
+      <w:pPr>
+        <w:pStyle w:val="a4"/>
+        <w:numPr>
+          <w:ilvl w:val="0"/>
+          <w:numId w:val="2"/>
+        </w:numPr>
+        <w:spacing w:line="360" w:lineRule="auto"/>
+        <w:ind w:leftChars="0"/>
+        <w:rPr>
+          <w:rFonts w:ascii="Times New Roman" w:hAnsi="Times New Roman" w:cs="Times New Roman" w:hint="eastAsia"/>
+          <w:sz w:val="22"/>
+        </w:rPr>
+      </w:pPr>
+      <w:r>
+        <w:rPr>
+          <w:rFonts w:ascii="Times New Roman" w:hAnsi="Times New Roman" w:cs="Times New Roman" w:hint="eastAsia"/>
+          <w:sz w:val="22"/>
+        </w:rPr>
+        <w:t>Results</w:t>
       </w:r>
     </w:p>
     <w:p>
@@ -1477,294 +2129,29 @@
           <w:rFonts w:ascii="Times New Roman" w:hAnsi="Times New Roman" w:cs="Times New Roman"/>
           <w:sz w:val="22"/>
         </w:rPr>
-        <w:t>본</w:t>
-      </w:r>
-      <w:r>
-        <w:rPr>
-          <w:rFonts w:ascii="Times New Roman" w:hAnsi="Times New Roman" w:cs="Times New Roman"/>
-          <w:sz w:val="22"/>
-        </w:rPr>
-        <w:t xml:space="preserve"> </w:t>
-      </w:r>
-      <w:r>
-        <w:rPr>
-          <w:rFonts w:ascii="Times New Roman" w:hAnsi="Times New Roman" w:cs="Times New Roman"/>
-          <w:sz w:val="22"/>
-        </w:rPr>
-        <w:t>연구는</w:t>
-      </w:r>
-      <w:r>
-        <w:rPr>
-          <w:rFonts w:ascii="Times New Roman" w:hAnsi="Times New Roman" w:cs="Times New Roman"/>
-          <w:sz w:val="22"/>
-        </w:rPr>
-        <w:t xml:space="preserve"> B-mode </w:t>
-      </w:r>
-      <w:r>
-        <w:rPr>
-          <w:rFonts w:ascii="Times New Roman" w:hAnsi="Times New Roman" w:cs="Times New Roman"/>
-          <w:sz w:val="22"/>
-        </w:rPr>
-        <w:t>초음파에서</w:t>
-      </w:r>
-      <w:r>
-        <w:rPr>
-          <w:rFonts w:ascii="Times New Roman" w:hAnsi="Times New Roman" w:cs="Times New Roman"/>
-          <w:sz w:val="22"/>
-        </w:rPr>
-        <w:t xml:space="preserve"> </w:t>
-      </w:r>
-      <w:r>
-        <w:rPr>
-          <w:rFonts w:ascii="Times New Roman" w:hAnsi="Times New Roman" w:cs="Times New Roman"/>
-          <w:sz w:val="22"/>
-        </w:rPr>
-        <w:t>임상의의</w:t>
-      </w:r>
-      <w:r>
-        <w:rPr>
-          <w:rFonts w:ascii="Times New Roman" w:hAnsi="Times New Roman" w:cs="Times New Roman"/>
-          <w:sz w:val="22"/>
-        </w:rPr>
-        <w:t xml:space="preserve"> </w:t>
-      </w:r>
-      <w:r>
-        <w:rPr>
-          <w:rFonts w:ascii="Times New Roman" w:hAnsi="Times New Roman" w:cs="Times New Roman"/>
-          <w:sz w:val="22"/>
-        </w:rPr>
-        <w:t>유사성</w:t>
-      </w:r>
-      <w:r>
-        <w:rPr>
-          <w:rFonts w:ascii="Times New Roman" w:hAnsi="Times New Roman" w:cs="Times New Roman"/>
-          <w:sz w:val="22"/>
-        </w:rPr>
-        <w:t xml:space="preserve"> </w:t>
-      </w:r>
-      <w:r>
-        <w:rPr>
-          <w:rFonts w:ascii="Times New Roman" w:hAnsi="Times New Roman" w:cs="Times New Roman"/>
-          <w:sz w:val="22"/>
-        </w:rPr>
-        <w:t>기반</w:t>
-      </w:r>
-      <w:r>
-        <w:rPr>
-          <w:rFonts w:ascii="Times New Roman" w:hAnsi="Times New Roman" w:cs="Times New Roman"/>
-          <w:sz w:val="22"/>
-        </w:rPr>
-        <w:t xml:space="preserve"> </w:t>
-      </w:r>
-      <w:r>
-        <w:rPr>
-          <w:rFonts w:ascii="Times New Roman" w:hAnsi="Times New Roman" w:cs="Times New Roman"/>
-          <w:sz w:val="22"/>
-        </w:rPr>
-        <w:t>추론에</w:t>
-      </w:r>
-      <w:r>
-        <w:rPr>
-          <w:rFonts w:ascii="Times New Roman" w:hAnsi="Times New Roman" w:cs="Times New Roman"/>
-          <w:sz w:val="22"/>
-        </w:rPr>
-        <w:t xml:space="preserve"> </w:t>
-      </w:r>
-      <w:r>
-        <w:rPr>
-          <w:rFonts w:ascii="Times New Roman" w:hAnsi="Times New Roman" w:cs="Times New Roman"/>
-          <w:sz w:val="22"/>
-        </w:rPr>
-        <w:t>대응하는</w:t>
-      </w:r>
-      <w:r>
-        <w:rPr>
-          <w:rFonts w:ascii="Times New Roman" w:hAnsi="Times New Roman" w:cs="Times New Roman"/>
-          <w:sz w:val="22"/>
-        </w:rPr>
-        <w:t xml:space="preserve"> </w:t>
-      </w:r>
-      <w:r>
-        <w:rPr>
-          <w:rFonts w:ascii="Times New Roman" w:hAnsi="Times New Roman" w:cs="Times New Roman"/>
-          <w:sz w:val="22"/>
-        </w:rPr>
-        <w:t>연속형</w:t>
-      </w:r>
-      <w:r>
-        <w:rPr>
-          <w:rFonts w:ascii="Times New Roman" w:hAnsi="Times New Roman" w:cs="Times New Roman"/>
-          <w:sz w:val="22"/>
-        </w:rPr>
-        <w:t xml:space="preserve"> </w:t>
-      </w:r>
-      <w:r>
-        <w:rPr>
-          <w:rFonts w:ascii="Times New Roman" w:hAnsi="Times New Roman" w:cs="Times New Roman"/>
-          <w:sz w:val="22"/>
-        </w:rPr>
-        <w:t>영상표지자</w:t>
-      </w:r>
-      <w:r>
-        <w:rPr>
-          <w:rFonts w:ascii="Times New Roman" w:hAnsi="Times New Roman" w:cs="Times New Roman"/>
-          <w:sz w:val="22"/>
-        </w:rPr>
-        <w:t xml:space="preserve"> </w:t>
-      </w:r>
-      <w:r>
-        <w:rPr>
-          <w:rFonts w:ascii="Times New Roman" w:hAnsi="Times New Roman" w:cs="Times New Roman"/>
-          <w:sz w:val="22"/>
-        </w:rPr>
-        <w:t>후보</w:t>
-      </w:r>
-      <w:r>
-        <w:rPr>
-          <w:rFonts w:ascii="Times New Roman" w:hAnsi="Times New Roman" w:cs="Times New Roman"/>
-          <w:sz w:val="22"/>
-        </w:rPr>
-        <w:t>(HCC cosine score, Δscore)</w:t>
-      </w:r>
-      <w:r>
-        <w:rPr>
-          <w:rFonts w:ascii="Times New Roman" w:hAnsi="Times New Roman" w:cs="Times New Roman"/>
-          <w:sz w:val="22"/>
-        </w:rPr>
-        <w:t>를</w:t>
-      </w:r>
-      <w:r>
-        <w:rPr>
-          <w:rFonts w:ascii="Times New Roman" w:hAnsi="Times New Roman" w:cs="Times New Roman"/>
-          <w:sz w:val="22"/>
-        </w:rPr>
-        <w:t xml:space="preserve"> </w:t>
-      </w:r>
-      <w:r>
-        <w:rPr>
-          <w:rFonts w:ascii="Times New Roman" w:hAnsi="Times New Roman" w:cs="Times New Roman"/>
-          <w:sz w:val="22"/>
-        </w:rPr>
-        <w:t>제안하였으며</w:t>
-      </w:r>
-      <w:r>
-        <w:rPr>
-          <w:rFonts w:ascii="Times New Roman" w:hAnsi="Times New Roman" w:cs="Times New Roman"/>
-          <w:sz w:val="22"/>
-        </w:rPr>
-        <w:t xml:space="preserve">, SupCon </w:t>
-      </w:r>
-      <w:r>
-        <w:rPr>
-          <w:rFonts w:ascii="Times New Roman" w:hAnsi="Times New Roman" w:cs="Times New Roman"/>
-          <w:sz w:val="22"/>
-        </w:rPr>
-        <w:t>학습이</w:t>
-      </w:r>
-      <w:r>
-        <w:rPr>
-          <w:rFonts w:ascii="Times New Roman" w:hAnsi="Times New Roman" w:cs="Times New Roman"/>
-          <w:sz w:val="22"/>
-        </w:rPr>
-        <w:t xml:space="preserve"> cosine </w:t>
-      </w:r>
-      <w:r>
-        <w:rPr>
-          <w:rFonts w:ascii="Times New Roman" w:hAnsi="Times New Roman" w:cs="Times New Roman"/>
-          <w:sz w:val="22"/>
-        </w:rPr>
-        <w:t>기반</w:t>
-      </w:r>
-      <w:r>
-        <w:rPr>
-          <w:rFonts w:ascii="Times New Roman" w:hAnsi="Times New Roman" w:cs="Times New Roman"/>
-          <w:sz w:val="22"/>
-        </w:rPr>
-        <w:t xml:space="preserve"> </w:t>
-      </w:r>
-      <w:r>
-        <w:rPr>
-          <w:rFonts w:ascii="Times New Roman" w:hAnsi="Times New Roman" w:cs="Times New Roman"/>
-          <w:sz w:val="22"/>
-        </w:rPr>
-        <w:t>표지자의</w:t>
-      </w:r>
-      <w:r>
-        <w:rPr>
-          <w:rFonts w:ascii="Times New Roman" w:hAnsi="Times New Roman" w:cs="Times New Roman"/>
-          <w:sz w:val="22"/>
-        </w:rPr>
-        <w:t xml:space="preserve"> </w:t>
-      </w:r>
-      <w:r>
-        <w:rPr>
-          <w:rFonts w:ascii="Times New Roman" w:hAnsi="Times New Roman" w:cs="Times New Roman"/>
-          <w:sz w:val="22"/>
-        </w:rPr>
-        <w:t>임상적</w:t>
-      </w:r>
-      <w:r>
-        <w:rPr>
-          <w:rFonts w:ascii="Times New Roman" w:hAnsi="Times New Roman" w:cs="Times New Roman"/>
-          <w:sz w:val="22"/>
-        </w:rPr>
-        <w:t xml:space="preserve"> </w:t>
-      </w:r>
-      <w:r>
-        <w:rPr>
-          <w:rFonts w:ascii="Times New Roman" w:hAnsi="Times New Roman" w:cs="Times New Roman"/>
-          <w:sz w:val="22"/>
-        </w:rPr>
-        <w:t>타당성</w:t>
-      </w:r>
-      <w:r>
-        <w:rPr>
-          <w:rFonts w:ascii="Times New Roman" w:hAnsi="Times New Roman" w:cs="Times New Roman"/>
-          <w:sz w:val="22"/>
-        </w:rPr>
-        <w:t xml:space="preserve"> </w:t>
-      </w:r>
-      <w:r>
-        <w:rPr>
-          <w:rFonts w:ascii="Times New Roman" w:hAnsi="Times New Roman" w:cs="Times New Roman"/>
-          <w:sz w:val="22"/>
-        </w:rPr>
-        <w:t>확보에</w:t>
-      </w:r>
-      <w:r>
-        <w:rPr>
-          <w:rFonts w:ascii="Times New Roman" w:hAnsi="Times New Roman" w:cs="Times New Roman"/>
-          <w:sz w:val="22"/>
-        </w:rPr>
-        <w:t xml:space="preserve"> </w:t>
-      </w:r>
-      <w:r>
-        <w:rPr>
-          <w:rFonts w:ascii="Times New Roman" w:hAnsi="Times New Roman" w:cs="Times New Roman"/>
-          <w:sz w:val="22"/>
-        </w:rPr>
-        <w:t>필수적임을</w:t>
-      </w:r>
-      <w:r>
-        <w:rPr>
-          <w:rFonts w:ascii="Times New Roman" w:hAnsi="Times New Roman" w:cs="Times New Roman"/>
-          <w:sz w:val="22"/>
-        </w:rPr>
-        <w:t xml:space="preserve"> </w:t>
-      </w:r>
-      <w:r>
-        <w:rPr>
-          <w:rFonts w:ascii="Times New Roman" w:hAnsi="Times New Roman" w:cs="Times New Roman"/>
-          <w:sz w:val="22"/>
-        </w:rPr>
-        <w:t>확인하였다</w:t>
-      </w:r>
-      <w:r>
-        <w:rPr>
-          <w:rFonts w:ascii="Times New Roman" w:hAnsi="Times New Roman" w:cs="Times New Roman"/>
-          <w:sz w:val="22"/>
-        </w:rPr>
-        <w:t>.</w:t>
+        <w:t>The AUROC of the confidence score of the primary model was 1.000 in both the validation and test sets, achieving a sensitivity of 100.0% and a specificity of 99.2% on the test set. The HCC cosine score and Δscore also demonstrated an AUROC of 1.000, equivalent to the confidence score (DeLong p = 1.000). With SupCon applied, the HCC cosine score in true HCC cases was significantly elevated (p &lt; 0.001). The two-stage training with NNCLR pre-training followed by fine-tuning was inferior in classification performance compared to CE+SupCon alone.</w:t>
+      </w:r>
+    </w:p>
+    <w:p>
+      <w:pPr>
+        <w:pStyle w:val="a4"/>
+        <w:numPr>
+          <w:ilvl w:val="0"/>
+          <w:numId w:val="2"/>
+        </w:numPr>
+        <w:spacing w:line="360" w:lineRule="auto"/>
+        <w:ind w:leftChars="0"/>
+        <w:rPr>
+          <w:rFonts w:ascii="Times New Roman" w:hAnsi="Times New Roman" w:cs="Times New Roman" w:hint="eastAsia"/>
+          <w:sz w:val="22"/>
+        </w:rPr>
+      </w:pPr>
+      <w:r>
+        <w:rPr>
+          <w:rFonts w:ascii="Times New Roman" w:hAnsi="Times New Roman" w:cs="Times New Roman" w:hint="eastAsia"/>
+          <w:sz w:val="22"/>
+        </w:rPr>
+        <w:t>Conclusion</w:t>
       </w:r>
     </w:p>
     <w:p>
@@ -1780,70 +2167,23 @@
           <w:rFonts w:ascii="Times New Roman" w:hAnsi="Times New Roman" w:cs="Times New Roman"/>
           <w:sz w:val="22"/>
         </w:rPr>
-        <w:t>핵심어</w:t>
-      </w:r>
-      <w:r>
-        <w:rPr>
-          <w:rFonts w:ascii="Times New Roman" w:hAnsi="Times New Roman" w:cs="Times New Roman"/>
-          <w:sz w:val="22"/>
-        </w:rPr>
-        <w:t xml:space="preserve">: </w:t>
-      </w:r>
-      <w:r>
-        <w:rPr>
-          <w:rFonts w:ascii="Times New Roman" w:hAnsi="Times New Roman" w:cs="Times New Roman"/>
-          <w:sz w:val="22"/>
-        </w:rPr>
-        <w:t>간세포암</w:t>
-      </w:r>
-      <w:r>
-        <w:rPr>
-          <w:rFonts w:ascii="Times New Roman" w:hAnsi="Times New Roman" w:cs="Times New Roman"/>
-          <w:sz w:val="22"/>
-        </w:rPr>
-        <w:t xml:space="preserve">; </w:t>
-      </w:r>
-      <w:r>
-        <w:rPr>
-          <w:rFonts w:ascii="Times New Roman" w:hAnsi="Times New Roman" w:cs="Times New Roman"/>
-          <w:sz w:val="22"/>
-        </w:rPr>
-        <w:t>초음파</w:t>
-      </w:r>
-      <w:r>
-        <w:rPr>
-          <w:rFonts w:ascii="Times New Roman" w:hAnsi="Times New Roman" w:cs="Times New Roman"/>
-          <w:sz w:val="22"/>
-        </w:rPr>
-        <w:t xml:space="preserve">; </w:t>
-      </w:r>
-      <w:r>
-        <w:rPr>
-          <w:rFonts w:ascii="Times New Roman" w:hAnsi="Times New Roman" w:cs="Times New Roman"/>
-          <w:sz w:val="22"/>
-        </w:rPr>
-        <w:t>영상표지자</w:t>
-      </w:r>
-      <w:r>
-        <w:rPr>
-          <w:rFonts w:ascii="Times New Roman" w:hAnsi="Times New Roman" w:cs="Times New Roman"/>
-          <w:sz w:val="22"/>
-        </w:rPr>
-        <w:t xml:space="preserve">; cosine similarity; supervised contrastive learning; </w:t>
-      </w:r>
-      <w:r>
-        <w:rPr>
-          <w:rFonts w:ascii="Times New Roman" w:hAnsi="Times New Roman" w:cs="Times New Roman"/>
-          <w:sz w:val="22"/>
-        </w:rPr>
-        <w:t>이중</w:t>
-      </w:r>
-      <w:r>
-        <w:rPr>
-          <w:rFonts w:ascii="Times New Roman" w:hAnsi="Times New Roman" w:cs="Times New Roman"/>
-          <w:sz w:val="22"/>
-        </w:rPr>
-        <w:t xml:space="preserve"> </w:t>
+        <w:t xml:space="preserve">This study proposed novel continuous imaging biomarker candidates (HCC cosine score, Δscore) that correspond to similarity-based clinical reasoning on B-mode </w:t>
+      </w:r>
+      <w:proofErr w:type="gramStart"/>
+      <w:r>
+        <w:rPr>
+          <w:rFonts w:ascii="Times New Roman" w:hAnsi="Times New Roman" w:cs="Times New Roman"/>
+          <w:sz w:val="22"/>
+        </w:rPr>
+        <w:t>ultrasonography, and</w:t>
+      </w:r>
+      <w:proofErr w:type="gramEnd"/>
+      <w:r>
+        <w:rPr>
+          <w:rFonts w:ascii="Times New Roman" w:hAnsi="Times New Roman" w:cs="Times New Roman"/>
+          <w:sz w:val="22"/>
+        </w:rPr>
+        <w:t xml:space="preserve"> confirmed that </w:t>
       </w:r>
       <w:r>
         <w:rPr>
@@ -1851,49 +2191,7 @@
           <w:sz w:val="22"/>
         </w:rPr>
         <w:lastRenderedPageBreak/>
-        <w:t>출력</w:t>
-      </w:r>
-      <w:r>
-        <w:rPr>
-          <w:rFonts w:ascii="Times New Roman" w:hAnsi="Times New Roman" w:cs="Times New Roman"/>
-          <w:sz w:val="22"/>
-        </w:rPr>
-        <w:t xml:space="preserve">; </w:t>
-      </w:r>
-      <w:r>
-        <w:rPr>
-          <w:rFonts w:ascii="Times New Roman" w:hAnsi="Times New Roman" w:cs="Times New Roman"/>
-          <w:sz w:val="22"/>
-        </w:rPr>
-        <w:t>임상</w:t>
-      </w:r>
-      <w:r>
-        <w:rPr>
-          <w:rFonts w:ascii="Times New Roman" w:hAnsi="Times New Roman" w:cs="Times New Roman"/>
-          <w:sz w:val="22"/>
-        </w:rPr>
-        <w:t xml:space="preserve"> </w:t>
-      </w:r>
-      <w:r>
-        <w:rPr>
-          <w:rFonts w:ascii="Times New Roman" w:hAnsi="Times New Roman" w:cs="Times New Roman"/>
-          <w:sz w:val="22"/>
-        </w:rPr>
-        <w:t>의사결정</w:t>
-      </w:r>
-      <w:r>
-        <w:rPr>
-          <w:rFonts w:ascii="Times New Roman" w:hAnsi="Times New Roman" w:cs="Times New Roman"/>
-          <w:sz w:val="22"/>
-        </w:rPr>
-        <w:t xml:space="preserve"> </w:t>
-      </w:r>
-      <w:r>
-        <w:rPr>
-          <w:rFonts w:ascii="Times New Roman" w:hAnsi="Times New Roman" w:cs="Times New Roman"/>
-          <w:sz w:val="22"/>
-        </w:rPr>
-        <w:t>지원</w:t>
+        <w:t>SupCon training is essential for ensuring the clinical validity of cosine-based biomarkers.</w:t>
       </w:r>
     </w:p>
     <w:p>
@@ -1910,17 +2208,15 @@
         <w:spacing w:line="360" w:lineRule="auto"/>
         <w:rPr>
           <w:rFonts w:ascii="Times New Roman" w:hAnsi="Times New Roman" w:cs="Times New Roman"/>
-          <w:b/>
           <w:sz w:val="22"/>
         </w:rPr>
       </w:pPr>
       <w:r>
         <w:rPr>
           <w:rFonts w:ascii="Times New Roman" w:hAnsi="Times New Roman" w:cs="Times New Roman"/>
-          <w:b/>
-          <w:sz w:val="22"/>
-        </w:rPr>
-        <w:t>English Abstract</w:t>
+          <w:sz w:val="22"/>
+        </w:rPr>
+        <w:t>Keywords: hepatocellular carcinoma; ultrasonography; imaging biomarker; cosine similarity; supervised contrastive learning; dual output; clinical decision support</w:t>
       </w:r>
     </w:p>
     <w:p>
@@ -1937,142 +2233,16 @@
         <w:spacing w:line="360" w:lineRule="auto"/>
         <w:rPr>
           <w:rFonts w:ascii="Times New Roman" w:hAnsi="Times New Roman" w:cs="Times New Roman"/>
+          <w:b/>
           <w:sz w:val="22"/>
         </w:rPr>
       </w:pPr>
       <w:r>
         <w:rPr>
           <w:rFonts w:ascii="Times New Roman" w:hAnsi="Times New Roman" w:cs="Times New Roman"/>
-          <w:sz w:val="22"/>
-        </w:rPr>
-        <w:t>B-mode ultrasonography is a core tool for hepatocellular carcinoma (HCC) surveillance; however, its sensitivity remains limited. Existing deep learning models provide only a single softmax output, which does not correspond to the similarity-based reasoning performed by clinicians.</w:t>
-      </w:r>
-    </w:p>
-    <w:p>
-      <w:pPr>
-        <w:spacing w:line="360" w:lineRule="auto"/>
-        <w:rPr>
-          <w:rFonts w:ascii="Times New Roman" w:hAnsi="Times New Roman" w:cs="Times New Roman"/>
-          <w:sz w:val="22"/>
-        </w:rPr>
-      </w:pPr>
-    </w:p>
-    <w:p>
-      <w:pPr>
-        <w:spacing w:line="360" w:lineRule="auto"/>
-        <w:rPr>
-          <w:rFonts w:ascii="Times New Roman" w:hAnsi="Times New Roman" w:cs="Times New Roman"/>
-          <w:sz w:val="22"/>
-        </w:rPr>
-      </w:pPr>
-      <w:r>
-        <w:rPr>
-          <w:rFonts w:ascii="Times New Roman" w:hAnsi="Times New Roman" w:cs="Times New Roman"/>
-          <w:sz w:val="22"/>
-        </w:rPr>
-        <w:t>This was a retrospective study using the Clean subset (744 patients, 2,656 images) from the publicly available Samsung Medical Center–Liver Ultrasound Dataset (SMC-LUD). A hybrid vision transformer based on EfficientNetV2B0 was trained with a combination of cross-entropy and supervised contrastive learning (SupCon). A dual-output system was constructed in which the softmax output was defined as the confidence score, the cosine similarity between the embedding and the HCC prototype as the HCC cosine score, and the margin between the two class prototypes as the Δscore (IRB No. PMC 2026-07-001).</w:t>
-      </w:r>
-    </w:p>
-    <w:p>
-      <w:pPr>
-        <w:spacing w:line="360" w:lineRule="auto"/>
-        <w:rPr>
-          <w:rFonts w:ascii="Times New Roman" w:hAnsi="Times New Roman" w:cs="Times New Roman"/>
-          <w:sz w:val="22"/>
-        </w:rPr>
-      </w:pPr>
-    </w:p>
-    <w:p>
-      <w:pPr>
-        <w:spacing w:line="360" w:lineRule="auto"/>
-        <w:rPr>
-          <w:rFonts w:ascii="Times New Roman" w:hAnsi="Times New Roman" w:cs="Times New Roman"/>
-          <w:sz w:val="22"/>
-        </w:rPr>
-      </w:pPr>
-      <w:r>
-        <w:rPr>
-          <w:rFonts w:ascii="Times New Roman" w:hAnsi="Times New Roman" w:cs="Times New Roman"/>
-          <w:sz w:val="22"/>
-        </w:rPr>
-        <w:t>The AUROC of the confidence score of the primary model was 1.000 in both the validation and test sets, achieving a sensitivity of 100.0% and a specificity of 99.2% on the test set. The HCC cosine score and Δscore also demonstrated an AUROC of 1.000, equivalent to the confidence score (DeLong p = 1.000). With SupCon applied, the HCC cosine score in true HCC cases was significantly elevated (p &lt; 0.001). The two-stage training with NNCLR pre-training followed by fine-tuning was inferior in classification performance compared to CE+SupCon alone.</w:t>
-      </w:r>
-    </w:p>
-    <w:p>
-      <w:pPr>
-        <w:spacing w:line="360" w:lineRule="auto"/>
-        <w:rPr>
-          <w:rFonts w:ascii="Times New Roman" w:hAnsi="Times New Roman" w:cs="Times New Roman"/>
-          <w:sz w:val="22"/>
-        </w:rPr>
-      </w:pPr>
-    </w:p>
-    <w:p>
-      <w:pPr>
-        <w:spacing w:line="360" w:lineRule="auto"/>
-        <w:rPr>
-          <w:rFonts w:ascii="Times New Roman" w:hAnsi="Times New Roman" w:cs="Times New Roman"/>
-          <w:sz w:val="22"/>
-        </w:rPr>
-      </w:pPr>
-      <w:r>
-        <w:rPr>
-          <w:rFonts w:ascii="Times New Roman" w:hAnsi="Times New Roman" w:cs="Times New Roman"/>
-          <w:sz w:val="22"/>
-        </w:rPr>
-        <w:t>This study proposed novel continuous imaging biomarker candidates (HCC cosine score, Δscore) that correspond to similarity-based clinical reasoning on B-mode ultrasonography, and confirmed that SupCon training is essential for ensuring the clinical validity of cosine-based biomarkers.</w:t>
-      </w:r>
-    </w:p>
-    <w:p>
-      <w:pPr>
-        <w:spacing w:line="360" w:lineRule="auto"/>
-        <w:rPr>
-          <w:rFonts w:ascii="Times New Roman" w:hAnsi="Times New Roman" w:cs="Times New Roman"/>
-          <w:sz w:val="22"/>
-        </w:rPr>
-      </w:pPr>
-    </w:p>
-    <w:p>
-      <w:pPr>
-        <w:spacing w:line="360" w:lineRule="auto"/>
-        <w:rPr>
-          <w:rFonts w:ascii="Times New Roman" w:hAnsi="Times New Roman" w:cs="Times New Roman"/>
-          <w:sz w:val="22"/>
-        </w:rPr>
-      </w:pPr>
-      <w:r>
-        <w:rPr>
-          <w:rFonts w:ascii="Times New Roman" w:hAnsi="Times New Roman" w:cs="Times New Roman"/>
-          <w:sz w:val="22"/>
-        </w:rPr>
-        <w:t>Keywords: hepatocellular carcinoma; ultrasonography; imaging biomarker; cosine similarity; supervised contrastive learning; dual output; clinical decision support</w:t>
-      </w:r>
-    </w:p>
-    <w:p>
-      <w:pPr>
-        <w:spacing w:line="360" w:lineRule="auto"/>
-        <w:rPr>
-          <w:rFonts w:ascii="Times New Roman" w:hAnsi="Times New Roman" w:cs="Times New Roman"/>
-          <w:sz w:val="22"/>
-        </w:rPr>
-      </w:pPr>
-    </w:p>
-    <w:p>
-      <w:pPr>
-        <w:spacing w:line="360" w:lineRule="auto"/>
-        <w:rPr>
-          <w:rFonts w:ascii="Times New Roman" w:hAnsi="Times New Roman" w:cs="Times New Roman"/>
           <w:b/>
           <w:sz w:val="22"/>
         </w:rPr>
-      </w:pPr>
-      <w:r>
-        <w:rPr>
-          <w:rFonts w:ascii="Times New Roman" w:hAnsi="Times New Roman" w:cs="Times New Roman"/>
-          <w:b/>
-          <w:sz w:val="22"/>
-        </w:rPr>
-        <w:lastRenderedPageBreak/>
         <w:t xml:space="preserve">1. </w:t>
       </w:r>
       <w:r>
@@ -3883,7 +4053,15 @@
           <w:rFonts w:ascii="Times New Roman" w:hAnsi="Times New Roman" w:cs="Times New Roman"/>
           <w:sz w:val="22"/>
         </w:rPr>
-        <w:t>모두</w:t>
+        <w:t>모</w:t>
+      </w:r>
+      <w:r>
+        <w:rPr>
+          <w:rFonts w:ascii="Times New Roman" w:hAnsi="Times New Roman" w:cs="Times New Roman"/>
+          <w:sz w:val="22"/>
+        </w:rPr>
+        <w:lastRenderedPageBreak/>
+        <w:t>두</w:t>
       </w:r>
       <w:r>
         <w:rPr>
@@ -4443,15 +4621,7 @@
           <w:rFonts w:ascii="Times New Roman" w:hAnsi="Times New Roman" w:cs="Times New Roman"/>
           <w:sz w:val="22"/>
         </w:rPr>
-        <w:t>에</w:t>
-      </w:r>
-      <w:r>
-        <w:rPr>
-          <w:rFonts w:ascii="Times New Roman" w:hAnsi="Times New Roman" w:cs="Times New Roman"/>
-          <w:sz w:val="22"/>
-        </w:rPr>
-        <w:lastRenderedPageBreak/>
-        <w:t>코</w:t>
+        <w:t>에코</w:t>
       </w:r>
       <w:r>
         <w:rPr>
@@ -6727,7 +6897,15 @@
           <w:rFonts w:ascii="Times New Roman" w:hAnsi="Times New Roman" w:cs="Times New Roman"/>
           <w:sz w:val="22"/>
         </w:rPr>
-        <w:t>둘째</w:t>
+        <w:t>둘</w:t>
+      </w:r>
+      <w:r>
+        <w:rPr>
+          <w:rFonts w:ascii="Times New Roman" w:hAnsi="Times New Roman" w:cs="Times New Roman"/>
+          <w:sz w:val="22"/>
+        </w:rPr>
+        <w:lastRenderedPageBreak/>
+        <w:t>째</w:t>
       </w:r>
       <w:r>
         <w:rPr>
@@ -7422,15 +7600,7 @@
           <w:rFonts w:ascii="Times New Roman" w:hAnsi="Times New Roman" w:cs="Times New Roman"/>
           <w:sz w:val="22"/>
         </w:rPr>
-        <w:t>클</w:t>
-      </w:r>
-      <w:r>
-        <w:rPr>
-          <w:rFonts w:ascii="Times New Roman" w:hAnsi="Times New Roman" w:cs="Times New Roman"/>
-          <w:sz w:val="22"/>
-        </w:rPr>
-        <w:lastRenderedPageBreak/>
-        <w:t>래스</w:t>
+        <w:t>클래스</w:t>
       </w:r>
       <w:r>
         <w:rPr>
@@ -9794,15 +9964,7 @@
           <w:rFonts w:ascii="Times New Roman" w:hAnsi="Times New Roman" w:cs="Times New Roman"/>
           <w:sz w:val="22"/>
         </w:rPr>
-        <w:t>확</w:t>
-      </w:r>
-      <w:r>
-        <w:rPr>
-          <w:rFonts w:ascii="Times New Roman" w:hAnsi="Times New Roman" w:cs="Times New Roman"/>
-          <w:sz w:val="22"/>
-        </w:rPr>
-        <w:lastRenderedPageBreak/>
-        <w:t>인된</w:t>
+        <w:t>확인된</w:t>
       </w:r>
       <w:r>
         <w:rPr>
@@ -11448,6 +11610,7 @@
           <w:rFonts w:ascii="Times New Roman" w:hAnsi="Times New Roman" w:cs="Times New Roman"/>
           <w:sz w:val="22"/>
         </w:rPr>
+        <w:lastRenderedPageBreak/>
         <w:t>는</w:t>
       </w:r>
       <w:r>
@@ -12020,7 +12183,23 @@
           <w:rFonts w:ascii="Times New Roman" w:hAnsi="Times New Roman" w:cs="Times New Roman"/>
           <w:sz w:val="22"/>
         </w:rPr>
-        <w:t xml:space="preserve">(Table 2): backbone(EfficientNetV2B0 / ResNet50V2) × </w:t>
+        <w:t>(Table 2): backbone(EfficientNetV2B</w:t>
+      </w:r>
+      <w:proofErr w:type="gramStart"/>
+      <w:r>
+        <w:rPr>
+          <w:rFonts w:ascii="Times New Roman" w:hAnsi="Times New Roman" w:cs="Times New Roman"/>
+          <w:sz w:val="22"/>
+        </w:rPr>
+        <w:t>0 /</w:t>
+      </w:r>
+      <w:proofErr w:type="gramEnd"/>
+      <w:r>
+        <w:rPr>
+          <w:rFonts w:ascii="Times New Roman" w:hAnsi="Times New Roman" w:cs="Times New Roman"/>
+          <w:sz w:val="22"/>
+        </w:rPr>
+        <w:t xml:space="preserve"> ResNet50V2) × </w:t>
       </w:r>
       <w:r>
         <w:rPr>
@@ -12048,7 +12227,39 @@
           <w:rFonts w:ascii="Times New Roman" w:hAnsi="Times New Roman" w:cs="Times New Roman"/>
           <w:sz w:val="22"/>
         </w:rPr>
-        <w:t>(CE only / CE+SupCon / NNCLR 2</w:t>
+        <w:t xml:space="preserve">(CE </w:t>
+      </w:r>
+      <w:proofErr w:type="gramStart"/>
+      <w:r>
+        <w:rPr>
+          <w:rFonts w:ascii="Times New Roman" w:hAnsi="Times New Roman" w:cs="Times New Roman"/>
+          <w:sz w:val="22"/>
+        </w:rPr>
+        <w:t>only /</w:t>
+      </w:r>
+      <w:proofErr w:type="gramEnd"/>
+      <w:r>
+        <w:rPr>
+          <w:rFonts w:ascii="Times New Roman" w:hAnsi="Times New Roman" w:cs="Times New Roman"/>
+          <w:sz w:val="22"/>
+        </w:rPr>
+        <w:t xml:space="preserve"> CE+</w:t>
+      </w:r>
+      <w:proofErr w:type="gramStart"/>
+      <w:r>
+        <w:rPr>
+          <w:rFonts w:ascii="Times New Roman" w:hAnsi="Times New Roman" w:cs="Times New Roman"/>
+          <w:sz w:val="22"/>
+        </w:rPr>
+        <w:t>SupCon /</w:t>
+      </w:r>
+      <w:proofErr w:type="gramEnd"/>
+      <w:r>
+        <w:rPr>
+          <w:rFonts w:ascii="Times New Roman" w:hAnsi="Times New Roman" w:cs="Times New Roman"/>
+          <w:sz w:val="22"/>
+        </w:rPr>
+        <w:t xml:space="preserve"> NNCLR 2</w:t>
       </w:r>
       <w:r>
         <w:rPr>
@@ -13869,6 +14080,7 @@
           <w:rFonts w:ascii="Times New Roman" w:hAnsi="Times New Roman" w:cs="Times New Roman"/>
           <w:sz w:val="22"/>
         </w:rPr>
+        <w:lastRenderedPageBreak/>
         <w:t>정규화된</w:t>
       </w:r>
       <w:r>
@@ -16019,6 +16231,7 @@
           <w:sz w:val="22"/>
           <w:szCs w:val="22"/>
         </w:rPr>
+        <w:lastRenderedPageBreak/>
         <w:t>HCC Cosine Score. </w:t>
       </w:r>
       <w:r>
@@ -16337,7 +16550,6 @@
           <w:sz w:val="22"/>
           <w:szCs w:val="22"/>
         </w:rPr>
-        <w:lastRenderedPageBreak/>
         <w:t>본</w:t>
       </w:r>
       <w:r>
@@ -18560,7 +18772,6 @@
           <w:rFonts w:ascii="Times New Roman" w:hAnsi="Times New Roman" w:cs="Times New Roman"/>
           <w:sz w:val="22"/>
         </w:rPr>
-        <w:lastRenderedPageBreak/>
         <w:t>모델</w:t>
       </w:r>
       <w:r>
@@ -18750,7 +18961,23 @@
           <w:rFonts w:ascii="Times New Roman" w:hAnsi="Times New Roman" w:cs="Times New Roman"/>
           <w:sz w:val="22"/>
         </w:rPr>
-        <w:t>, p &gt; 0.05</w:t>
+        <w:t xml:space="preserve">, </w:t>
+      </w:r>
+      <w:proofErr w:type="gramStart"/>
+      <w:r>
+        <w:rPr>
+          <w:rFonts w:ascii="Times New Roman" w:hAnsi="Times New Roman" w:cs="Times New Roman"/>
+          <w:sz w:val="22"/>
+        </w:rPr>
+        <w:t>p &gt;</w:t>
+      </w:r>
+      <w:proofErr w:type="gramEnd"/>
+      <w:r>
+        <w:rPr>
+          <w:rFonts w:ascii="Times New Roman" w:hAnsi="Times New Roman" w:cs="Times New Roman"/>
+          <w:sz w:val="22"/>
+        </w:rPr>
+        <w:t xml:space="preserve"> 0.05</w:t>
       </w:r>
       <w:r>
         <w:rPr>
@@ -20150,6 +20377,7 @@
           <w:rFonts w:ascii="Times New Roman" w:hAnsi="Times New Roman" w:cs="Times New Roman"/>
           <w:sz w:val="22"/>
         </w:rPr>
+        <w:lastRenderedPageBreak/>
         <w:t>데이터셋</w:t>
       </w:r>
       <w:r>
@@ -20464,7 +20692,6 @@
           <w:b/>
           <w:sz w:val="22"/>
         </w:rPr>
-        <w:lastRenderedPageBreak/>
         <w:t xml:space="preserve">3.2 </w:t>
       </w:r>
       <w:r>
@@ -20562,7 +20789,23 @@
           <w:rFonts w:ascii="Times New Roman" w:hAnsi="Times New Roman" w:cs="Times New Roman"/>
           <w:sz w:val="22"/>
         </w:rPr>
-        <w:t>*Bold: primary model (#4). CE = Cross-Entropy; SupCon = Supervised Contrastive Learning; NNCLR = 2</w:t>
+        <w:t xml:space="preserve">*Bold: primary </w:t>
+      </w:r>
+      <w:proofErr w:type="gramStart"/>
+      <w:r>
+        <w:rPr>
+          <w:rFonts w:ascii="Times New Roman" w:hAnsi="Times New Roman" w:cs="Times New Roman"/>
+          <w:sz w:val="22"/>
+        </w:rPr>
+        <w:t>model (#</w:t>
+      </w:r>
+      <w:proofErr w:type="gramEnd"/>
+      <w:r>
+        <w:rPr>
+          <w:rFonts w:ascii="Times New Roman" w:hAnsi="Times New Roman" w:cs="Times New Roman"/>
+          <w:sz w:val="22"/>
+        </w:rPr>
+        <w:t>4). CE = Cross-Entropy; SupCon = Supervised Contrastive Learning; NNCLR = 2</w:t>
       </w:r>
       <w:r>
         <w:rPr>
@@ -20620,6 +20863,7 @@
         </w:rPr>
         <w:t xml:space="preserve"> ROC-A(Confidence Score) </w:t>
       </w:r>
+      <w:proofErr w:type="gramStart"/>
       <w:r>
         <w:rPr>
           <w:rFonts w:ascii="Times New Roman" w:hAnsi="Times New Roman" w:cs="Times New Roman"/>
@@ -20634,6 +20878,7 @@
         </w:rPr>
         <w:t>.*</w:t>
       </w:r>
+      <w:proofErr w:type="gramEnd"/>
     </w:p>
     <w:p>
       <w:pPr>
@@ -21690,6 +21935,7 @@
           <w:rFonts w:ascii="Times New Roman" w:hAnsi="Times New Roman" w:cs="Times New Roman"/>
           <w:sz w:val="22"/>
         </w:rPr>
+        <w:lastRenderedPageBreak/>
         <w:t>Figure 1</w:t>
       </w:r>
       <w:r>
@@ -22165,6 +22411,7 @@
         </w:rPr>
         <w:t xml:space="preserve"> </w:t>
       </w:r>
+      <w:proofErr w:type="gramStart"/>
       <w:r>
         <w:rPr>
           <w:rFonts w:ascii="Times New Roman" w:hAnsi="Times New Roman" w:cs="Times New Roman"/>
@@ -22179,6 +22426,7 @@
         </w:rPr>
         <w:t>.*</w:t>
       </w:r>
+      <w:proofErr w:type="gramEnd"/>
     </w:p>
     <w:p>
       <w:pPr>
@@ -22513,6 +22761,7 @@
         </w:rPr>
         <w:t xml:space="preserve"> 99.6%)</w:t>
       </w:r>
+      <w:proofErr w:type="gramStart"/>
       <w:r>
         <w:rPr>
           <w:rFonts w:ascii="Times New Roman" w:hAnsi="Times New Roman" w:cs="Times New Roman"/>
@@ -22527,6 +22776,7 @@
         </w:rPr>
         <w:t>.*</w:t>
       </w:r>
+      <w:proofErr w:type="gramEnd"/>
     </w:p>
     <w:p>
       <w:pPr>
@@ -23131,7 +23381,15 @@
           <w:rFonts w:ascii="Times New Roman" w:hAnsi="Times New Roman" w:cs="Times New Roman"/>
           <w:sz w:val="22"/>
         </w:rPr>
-        <w:t xml:space="preserve"> k-means prototype(k=</w:t>
+        <w:t xml:space="preserve"> k-means </w:t>
+      </w:r>
+      <w:r>
+        <w:rPr>
+          <w:rFonts w:ascii="Times New Roman" w:hAnsi="Times New Roman" w:cs="Times New Roman"/>
+          <w:sz w:val="22"/>
+        </w:rPr>
+        <w:lastRenderedPageBreak/>
+        <w:t>prototype(k=</w:t>
       </w:r>
       <w:r>
         <w:rPr>
@@ -23228,7 +23486,6 @@
           <w:rFonts w:ascii="Times New Roman" w:hAnsi="Times New Roman" w:cs="Times New Roman"/>
           <w:sz w:val="22"/>
         </w:rPr>
-        <w:lastRenderedPageBreak/>
         <w:t>주력</w:t>
       </w:r>
       <w:r>
@@ -23446,8 +23703,17 @@
           <w:rFonts w:ascii="Times New Roman" w:hAnsi="Times New Roman" w:cs="Times New Roman"/>
           <w:sz w:val="22"/>
         </w:rPr>
-        <w:t xml:space="preserve"> p=1.000).*</w:t>
-      </w:r>
+        <w:t xml:space="preserve"> p=1.000</w:t>
+      </w:r>
+      <w:proofErr w:type="gramStart"/>
+      <w:r>
+        <w:rPr>
+          <w:rFonts w:ascii="Times New Roman" w:hAnsi="Times New Roman" w:cs="Times New Roman"/>
+          <w:sz w:val="22"/>
+        </w:rPr>
+        <w:t>).*</w:t>
+      </w:r>
+      <w:proofErr w:type="gramEnd"/>
     </w:p>
     <w:p>
       <w:pPr>
@@ -23487,7 +23753,23 @@
           <w:rFonts w:ascii="Times New Roman" w:hAnsi="Times New Roman" w:cs="Times New Roman"/>
           <w:sz w:val="22"/>
         </w:rPr>
-        <w:t>*ns: not significant (p&gt;0.05). Val: n=530; Test: n=268. Cutoff (Youden's J, Val): ROC-A=0.0011, ROC-B(mean)=</w:t>
+        <w:t>*</w:t>
+      </w:r>
+      <w:proofErr w:type="gramStart"/>
+      <w:r>
+        <w:rPr>
+          <w:rFonts w:ascii="Times New Roman" w:hAnsi="Times New Roman" w:cs="Times New Roman"/>
+          <w:sz w:val="22"/>
+        </w:rPr>
+        <w:t>ns</w:t>
+      </w:r>
+      <w:proofErr w:type="gramEnd"/>
+      <w:r>
+        <w:rPr>
+          <w:rFonts w:ascii="Times New Roman" w:hAnsi="Times New Roman" w:cs="Times New Roman"/>
+          <w:sz w:val="22"/>
+        </w:rPr>
+        <w:t>: not significant (p&gt;0.05). Val: n=530; Test: n=268. Cutoff (Youden's J, Val): ROC-A=0.0011, ROC-B(mean)=</w:t>
       </w:r>
       <w:r>
         <w:rPr>
@@ -23515,8 +23797,17 @@
           <w:rFonts w:ascii="Times New Roman" w:hAnsi="Times New Roman" w:cs="Times New Roman"/>
           <w:sz w:val="22"/>
         </w:rPr>
-        <w:t>0.9585.*</w:t>
-      </w:r>
+        <w:t>0.</w:t>
+      </w:r>
+      <w:proofErr w:type="gramStart"/>
+      <w:r>
+        <w:rPr>
+          <w:rFonts w:ascii="Times New Roman" w:hAnsi="Times New Roman" w:cs="Times New Roman"/>
+          <w:sz w:val="22"/>
+        </w:rPr>
+        <w:t>9585.*</w:t>
+      </w:r>
+      <w:proofErr w:type="gramEnd"/>
     </w:p>
     <w:p>
       <w:pPr>
@@ -24446,6 +24737,7 @@
         </w:rPr>
         <w:t xml:space="preserve"> </w:t>
       </w:r>
+      <w:proofErr w:type="gramStart"/>
       <w:r>
         <w:rPr>
           <w:rFonts w:ascii="Times New Roman" w:hAnsi="Times New Roman" w:cs="Times New Roman"/>
@@ -24460,6 +24752,7 @@
         </w:rPr>
         <w:t>.*</w:t>
       </w:r>
+      <w:proofErr w:type="gramEnd"/>
     </w:p>
     <w:p>
       <w:pPr>
@@ -24571,7 +24864,6 @@
           <w:rFonts w:ascii="Times New Roman" w:hAnsi="Times New Roman" w:cs="Times New Roman"/>
           <w:sz w:val="22"/>
         </w:rPr>
-        <w:lastRenderedPageBreak/>
         <w:t xml:space="preserve">CE </w:t>
       </w:r>
       <w:r>
@@ -25227,7 +25519,23 @@
           <w:rFonts w:ascii="Times New Roman" w:hAnsi="Times New Roman" w:cs="Times New Roman"/>
           <w:sz w:val="22"/>
         </w:rPr>
-        <w:t xml:space="preserve"> p &lt; 0.001), </w:t>
+        <w:t xml:space="preserve"> p </w:t>
+      </w:r>
+      <w:proofErr w:type="gramStart"/>
+      <w:r>
+        <w:rPr>
+          <w:rFonts w:ascii="Times New Roman" w:hAnsi="Times New Roman" w:cs="Times New Roman"/>
+          <w:sz w:val="22"/>
+        </w:rPr>
+        <w:t>&lt; 0.001</w:t>
+      </w:r>
+      <w:proofErr w:type="gramEnd"/>
+      <w:r>
+        <w:rPr>
+          <w:rFonts w:ascii="Times New Roman" w:hAnsi="Times New Roman" w:cs="Times New Roman"/>
+          <w:sz w:val="22"/>
+        </w:rPr>
+        <w:t xml:space="preserve">), </w:t>
       </w:r>
       <w:r>
         <w:rPr>
@@ -26103,7 +26411,23 @@
           <w:rFonts w:ascii="Times New Roman" w:hAnsi="Times New Roman" w:cs="Times New Roman"/>
           <w:sz w:val="22"/>
         </w:rPr>
-        <w:t xml:space="preserve"> p &lt; 0.001),  SupCon </w:t>
+        <w:t xml:space="preserve"> p </w:t>
+      </w:r>
+      <w:proofErr w:type="gramStart"/>
+      <w:r>
+        <w:rPr>
+          <w:rFonts w:ascii="Times New Roman" w:hAnsi="Times New Roman" w:cs="Times New Roman"/>
+          <w:sz w:val="22"/>
+        </w:rPr>
+        <w:t>&lt; 0.001),  SupCon</w:t>
+      </w:r>
+      <w:proofErr w:type="gramEnd"/>
+      <w:r>
+        <w:rPr>
+          <w:rFonts w:ascii="Times New Roman" w:hAnsi="Times New Roman" w:cs="Times New Roman"/>
+          <w:sz w:val="22"/>
+        </w:rPr>
+        <w:t xml:space="preserve"> </w:t>
       </w:r>
       <w:r>
         <w:rPr>
@@ -26284,15 +26608,7 @@
           <w:rFonts w:ascii="Times New Roman" w:hAnsi="Times New Roman" w:cs="Times New Roman"/>
           <w:sz w:val="22"/>
         </w:rPr>
-        <w:t xml:space="preserve"> Δscore(HCC cosine − Hemangioma </w:t>
-      </w:r>
-      <w:r>
-        <w:rPr>
-          <w:rFonts w:ascii="Times New Roman" w:hAnsi="Times New Roman" w:cs="Times New Roman"/>
-          <w:sz w:val="22"/>
-        </w:rPr>
-        <w:lastRenderedPageBreak/>
-        <w:t>cosine)</w:t>
+        <w:t xml:space="preserve"> Δscore(HCC cosine − Hemangioma cosine)</w:t>
       </w:r>
       <w:r>
         <w:rPr>
@@ -28229,6 +28545,7 @@
           <w:b/>
           <w:sz w:val="22"/>
         </w:rPr>
+        <w:lastRenderedPageBreak/>
         <w:t xml:space="preserve">4. </w:t>
       </w:r>
       <w:r>
@@ -28276,7 +28593,6 @@
           <w:rFonts w:ascii="Times New Roman" w:hAnsi="Times New Roman" w:cs="Times New Roman"/>
           <w:sz w:val="22"/>
         </w:rPr>
-        <w:lastRenderedPageBreak/>
         <w:t xml:space="preserve"> 4.1 </w:t>
       </w:r>
       <w:r>
@@ -30620,6 +30936,7 @@
           <w:rFonts w:ascii="Times New Roman" w:hAnsi="Times New Roman" w:cs="Times New Roman"/>
           <w:sz w:val="22"/>
         </w:rPr>
+        <w:lastRenderedPageBreak/>
         <w:t>임상의가</w:t>
       </w:r>
       <w:r>
@@ -31054,15 +31371,7 @@
           <w:rFonts w:ascii="Times New Roman" w:hAnsi="Times New Roman" w:cs="Times New Roman"/>
           <w:sz w:val="22"/>
         </w:rPr>
-        <w:t>임</w:t>
-      </w:r>
-      <w:r>
-        <w:rPr>
-          <w:rFonts w:ascii="Times New Roman" w:hAnsi="Times New Roman" w:cs="Times New Roman"/>
-          <w:sz w:val="22"/>
-        </w:rPr>
-        <w:lastRenderedPageBreak/>
-        <w:t>상적인</w:t>
+        <w:t>임상적인</w:t>
       </w:r>
       <w:r>
         <w:rPr>
@@ -31955,7 +32264,23 @@
           <w:rFonts w:ascii="Times New Roman" w:hAnsi="Times New Roman" w:cs="Times New Roman"/>
           <w:sz w:val="22"/>
         </w:rPr>
-        <w:t xml:space="preserve">(p &lt; 0.001). </w:t>
+        <w:t xml:space="preserve">(p </w:t>
+      </w:r>
+      <w:proofErr w:type="gramStart"/>
+      <w:r>
+        <w:rPr>
+          <w:rFonts w:ascii="Times New Roman" w:hAnsi="Times New Roman" w:cs="Times New Roman"/>
+          <w:sz w:val="22"/>
+        </w:rPr>
+        <w:t>&lt; 0.001</w:t>
+      </w:r>
+      <w:proofErr w:type="gramEnd"/>
+      <w:r>
+        <w:rPr>
+          <w:rFonts w:ascii="Times New Roman" w:hAnsi="Times New Roman" w:cs="Times New Roman"/>
+          <w:sz w:val="22"/>
+        </w:rPr>
+        <w:t xml:space="preserve">). </w:t>
       </w:r>
     </w:p>
     <w:p>
@@ -33133,6 +33458,7 @@
           <w:rFonts w:ascii="Times New Roman" w:hAnsi="Times New Roman" w:cs="Times New Roman"/>
           <w:sz w:val="22"/>
         </w:rPr>
+        <w:lastRenderedPageBreak/>
         <w:t>본</w:t>
       </w:r>
       <w:r>
@@ -33581,7 +33907,6 @@
           <w:rFonts w:ascii="Times New Roman" w:hAnsi="Times New Roman" w:cs="Times New Roman"/>
           <w:sz w:val="22"/>
         </w:rPr>
-        <w:lastRenderedPageBreak/>
         <w:t>좋지</w:t>
       </w:r>
       <w:r>
@@ -35686,6 +36011,7 @@
           <w:rFonts w:ascii="Times New Roman" w:hAnsi="Times New Roman" w:cs="Times New Roman"/>
           <w:sz w:val="22"/>
         </w:rPr>
+        <w:lastRenderedPageBreak/>
         <w:t>구조적으로</w:t>
       </w:r>
       <w:r>
@@ -36134,15 +36460,7 @@
           <w:rFonts w:ascii="Times New Roman" w:hAnsi="Times New Roman" w:cs="Times New Roman"/>
           <w:sz w:val="22"/>
         </w:rPr>
-        <w:t>있음</w:t>
-      </w:r>
-      <w:r>
-        <w:rPr>
-          <w:rFonts w:ascii="Times New Roman" w:hAnsi="Times New Roman" w:cs="Times New Roman"/>
-          <w:sz w:val="22"/>
-        </w:rPr>
-        <w:lastRenderedPageBreak/>
-        <w:t>을</w:t>
+        <w:t>있음을</w:t>
       </w:r>
       <w:r>
         <w:rPr>
@@ -38202,7 +38520,15 @@
           <w:rFonts w:ascii="Times New Roman" w:hAnsi="Times New Roman" w:cs="Times New Roman"/>
           <w:sz w:val="22"/>
         </w:rPr>
-        <w:t>구조화를</w:t>
+        <w:t>구조</w:t>
+      </w:r>
+      <w:r>
+        <w:rPr>
+          <w:rFonts w:ascii="Times New Roman" w:hAnsi="Times New Roman" w:cs="Times New Roman"/>
+          <w:sz w:val="22"/>
+        </w:rPr>
+        <w:lastRenderedPageBreak/>
+        <w:t>화를</w:t>
       </w:r>
       <w:r>
         <w:rPr>
@@ -38422,7 +38748,6 @@
           <w:rFonts w:ascii="Times New Roman" w:hAnsi="Times New Roman" w:cs="Times New Roman"/>
           <w:sz w:val="22"/>
         </w:rPr>
-        <w:lastRenderedPageBreak/>
         <w:t xml:space="preserve">4.7 </w:t>
       </w:r>
       <w:r>
@@ -40385,7 +40710,15 @@
           <w:rFonts w:ascii="Times New Roman" w:hAnsi="Times New Roman" w:cs="Times New Roman"/>
           <w:sz w:val="22"/>
         </w:rPr>
-        <w:t xml:space="preserve">, cosine </w:t>
+        <w:t xml:space="preserve">, </w:t>
+      </w:r>
+      <w:r>
+        <w:rPr>
+          <w:rFonts w:ascii="Times New Roman" w:hAnsi="Times New Roman" w:cs="Times New Roman"/>
+          <w:sz w:val="22"/>
+        </w:rPr>
+        <w:lastRenderedPageBreak/>
+        <w:t xml:space="preserve">cosine </w:t>
       </w:r>
       <w:r>
         <w:rPr>
@@ -40700,15 +41033,7 @@
           <w:rFonts w:ascii="Times New Roman" w:hAnsi="Times New Roman" w:cs="Times New Roman"/>
           <w:sz w:val="22"/>
         </w:rPr>
-        <w:t>상</w:t>
-      </w:r>
-      <w:r>
-        <w:rPr>
-          <w:rFonts w:ascii="Times New Roman" w:hAnsi="Times New Roman" w:cs="Times New Roman"/>
-          <w:sz w:val="22"/>
-        </w:rPr>
-        <w:lastRenderedPageBreak/>
-        <w:t>승함을</w:t>
+        <w:t>상승함을</w:t>
       </w:r>
       <w:r>
         <w:rPr>
@@ -40743,7 +41068,23 @@
           <w:rFonts w:ascii="Times New Roman" w:hAnsi="Times New Roman" w:cs="Times New Roman"/>
           <w:sz w:val="22"/>
         </w:rPr>
-        <w:t xml:space="preserve"> p &lt; 0.001) </w:t>
+        <w:t xml:space="preserve"> p </w:t>
+      </w:r>
+      <w:proofErr w:type="gramStart"/>
+      <w:r>
+        <w:rPr>
+          <w:rFonts w:ascii="Times New Roman" w:hAnsi="Times New Roman" w:cs="Times New Roman"/>
+          <w:sz w:val="22"/>
+        </w:rPr>
+        <w:t>&lt; 0.001</w:t>
+      </w:r>
+      <w:proofErr w:type="gramEnd"/>
+      <w:r>
+        <w:rPr>
+          <w:rFonts w:ascii="Times New Roman" w:hAnsi="Times New Roman" w:cs="Times New Roman"/>
+          <w:sz w:val="22"/>
+        </w:rPr>
+        <w:t xml:space="preserve">) </w:t>
       </w:r>
       <w:r>
         <w:rPr>
@@ -41209,7 +41550,23 @@
           <w:rFonts w:ascii="Times New Roman" w:hAnsi="Times New Roman" w:cs="Times New Roman"/>
           <w:sz w:val="22"/>
         </w:rPr>
-        <w:t>1. Sung H, Ferlay J, Siegel RL, et al. Global Cancer Statistics 2020: GLOBOCAN Estimates of Incidence and Mortality Worldwide for 36 Cancers in 185 Countries. *CA Cancer J Clin.* 2021;71(3):209-249. https://doi.org/10.3322/caac.21660</w:t>
+        <w:t xml:space="preserve">1. Sung H, Ferlay J, Siegel RL, et al. Global Cancer Statistics 2020: GLOBOCAN Estimates of Incidence and Mortality Worldwide for 36 Cancers in 185 Countries. *CA Cancer J </w:t>
+      </w:r>
+      <w:proofErr w:type="gramStart"/>
+      <w:r>
+        <w:rPr>
+          <w:rFonts w:ascii="Times New Roman" w:hAnsi="Times New Roman" w:cs="Times New Roman"/>
+          <w:sz w:val="22"/>
+        </w:rPr>
+        <w:t>Clin.*</w:t>
+      </w:r>
+      <w:proofErr w:type="gramEnd"/>
+      <w:r>
+        <w:rPr>
+          <w:rFonts w:ascii="Times New Roman" w:hAnsi="Times New Roman" w:cs="Times New Roman"/>
+          <w:sz w:val="22"/>
+        </w:rPr>
+        <w:t xml:space="preserve"> 2021;71(3):209-249. https://doi.org/10.3322/caac.21660</w:t>
       </w:r>
     </w:p>
     <w:p>
@@ -41225,7 +41582,23 @@
           <w:rFonts w:ascii="Times New Roman" w:hAnsi="Times New Roman" w:cs="Times New Roman"/>
           <w:sz w:val="22"/>
         </w:rPr>
-        <w:t>2. European Association for the Study of the Liver. EASL Clinical Practice Guidelines: Management of hepatocellular carcinoma. *J Hepatol.* 2018;69(1):182-236. https://doi.org/10.1016/j.jhep.2018.03.019</w:t>
+        <w:t xml:space="preserve">2. European Association for the Study of the Liver. EASL Clinical Practice Guidelines: Management of hepatocellular carcinoma. *J </w:t>
+      </w:r>
+      <w:proofErr w:type="gramStart"/>
+      <w:r>
+        <w:rPr>
+          <w:rFonts w:ascii="Times New Roman" w:hAnsi="Times New Roman" w:cs="Times New Roman"/>
+          <w:sz w:val="22"/>
+        </w:rPr>
+        <w:t>Hepatol.*</w:t>
+      </w:r>
+      <w:proofErr w:type="gramEnd"/>
+      <w:r>
+        <w:rPr>
+          <w:rFonts w:ascii="Times New Roman" w:hAnsi="Times New Roman" w:cs="Times New Roman"/>
+          <w:sz w:val="22"/>
+        </w:rPr>
+        <w:t xml:space="preserve"> 2018;69(1):182-236. https://doi.org/10.1016/j.jhep.2018.03.019</w:t>
       </w:r>
     </w:p>
     <w:p>
@@ -41241,7 +41614,23 @@
           <w:rFonts w:ascii="Times New Roman" w:hAnsi="Times New Roman" w:cs="Times New Roman"/>
           <w:sz w:val="22"/>
         </w:rPr>
-        <w:t>3. Korean Liver Cancer Association (KLCA) and National Cancer Center (NCC) Korea. 2022 KLCA-NCC Korea practice guidelines for the management of hepatocellular carcinoma. *Clin Mol Hepatol.* 2022;28(4):583-705. https://doi.org/10.3350/cmh.2022.0294</w:t>
+        <w:t xml:space="preserve">3. Korean Liver Cancer Association (KLCA) and National Cancer Center (NCC) Korea. 2022 KLCA-NCC Korea practice guidelines for the management of hepatocellular carcinoma. *Clin Mol </w:t>
+      </w:r>
+      <w:proofErr w:type="gramStart"/>
+      <w:r>
+        <w:rPr>
+          <w:rFonts w:ascii="Times New Roman" w:hAnsi="Times New Roman" w:cs="Times New Roman"/>
+          <w:sz w:val="22"/>
+        </w:rPr>
+        <w:t>Hepatol.*</w:t>
+      </w:r>
+      <w:proofErr w:type="gramEnd"/>
+      <w:r>
+        <w:rPr>
+          <w:rFonts w:ascii="Times New Roman" w:hAnsi="Times New Roman" w:cs="Times New Roman"/>
+          <w:sz w:val="22"/>
+        </w:rPr>
+        <w:t xml:space="preserve"> 2022;28(4):583-705. https://doi.org/10.3350/cmh.2022.0294</w:t>
       </w:r>
     </w:p>
     <w:p>
@@ -41257,7 +41646,39 @@
           <w:rFonts w:ascii="Times New Roman" w:hAnsi="Times New Roman" w:cs="Times New Roman"/>
           <w:sz w:val="22"/>
         </w:rPr>
-        <w:t>4. Tzartzeva K, Obi J, Rich NE, et al. Surveillance Imaging and Alpha Fetoprotein for Early Detection of Hepatocellular Carcinoma in Patients With Cirrhosis: A Meta-analysis. *Gastroenterology.* 2018;154(6):1706-1718. https://doi.org/10.1053/j.gastro.2018.01.064</w:t>
+        <w:t xml:space="preserve">4. Tzartzeva K, Obi J, Rich NE, et al. Surveillance Imaging and Alpha Fetoprotein for Early Detection of Hepatocellular Carcinoma in Patients </w:t>
+      </w:r>
+      <w:proofErr w:type="gramStart"/>
+      <w:r>
+        <w:rPr>
+          <w:rFonts w:ascii="Times New Roman" w:hAnsi="Times New Roman" w:cs="Times New Roman"/>
+          <w:sz w:val="22"/>
+        </w:rPr>
+        <w:t>With</w:t>
+      </w:r>
+      <w:proofErr w:type="gramEnd"/>
+      <w:r>
+        <w:rPr>
+          <w:rFonts w:ascii="Times New Roman" w:hAnsi="Times New Roman" w:cs="Times New Roman"/>
+          <w:sz w:val="22"/>
+        </w:rPr>
+        <w:t xml:space="preserve"> Cirrhosis: A Meta-analysis. *</w:t>
+      </w:r>
+      <w:proofErr w:type="gramStart"/>
+      <w:r>
+        <w:rPr>
+          <w:rFonts w:ascii="Times New Roman" w:hAnsi="Times New Roman" w:cs="Times New Roman"/>
+          <w:sz w:val="22"/>
+        </w:rPr>
+        <w:t>Gastroenterology.*</w:t>
+      </w:r>
+      <w:proofErr w:type="gramEnd"/>
+      <w:r>
+        <w:rPr>
+          <w:rFonts w:ascii="Times New Roman" w:hAnsi="Times New Roman" w:cs="Times New Roman"/>
+          <w:sz w:val="22"/>
+        </w:rPr>
+        <w:t xml:space="preserve"> 2018;154(6):1706-1718. https://doi.org/10.1053/j.gastro.2018.01.064</w:t>
       </w:r>
     </w:p>
     <w:p>
@@ -41273,7 +41694,23 @@
           <w:rFonts w:ascii="Times New Roman" w:hAnsi="Times New Roman" w:cs="Times New Roman"/>
           <w:sz w:val="22"/>
         </w:rPr>
-        <w:t>5. Minami Y, Nishida N, Kudo M. Imaging Diagnosis of Various Hepatocellular Carcinoma Subtypes and Its Hypervascular Mimics: Differential Diagnosis Based on Conventional Interpretation and Artificial Intelligence. *Liver Cancer.* 2023;12(2):103-115. https://doi.org/10.1159/000528538</w:t>
+        <w:t xml:space="preserve">5. Minami Y, Nishida N, Kudo M. Imaging Diagnosis of Various Hepatocellular Carcinoma Subtypes and Its Hypervascular Mimics: Differential Diagnosis Based on Conventional Interpretation and Artificial Intelligence. *Liver </w:t>
+      </w:r>
+      <w:proofErr w:type="gramStart"/>
+      <w:r>
+        <w:rPr>
+          <w:rFonts w:ascii="Times New Roman" w:hAnsi="Times New Roman" w:cs="Times New Roman"/>
+          <w:sz w:val="22"/>
+        </w:rPr>
+        <w:t>Cancer.*</w:t>
+      </w:r>
+      <w:proofErr w:type="gramEnd"/>
+      <w:r>
+        <w:rPr>
+          <w:rFonts w:ascii="Times New Roman" w:hAnsi="Times New Roman" w:cs="Times New Roman"/>
+          <w:sz w:val="22"/>
+        </w:rPr>
+        <w:t xml:space="preserve"> 2023;12(2):103-115. https://doi.org/10.1159/000528538</w:t>
       </w:r>
     </w:p>
     <w:p>
@@ -41289,7 +41726,39 @@
           <w:rFonts w:ascii="Times New Roman" w:hAnsi="Times New Roman" w:cs="Times New Roman"/>
           <w:sz w:val="22"/>
         </w:rPr>
-        <w:t>6. Chou CT, Chen YL, Wu HK, Chen RC. Atypical hemangioma mimicking mixed hepatocellular cholangiocarcinoma. *Medicine (Baltimore).* 2017;96(50):e9192. https://doi.org/10.1097/MD.0000000000009192</w:t>
+        <w:t>6. Chou CT, Chen YL, Wu HK, Chen RC. Atypical hemangioma mimicking mixed hepatocellular cholangiocarcinoma. *Medicine (Baltimore</w:t>
+      </w:r>
+      <w:proofErr w:type="gramStart"/>
+      <w:r>
+        <w:rPr>
+          <w:rFonts w:ascii="Times New Roman" w:hAnsi="Times New Roman" w:cs="Times New Roman"/>
+          <w:sz w:val="22"/>
+        </w:rPr>
+        <w:t>).*</w:t>
+      </w:r>
+      <w:proofErr w:type="gramEnd"/>
+      <w:r>
+        <w:rPr>
+          <w:rFonts w:ascii="Times New Roman" w:hAnsi="Times New Roman" w:cs="Times New Roman"/>
+          <w:sz w:val="22"/>
+        </w:rPr>
+        <w:t xml:space="preserve"> 2017;96(50</w:t>
+      </w:r>
+      <w:proofErr w:type="gramStart"/>
+      <w:r>
+        <w:rPr>
+          <w:rFonts w:ascii="Times New Roman" w:hAnsi="Times New Roman" w:cs="Times New Roman"/>
+          <w:sz w:val="22"/>
+        </w:rPr>
+        <w:t>):e</w:t>
+      </w:r>
+      <w:proofErr w:type="gramEnd"/>
+      <w:r>
+        <w:rPr>
+          <w:rFonts w:ascii="Times New Roman" w:hAnsi="Times New Roman" w:cs="Times New Roman"/>
+          <w:sz w:val="22"/>
+        </w:rPr>
+        <w:t>9192. https://doi.org/10.1097/MD.0000000000009192</w:t>
       </w:r>
     </w:p>
     <w:p>
@@ -41305,7 +41774,24 @@
           <w:rFonts w:ascii="Times New Roman" w:hAnsi="Times New Roman" w:cs="Times New Roman"/>
           <w:sz w:val="22"/>
         </w:rPr>
-        <w:t>7. Sirli R, Sporea I, Săndulescu DL, et al. Contrast enhanced ultrasound for the diagnosis of liver hemangiomas – results of a Romanian multicentre study. *Med Ultrason.* 2015;17(4):444-450. https://doi.org/10.11152/mu.2013.2066.174.csu</w:t>
+        <w:lastRenderedPageBreak/>
+        <w:t xml:space="preserve">7. Sirli R, Sporea I, Săndulescu DL, et al. Contrast enhanced ultrasound for the diagnosis of liver hemangiomas – results of a Romanian multicentre study. *Med </w:t>
+      </w:r>
+      <w:proofErr w:type="gramStart"/>
+      <w:r>
+        <w:rPr>
+          <w:rFonts w:ascii="Times New Roman" w:hAnsi="Times New Roman" w:cs="Times New Roman"/>
+          <w:sz w:val="22"/>
+        </w:rPr>
+        <w:t>Ultrason.*</w:t>
+      </w:r>
+      <w:proofErr w:type="gramEnd"/>
+      <w:r>
+        <w:rPr>
+          <w:rFonts w:ascii="Times New Roman" w:hAnsi="Times New Roman" w:cs="Times New Roman"/>
+          <w:sz w:val="22"/>
+        </w:rPr>
+        <w:t xml:space="preserve"> 2015;17(4):444-450. https://doi.org/10.11152/mu.2013.2066.174.csu</w:t>
       </w:r>
     </w:p>
     <w:p>
@@ -41321,15 +41807,7 @@
           <w:rFonts w:ascii="Times New Roman" w:hAnsi="Times New Roman" w:cs="Times New Roman"/>
           <w:sz w:val="22"/>
         </w:rPr>
-        <w:t xml:space="preserve">8. American College of Radiology. CT/MRI LI-RADS v2018: Diagnostic Categories and Technical </w:t>
-      </w:r>
-      <w:r>
-        <w:rPr>
-          <w:rFonts w:ascii="Times New Roman" w:hAnsi="Times New Roman" w:cs="Times New Roman"/>
-          <w:sz w:val="22"/>
-        </w:rPr>
-        <w:lastRenderedPageBreak/>
-        <w:t>Requirements. ACR; 2018. Available from: https://www.acr.org/Clinical-Resources/Reporting-and-Data-Systems/LI-RADS</w:t>
+        <w:t>8. American College of Radiology. CT/MRI LI-RADS v2018: Diagnostic Categories and Technical Requirements. ACR; 2018. Available from: https://www.acr.org/Clinical-Resources/Reporting-and-Data-Systems/LI-RADS</w:t>
       </w:r>
     </w:p>
     <w:p>
@@ -41345,7 +41823,23 @@
           <w:rFonts w:ascii="Times New Roman" w:hAnsi="Times New Roman" w:cs="Times New Roman"/>
           <w:sz w:val="22"/>
         </w:rPr>
-        <w:t>9. Yang Q, Wei J, Hao X, et al. Improving B-mode ultrasound diagnostic performance for focal liver lesions using deep learning: A multicentre study. *EBioMedicine.* 2020;56:102777. https://doi.org/10.1016/j.ebiom.2020.102777</w:t>
+        <w:t>9. Yang Q, Wei J, Hao X, et al. Improving B-mode ultrasound diagnostic performance for focal liver lesions using deep learning: A multicentre study. *</w:t>
+      </w:r>
+      <w:proofErr w:type="gramStart"/>
+      <w:r>
+        <w:rPr>
+          <w:rFonts w:ascii="Times New Roman" w:hAnsi="Times New Roman" w:cs="Times New Roman"/>
+          <w:sz w:val="22"/>
+        </w:rPr>
+        <w:t>EBioMedicine.*</w:t>
+      </w:r>
+      <w:proofErr w:type="gramEnd"/>
+      <w:r>
+        <w:rPr>
+          <w:rFonts w:ascii="Times New Roman" w:hAnsi="Times New Roman" w:cs="Times New Roman"/>
+          <w:sz w:val="22"/>
+        </w:rPr>
+        <w:t xml:space="preserve"> 2020;56:102777. https://doi.org/10.1016/j.ebiom.2020.102777</w:t>
       </w:r>
     </w:p>
     <w:p>
@@ -41361,7 +41855,39 @@
           <w:rFonts w:ascii="Times New Roman" w:hAnsi="Times New Roman" w:cs="Times New Roman"/>
           <w:sz w:val="22"/>
         </w:rPr>
-        <w:t>10. Han X, Gong B, Guo L, et al. B-mode ultrasound based CAD for liver cancers via multi-view privileged information learning. *Neural Netw.* 2023;164:369-381. https://doi.org/10.1016/j.neunet.2023.03.028</w:t>
+        <w:t xml:space="preserve">10. Han X, Gong B, Guo L, et al. B-mode </w:t>
+      </w:r>
+      <w:proofErr w:type="gramStart"/>
+      <w:r>
+        <w:rPr>
+          <w:rFonts w:ascii="Times New Roman" w:hAnsi="Times New Roman" w:cs="Times New Roman"/>
+          <w:sz w:val="22"/>
+        </w:rPr>
+        <w:t>ultrasound based</w:t>
+      </w:r>
+      <w:proofErr w:type="gramEnd"/>
+      <w:r>
+        <w:rPr>
+          <w:rFonts w:ascii="Times New Roman" w:hAnsi="Times New Roman" w:cs="Times New Roman"/>
+          <w:sz w:val="22"/>
+        </w:rPr>
+        <w:t xml:space="preserve"> CAD for liver cancers via multi-view privileged information learning. *Neural </w:t>
+      </w:r>
+      <w:proofErr w:type="gramStart"/>
+      <w:r>
+        <w:rPr>
+          <w:rFonts w:ascii="Times New Roman" w:hAnsi="Times New Roman" w:cs="Times New Roman"/>
+          <w:sz w:val="22"/>
+        </w:rPr>
+        <w:t>Netw.*</w:t>
+      </w:r>
+      <w:proofErr w:type="gramEnd"/>
+      <w:r>
+        <w:rPr>
+          <w:rFonts w:ascii="Times New Roman" w:hAnsi="Times New Roman" w:cs="Times New Roman"/>
+          <w:sz w:val="22"/>
+        </w:rPr>
+        <w:t xml:space="preserve"> 2023;164:369-381. https://doi.org/10.1016/j.neunet.2023.03.028</w:t>
       </w:r>
     </w:p>
     <w:p>
@@ -41393,7 +41919,23 @@
           <w:rFonts w:ascii="Times New Roman" w:hAnsi="Times New Roman" w:cs="Times New Roman"/>
           <w:sz w:val="22"/>
         </w:rPr>
-        <w:t>12. Tak J, Ko RE, Kwon RD, et al. SMC-LUD: Large-Scale B-Mode Liver Ultrasound Dataset for Hepatocellular Carcinoma and Hemangioma Classification. *Sci Data.* 2026;13:649. https://doi.org/10.1038/s41597-026-07023-7</w:t>
+        <w:t xml:space="preserve">12. Tak J, Ko RE, Kwon RD, et al. SMC-LUD: Large-Scale B-Mode Liver Ultrasound Dataset for Hepatocellular Carcinoma and Hemangioma Classification. *Sci </w:t>
+      </w:r>
+      <w:proofErr w:type="gramStart"/>
+      <w:r>
+        <w:rPr>
+          <w:rFonts w:ascii="Times New Roman" w:hAnsi="Times New Roman" w:cs="Times New Roman"/>
+          <w:sz w:val="22"/>
+        </w:rPr>
+        <w:t>Data.*</w:t>
+      </w:r>
+      <w:proofErr w:type="gramEnd"/>
+      <w:r>
+        <w:rPr>
+          <w:rFonts w:ascii="Times New Roman" w:hAnsi="Times New Roman" w:cs="Times New Roman"/>
+          <w:sz w:val="22"/>
+        </w:rPr>
+        <w:t xml:space="preserve"> 2026;13:649. https://doi.org/10.1038/s41597-026-07023-7</w:t>
       </w:r>
     </w:p>
     <w:p>
@@ -41473,7 +42015,23 @@
           <w:rFonts w:ascii="Times New Roman" w:hAnsi="Times New Roman" w:cs="Times New Roman"/>
           <w:sz w:val="22"/>
         </w:rPr>
-        <w:t>17. Geirhos R, Jacobsen JH, Michaelis C, et al. Shortcut Learning in Deep Neural Networks. *Nat Mach Intell.* 2020;2(11):665-673. https://doi.org/10.1038/s42256-020-00257-z</w:t>
+        <w:t xml:space="preserve">17. Geirhos R, Jacobsen JH, Michaelis C, et al. Shortcut Learning in Deep Neural Networks. *Nat Mach </w:t>
+      </w:r>
+      <w:proofErr w:type="gramStart"/>
+      <w:r>
+        <w:rPr>
+          <w:rFonts w:ascii="Times New Roman" w:hAnsi="Times New Roman" w:cs="Times New Roman"/>
+          <w:sz w:val="22"/>
+        </w:rPr>
+        <w:t>Intell.*</w:t>
+      </w:r>
+      <w:proofErr w:type="gramEnd"/>
+      <w:r>
+        <w:rPr>
+          <w:rFonts w:ascii="Times New Roman" w:hAnsi="Times New Roman" w:cs="Times New Roman"/>
+          <w:sz w:val="22"/>
+        </w:rPr>
+        <w:t xml:space="preserve"> 2020;2(11):665-673. https://doi.org/10.1038/s42256-020-00257-z</w:t>
       </w:r>
     </w:p>
     <w:p>
@@ -41489,7 +42047,24 @@
           <w:rFonts w:ascii="Times New Roman" w:hAnsi="Times New Roman" w:cs="Times New Roman"/>
           <w:sz w:val="22"/>
         </w:rPr>
-        <w:t>18. DeLong ER, DeLong DM, Clarke-Pearson DL. Comparing the Areas under Two or More Correlated Receiver Operating Characteristic Curves: A Nonparametric Approach. *Biometrics.* 1988;44(3):837-845. https://doi.org/10.2307/2531595</w:t>
+        <w:lastRenderedPageBreak/>
+        <w:t>18. DeLong ER, DeLong DM, Clarke-Pearson DL. Comparing the Areas under Two or More Correlated Receiver Operating Characteristic Curves: A Nonparametric Approach. *</w:t>
+      </w:r>
+      <w:proofErr w:type="gramStart"/>
+      <w:r>
+        <w:rPr>
+          <w:rFonts w:ascii="Times New Roman" w:hAnsi="Times New Roman" w:cs="Times New Roman"/>
+          <w:sz w:val="22"/>
+        </w:rPr>
+        <w:t>Biometrics.*</w:t>
+      </w:r>
+      <w:proofErr w:type="gramEnd"/>
+      <w:r>
+        <w:rPr>
+          <w:rFonts w:ascii="Times New Roman" w:hAnsi="Times New Roman" w:cs="Times New Roman"/>
+          <w:sz w:val="22"/>
+        </w:rPr>
+        <w:t xml:space="preserve"> 1988;44(3):837-845. https://doi.org/10.2307/2531595</w:t>
       </w:r>
     </w:p>
     <w:p>
@@ -41505,15 +42080,23 @@
           <w:rFonts w:ascii="Times New Roman" w:hAnsi="Times New Roman" w:cs="Times New Roman"/>
           <w:sz w:val="22"/>
         </w:rPr>
-        <w:t xml:space="preserve">19. Du Z, Fan F, Ma J, et al. Development and validation of an ultrasound-based interpretable machine </w:t>
-      </w:r>
-      <w:r>
-        <w:rPr>
-          <w:rFonts w:ascii="Times New Roman" w:hAnsi="Times New Roman" w:cs="Times New Roman"/>
-          <w:sz w:val="22"/>
-        </w:rPr>
-        <w:lastRenderedPageBreak/>
-        <w:t>learning model for the classification of ≤3 cm hepatocellular carcinoma: a multicentre retrospective diagnostic study. *eClinicalMedicine.* 2025;81:103098. https://doi.org/10.1016/j.eclinm.2025.103098</w:t>
+        <w:t>19. Du Z, Fan F, Ma J, et al. Development and validation of an ultrasound-based interpretable machine learning model for the classification of ≤3 cm hepatocellular carcinoma: a multicentre retrospective diagnostic study. *</w:t>
+      </w:r>
+      <w:proofErr w:type="gramStart"/>
+      <w:r>
+        <w:rPr>
+          <w:rFonts w:ascii="Times New Roman" w:hAnsi="Times New Roman" w:cs="Times New Roman"/>
+          <w:sz w:val="22"/>
+        </w:rPr>
+        <w:t>eClinicalMedicine.*</w:t>
+      </w:r>
+      <w:proofErr w:type="gramEnd"/>
+      <w:r>
+        <w:rPr>
+          <w:rFonts w:ascii="Times New Roman" w:hAnsi="Times New Roman" w:cs="Times New Roman"/>
+          <w:sz w:val="22"/>
+        </w:rPr>
+        <w:t xml:space="preserve"> 2025;81:103098. https://doi.org/10.1016/j.eclinm.2025.103098</w:t>
       </w:r>
     </w:p>
     <w:p>
@@ -41529,7 +42112,23 @@
           <w:rFonts w:ascii="Times New Roman" w:hAnsi="Times New Roman" w:cs="Times New Roman"/>
           <w:sz w:val="22"/>
         </w:rPr>
-        <w:t>20. Liu S, Wang Y, Yang X, et al. Deep Learning in Medical Ultrasound Analysis: A Review. *Engineering.* 2019;5(2):261-275. https://doi.org/10.1016/j.eng.2018.11.020</w:t>
+        <w:t>20. Liu S, Wang Y, Yang X, et al. Deep Learning in Medical Ultrasound Analysis: A Review. *</w:t>
+      </w:r>
+      <w:proofErr w:type="gramStart"/>
+      <w:r>
+        <w:rPr>
+          <w:rFonts w:ascii="Times New Roman" w:hAnsi="Times New Roman" w:cs="Times New Roman"/>
+          <w:sz w:val="22"/>
+        </w:rPr>
+        <w:t>Engineering.*</w:t>
+      </w:r>
+      <w:proofErr w:type="gramEnd"/>
+      <w:r>
+        <w:rPr>
+          <w:rFonts w:ascii="Times New Roman" w:hAnsi="Times New Roman" w:cs="Times New Roman"/>
+          <w:sz w:val="22"/>
+        </w:rPr>
+        <w:t xml:space="preserve"> 2019;5(2):261-275. https://doi.org/10.1016/j.eng.2018.11.020</w:t>
       </w:r>
     </w:p>
     <w:p>
@@ -41577,7 +42176,23 @@
           <w:rFonts w:ascii="Times New Roman" w:hAnsi="Times New Roman" w:cs="Times New Roman"/>
           <w:sz w:val="22"/>
         </w:rPr>
-        <w:t>23. Vickers AJ, Elkin EB. Decision Curve Analysis: A Novel Method for Evaluating Prediction Models. *Med Decis Making.* 2006;26(6):565-574. https://doi.org/10.1177/0272989X06295361</w:t>
+        <w:t xml:space="preserve">23. Vickers AJ, Elkin EB. Decision Curve Analysis: A Novel Method for Evaluating Prediction Models. *Med Decis </w:t>
+      </w:r>
+      <w:proofErr w:type="gramStart"/>
+      <w:r>
+        <w:rPr>
+          <w:rFonts w:ascii="Times New Roman" w:hAnsi="Times New Roman" w:cs="Times New Roman"/>
+          <w:sz w:val="22"/>
+        </w:rPr>
+        <w:t>Making.*</w:t>
+      </w:r>
+      <w:proofErr w:type="gramEnd"/>
+      <w:r>
+        <w:rPr>
+          <w:rFonts w:ascii="Times New Roman" w:hAnsi="Times New Roman" w:cs="Times New Roman"/>
+          <w:sz w:val="22"/>
+        </w:rPr>
+        <w:t xml:space="preserve"> 2006;26(6):565-574. https://doi.org/10.1177/0272989X06295361</w:t>
       </w:r>
     </w:p>
     <w:sectPr>
@@ -41756,8 +42371,123 @@
       </w:rPr>
     </w:lvl>
   </w:abstractNum>
+  <w:abstractNum w:abstractNumId="1" w15:restartNumberingAfterBreak="0">
+    <w:nsid w:val="4CD54819"/>
+    <w:multiLevelType w:val="hybridMultilevel"/>
+    <w:tmpl w:val="542A5250"/>
+    <w:lvl w:ilvl="0" w:tplc="CAEA083C">
+      <w:numFmt w:val="bullet"/>
+      <w:lvlText w:val="-"/>
+      <w:lvlJc w:val="left"/>
+      <w:pPr>
+        <w:ind w:left="800" w:hanging="360"/>
+      </w:pPr>
+      <w:rPr>
+        <w:rFonts w:ascii="Times New Roman" w:eastAsiaTheme="minorEastAsia" w:hAnsi="Times New Roman" w:cs="Times New Roman" w:hint="default"/>
+      </w:rPr>
+    </w:lvl>
+    <w:lvl w:ilvl="1" w:tplc="04090003" w:tentative="1">
+      <w:start w:val="1"/>
+      <w:numFmt w:val="bullet"/>
+      <w:lvlText w:val=""/>
+      <w:lvlJc w:val="left"/>
+      <w:pPr>
+        <w:ind w:left="1320" w:hanging="440"/>
+      </w:pPr>
+      <w:rPr>
+        <w:rFonts w:ascii="Wingdings" w:hAnsi="Wingdings" w:hint="default"/>
+      </w:rPr>
+    </w:lvl>
+    <w:lvl w:ilvl="2" w:tplc="04090005" w:tentative="1">
+      <w:start w:val="1"/>
+      <w:numFmt w:val="bullet"/>
+      <w:lvlText w:val=""/>
+      <w:lvlJc w:val="left"/>
+      <w:pPr>
+        <w:ind w:left="1760" w:hanging="440"/>
+      </w:pPr>
+      <w:rPr>
+        <w:rFonts w:ascii="Wingdings" w:hAnsi="Wingdings" w:hint="default"/>
+      </w:rPr>
+    </w:lvl>
+    <w:lvl w:ilvl="3" w:tplc="04090001" w:tentative="1">
+      <w:start w:val="1"/>
+      <w:numFmt w:val="bullet"/>
+      <w:lvlText w:val=""/>
+      <w:lvlJc w:val="left"/>
+      <w:pPr>
+        <w:ind w:left="2200" w:hanging="440"/>
+      </w:pPr>
+      <w:rPr>
+        <w:rFonts w:ascii="Wingdings" w:hAnsi="Wingdings" w:hint="default"/>
+      </w:rPr>
+    </w:lvl>
+    <w:lvl w:ilvl="4" w:tplc="04090003" w:tentative="1">
+      <w:start w:val="1"/>
+      <w:numFmt w:val="bullet"/>
+      <w:lvlText w:val=""/>
+      <w:lvlJc w:val="left"/>
+      <w:pPr>
+        <w:ind w:left="2640" w:hanging="440"/>
+      </w:pPr>
+      <w:rPr>
+        <w:rFonts w:ascii="Wingdings" w:hAnsi="Wingdings" w:hint="default"/>
+      </w:rPr>
+    </w:lvl>
+    <w:lvl w:ilvl="5" w:tplc="04090005" w:tentative="1">
+      <w:start w:val="1"/>
+      <w:numFmt w:val="bullet"/>
+      <w:lvlText w:val=""/>
+      <w:lvlJc w:val="left"/>
+      <w:pPr>
+        <w:ind w:left="3080" w:hanging="440"/>
+      </w:pPr>
+      <w:rPr>
+        <w:rFonts w:ascii="Wingdings" w:hAnsi="Wingdings" w:hint="default"/>
+      </w:rPr>
+    </w:lvl>
+    <w:lvl w:ilvl="6" w:tplc="04090001" w:tentative="1">
+      <w:start w:val="1"/>
+      <w:numFmt w:val="bullet"/>
+      <w:lvlText w:val=""/>
+      <w:lvlJc w:val="left"/>
+      <w:pPr>
+        <w:ind w:left="3520" w:hanging="440"/>
+      </w:pPr>
+      <w:rPr>
+        <w:rFonts w:ascii="Wingdings" w:hAnsi="Wingdings" w:hint="default"/>
+      </w:rPr>
+    </w:lvl>
+    <w:lvl w:ilvl="7" w:tplc="04090003" w:tentative="1">
+      <w:start w:val="1"/>
+      <w:numFmt w:val="bullet"/>
+      <w:lvlText w:val=""/>
+      <w:lvlJc w:val="left"/>
+      <w:pPr>
+        <w:ind w:left="3960" w:hanging="440"/>
+      </w:pPr>
+      <w:rPr>
+        <w:rFonts w:ascii="Wingdings" w:hAnsi="Wingdings" w:hint="default"/>
+      </w:rPr>
+    </w:lvl>
+    <w:lvl w:ilvl="8" w:tplc="04090005" w:tentative="1">
+      <w:start w:val="1"/>
+      <w:numFmt w:val="bullet"/>
+      <w:lvlText w:val=""/>
+      <w:lvlJc w:val="left"/>
+      <w:pPr>
+        <w:ind w:left="4400" w:hanging="440"/>
+      </w:pPr>
+      <w:rPr>
+        <w:rFonts w:ascii="Wingdings" w:hAnsi="Wingdings" w:hint="default"/>
+      </w:rPr>
+    </w:lvl>
+  </w:abstractNum>
   <w:num w:numId="1" w16cid:durableId="510145650">
     <w:abstractNumId w:val="0"/>
+  </w:num>
+  <w:num w:numId="2" w16cid:durableId="178396147">
+    <w:abstractNumId w:val="1"/>
   </w:num>
 </w:numbering>
 </file>

</xml_diff>